<commit_message>
Add Google Cloud learning paths
</commit_message>
<xml_diff>
--- a/assets/resume/Hariharan_J_Resume.docx
+++ b/assets/resume/Hariharan_J_Resume.docx
@@ -579,6 +579,34 @@
           <w:color w:val="111111"/>
           <w:sz w:val="16"/>
         </w:rPr>
+        <w:t>Google Cloud Digital Leader Learning Path - Completed</w:t>
+      </w:r>
+    </w:p>
+    <w:p>
+      <w:pPr>
+        <w:spacing w:before="0" w:after="9" w:line="240" w:lineRule="auto"/>
+      </w:pPr>
+      <w:r>
+        <w:rPr>
+          <w:rFonts w:ascii="Arial" w:hAnsi="Arial"/>
+          <w:b w:val="0"/>
+          <w:color w:val="111111"/>
+          <w:sz w:val="16"/>
+        </w:rPr>
+        <w:t>Google Professional Cloud Architect Learning Path - Completed</w:t>
+      </w:r>
+    </w:p>
+    <w:p>
+      <w:pPr>
+        <w:spacing w:before="0" w:after="9" w:line="240" w:lineRule="auto"/>
+      </w:pPr>
+      <w:r>
+        <w:rPr>
+          <w:rFonts w:ascii="Arial" w:hAnsi="Arial"/>
+          <w:b w:val="0"/>
+          <w:color w:val="111111"/>
+          <w:sz w:val="16"/>
+        </w:rPr>
         <w:t>EC-Council Network Defense Essentials</w:t>
       </w:r>
     </w:p>

</xml_diff>

<commit_message>
Update portfolio project case studies
</commit_message>
<xml_diff>
--- a/assets/resume/Hariharan_J_Resume.docx
+++ b/assets/resume/Hariharan_J_Resume.docx
@@ -4,14 +4,14 @@
   <w:body>
     <w:p>
       <w:pPr>
-        <w:spacing w:before="0" w:after="10" w:line="240" w:lineRule="auto"/>
+        <w:spacing w:before="0" w:after="7" w:line="240" w:lineRule="auto"/>
         <w:jc w:val="center"/>
       </w:pPr>
       <w:r>
         <w:rPr>
           <w:rFonts w:ascii="Arial" w:hAnsi="Arial"/>
           <w:b/>
-          <w:color w:val="1F4E79"/>
+          <w:color w:val="1A73E8"/>
           <w:sz w:val="31"/>
         </w:rPr>
         <w:t>HARIHARAN J</w:t>
@@ -19,14 +19,14 @@
     </w:p>
     <w:p>
       <w:pPr>
-        <w:spacing w:before="0" w:after="8" w:line="240" w:lineRule="auto"/>
+        <w:spacing w:before="0" w:after="6" w:line="240" w:lineRule="auto"/>
         <w:jc w:val="center"/>
       </w:pPr>
       <w:r>
         <w:rPr>
           <w:rFonts w:ascii="Arial" w:hAnsi="Arial"/>
           <w:b w:val="0"/>
-          <w:color w:val="111111"/>
+          <w:color w:val="202124"/>
           <w:sz w:val="16"/>
         </w:rPr>
         <w:t>Madurai, Tamil Nadu, India | +91-9500963476 | jhariharancse@gmail.com</w:t>
@@ -34,14 +34,14 @@
     </w:p>
     <w:p>
       <w:pPr>
-        <w:spacing w:before="0" w:after="8" w:line="240" w:lineRule="auto"/>
+        <w:spacing w:before="0" w:after="6" w:line="240" w:lineRule="auto"/>
         <w:jc w:val="center"/>
       </w:pPr>
       <w:r>
         <w:rPr>
           <w:rFonts w:ascii="Arial" w:hAnsi="Arial"/>
           <w:b w:val="0"/>
-          <w:color w:val="111111"/>
+          <w:color w:val="202124"/>
           <w:sz w:val="16"/>
         </w:rPr>
         <w:t>LinkedIn: www.linkedin.com/in/hariharan-j-2a909a290 | GitHub: github.com/Jhsoul69</w:t>
@@ -49,105 +49,90 @@
     </w:p>
     <w:p>
       <w:pPr>
-        <w:spacing w:before="0" w:after="8" w:line="240" w:lineRule="auto"/>
+        <w:spacing w:before="0" w:after="6" w:line="240" w:lineRule="auto"/>
         <w:jc w:val="center"/>
       </w:pPr>
       <w:r>
         <w:rPr>
           <w:rFonts w:ascii="Arial" w:hAnsi="Arial"/>
           <w:b/>
-          <w:color w:val="111111"/>
+          <w:color w:val="202124"/>
           <w:sz w:val="17"/>
         </w:rPr>
-        <w:t>AWS CLOUD SECURITY ENGINEER | CLOUD ENGINEER | DEVOPS FRESHER</w:t>
+        <w:t>Cloud Engineer Intern | AWS CCP | Google ACE | Cybersecurity Engineering</w:t>
       </w:r>
     </w:p>
     <w:p>
       <w:pPr>
-        <w:spacing w:before="0" w:after="8" w:line="240" w:lineRule="auto"/>
-        <w:jc w:val="center"/>
-      </w:pPr>
-      <w:r>
-        <w:rPr>
-          <w:rFonts w:ascii="Arial" w:hAnsi="Arial"/>
-          <w:b w:val="0"/>
-          <w:color w:val="111111"/>
-          <w:sz w:val="16"/>
-        </w:rPr>
-        <w:t>AWS Certified Cloud Practitioner | Google Associate Cloud Engineer | B.E. Cybersecurity 2026</w:t>
-      </w:r>
-    </w:p>
-    <w:p>
-      <w:pPr>
-        <w:spacing w:before="60" w:after="24" w:line="240" w:lineRule="auto"/>
+        <w:spacing w:before="50" w:after="16" w:line="240" w:lineRule="auto"/>
         <w:pBdr>
-          <w:bottom w:val="single" w:sz="4" w:space="1" w:color="D9E2F3"/>
+          <w:bottom w:val="single" w:sz="4" w:space="1" w:color="DADCE0"/>
         </w:pBdr>
       </w:pPr>
       <w:r>
         <w:rPr>
           <w:rFonts w:ascii="Arial" w:hAnsi="Arial"/>
           <w:b/>
-          <w:color w:val="1F4E79"/>
-          <w:sz w:val="19"/>
+          <w:color w:val="1A73E8"/>
+          <w:sz w:val="18"/>
         </w:rPr>
         <w:t>PROFESSIONAL SUMMARY</w:t>
       </w:r>
     </w:p>
     <w:p>
       <w:pPr>
-        <w:spacing w:before="0" w:after="12" w:line="240" w:lineRule="auto"/>
+        <w:spacing w:before="0" w:after="7" w:line="240" w:lineRule="auto"/>
       </w:pPr>
       <w:r>
         <w:rPr>
           <w:rFonts w:ascii="Arial" w:hAnsi="Arial"/>
           <w:b w:val="0"/>
-          <w:color w:val="111111"/>
+          <w:color w:val="202124"/>
           <w:sz w:val="16"/>
         </w:rPr>
-        <w:t>AWS Certified Cloud Practitioner and Google Associate Cloud Engineer with hands-on cloud engineering internship experience across AWS and Google Cloud. Skilled in IAM, VPC, Route 53, EC2, S3, RDS, Cloud DNS, Compute Engine, Cloud Storage, Docker, Kubernetes/GKE, Terraform, Linux, Python, and REST APIs. Built and documented cloud security, DNS migration, VPN, database migration, load balancer, and CI/CD workflows with a cybersecurity foundation in networking, secure access, SSL/TLS, risk-aware infrastructure, and cloud operations.</w:t>
+        <w:t>Cloud Engineer Intern with hands-on experience across Google Cloud Platform and AWS. AWS Certified Cloud Practitioner and Google Associate Cloud Engineer with strong foundations in cloud infrastructure, IAM, VPC networking, DNS, Linux administration, Python APIs, Docker, Kubernetes, Terraform basics, cloud migration, and security-aware deployment. Cybersecurity Engineering student with practical exposure to secure access, SSL/TLS, routing, VPN, backend services, and RAG-based AI systems.</w:t>
       </w:r>
     </w:p>
     <w:p>
       <w:pPr>
-        <w:spacing w:before="60" w:after="24" w:line="240" w:lineRule="auto"/>
+        <w:spacing w:before="50" w:after="16" w:line="240" w:lineRule="auto"/>
         <w:pBdr>
-          <w:bottom w:val="single" w:sz="4" w:space="1" w:color="D9E2F3"/>
+          <w:bottom w:val="single" w:sz="4" w:space="1" w:color="DADCE0"/>
         </w:pBdr>
       </w:pPr>
       <w:r>
         <w:rPr>
           <w:rFonts w:ascii="Arial" w:hAnsi="Arial"/>
           <w:b/>
-          <w:color w:val="1F4E79"/>
-          <w:sz w:val="19"/>
+          <w:color w:val="1A73E8"/>
+          <w:sz w:val="18"/>
         </w:rPr>
         <w:t>TECHNICAL SKILLS</w:t>
       </w:r>
     </w:p>
     <w:p>
       <w:pPr>
-        <w:spacing w:before="0" w:after="9" w:line="240" w:lineRule="auto"/>
+        <w:spacing w:before="0" w:after="7" w:line="240" w:lineRule="auto"/>
       </w:pPr>
       <w:r>
         <w:rPr>
           <w:rFonts w:ascii="Arial" w:hAnsi="Arial"/>
           <w:b w:val="0"/>
-          <w:color w:val="111111"/>
+          <w:color w:val="202124"/>
           <w:sz w:val="16"/>
         </w:rPr>
-        <w:t>Cloud: AWS, Google Cloud Platform (GCP)</w:t>
+        <w:t>Cloud Platforms: Google Cloud Platform, Amazon Web Services</w:t>
       </w:r>
     </w:p>
     <w:p>
       <w:pPr>
-        <w:spacing w:before="0" w:after="9" w:line="240" w:lineRule="auto"/>
+        <w:spacing w:before="0" w:after="7" w:line="240" w:lineRule="auto"/>
       </w:pPr>
       <w:r>
         <w:rPr>
           <w:rFonts w:ascii="Arial" w:hAnsi="Arial"/>
           <w:b w:val="0"/>
-          <w:color w:val="111111"/>
+          <w:color w:val="202124"/>
           <w:sz w:val="16"/>
         </w:rPr>
         <w:t>AWS: IAM, EC2, S3, VPC, Route 53, RDS, ECS, ECR, EKS, CloudWatch, CodePipeline, Security Groups, NAT Gateway, VPN</w:t>
@@ -155,72 +140,86 @@
     </w:p>
     <w:p>
       <w:pPr>
-        <w:spacing w:before="0" w:after="9" w:line="240" w:lineRule="auto"/>
+        <w:spacing w:before="0" w:after="7" w:line="240" w:lineRule="auto"/>
       </w:pPr>
       <w:r>
         <w:rPr>
           <w:rFonts w:ascii="Arial" w:hAnsi="Arial"/>
           <w:b w:val="0"/>
-          <w:color w:val="111111"/>
+          <w:color w:val="202124"/>
           <w:sz w:val="16"/>
         </w:rPr>
-        <w:t>GCP: Compute Engine, Cloud Storage, Cloud IAM, VPC, Firewall Rules, Cloud DNS, GKE, Cloud Run, Cloud SQL, Cloud Load Balancing</w:t>
+        <w:t>GCP: Compute Engine, Cloud Storage, Cloud IAM, VPC, Firewall Rules, Cloud DNS, GKE, Cloud Run, Cloud SQL, Load Balancing</w:t>
       </w:r>
     </w:p>
     <w:p>
       <w:pPr>
-        <w:spacing w:before="0" w:after="9" w:line="240" w:lineRule="auto"/>
+        <w:spacing w:before="0" w:after="7" w:line="240" w:lineRule="auto"/>
       </w:pPr>
       <w:r>
         <w:rPr>
           <w:rFonts w:ascii="Arial" w:hAnsi="Arial"/>
           <w:b w:val="0"/>
-          <w:color w:val="111111"/>
+          <w:color w:val="202124"/>
           <w:sz w:val="16"/>
         </w:rPr>
-        <w:t>Security &amp; Networking: IAM, least privilege, DNS, VPN, TCP/IP, HTTP/HTTPS, SSL/TLS, subnetting, routing, Nmap, Wireshark</w:t>
+        <w:t>DevOps and Tools: Docker, Kubernetes, Terraform, Git, GitHub Actions, Linux, Bash, Postman</w:t>
       </w:r>
     </w:p>
     <w:p>
       <w:pPr>
-        <w:spacing w:before="0" w:after="9" w:line="240" w:lineRule="auto"/>
+        <w:spacing w:before="0" w:after="7" w:line="240" w:lineRule="auto"/>
       </w:pPr>
       <w:r>
         <w:rPr>
           <w:rFonts w:ascii="Arial" w:hAnsi="Arial"/>
           <w:b w:val="0"/>
-          <w:color w:val="111111"/>
+          <w:color w:val="202124"/>
           <w:sz w:val="16"/>
         </w:rPr>
-        <w:t>DevOps &amp; Programming: Terraform, Docker, Kubernetes, Git, GitHub Actions, Python, FastAPI, Bash, Java, SQL, Linux, Postman</w:t>
+        <w:t>Programming and Backend: Python, FastAPI, REST APIs, Java, SQL</w:t>
       </w:r>
     </w:p>
     <w:p>
       <w:pPr>
-        <w:spacing w:before="60" w:after="24" w:line="240" w:lineRule="auto"/>
+        <w:spacing w:before="0" w:after="7" w:line="240" w:lineRule="auto"/>
+      </w:pPr>
+      <w:r>
+        <w:rPr>
+          <w:rFonts w:ascii="Arial" w:hAnsi="Arial"/>
+          <w:b w:val="0"/>
+          <w:color w:val="202124"/>
+          <w:sz w:val="16"/>
+        </w:rPr>
+        <w:t>Networking and Security: TCP/IP, DNS, VPN, HTTP/HTTPS, SSL/TLS, subnetting, routing, Nmap, Wireshark, IAM least privilege</w:t>
+      </w:r>
+    </w:p>
+    <w:p>
+      <w:pPr>
+        <w:spacing w:before="50" w:after="16" w:line="240" w:lineRule="auto"/>
         <w:pBdr>
-          <w:bottom w:val="single" w:sz="4" w:space="1" w:color="D9E2F3"/>
+          <w:bottom w:val="single" w:sz="4" w:space="1" w:color="DADCE0"/>
         </w:pBdr>
       </w:pPr>
       <w:r>
         <w:rPr>
           <w:rFonts w:ascii="Arial" w:hAnsi="Arial"/>
           <w:b/>
-          <w:color w:val="1F4E79"/>
-          <w:sz w:val="19"/>
+          <w:color w:val="1A73E8"/>
+          <w:sz w:val="18"/>
         </w:rPr>
         <w:t>PROFESSIONAL EXPERIENCE</w:t>
       </w:r>
     </w:p>
     <w:p>
       <w:pPr>
-        <w:spacing w:before="0" w:after="10" w:line="240" w:lineRule="auto"/>
+        <w:spacing w:before="0" w:after="7" w:line="240" w:lineRule="auto"/>
       </w:pPr>
       <w:r>
         <w:rPr>
           <w:rFonts w:ascii="Arial" w:hAnsi="Arial"/>
           <w:b/>
-          <w:color w:val="111111"/>
+          <w:color w:val="202124"/>
           <w:sz w:val="16"/>
         </w:rPr>
         <w:t>Cloud Engineer Intern | Cloud Ambassadors, Google Cloud Partner | Jan 2026 - Present</w:t>
@@ -229,72 +228,72 @@
     <w:p>
       <w:pPr>
         <w:pStyle w:val="ListBullet"/>
-        <w:spacing w:before="0" w:after="12" w:line="240" w:lineRule="auto"/>
+        <w:spacing w:before="0" w:after="7" w:line="240" w:lineRule="auto"/>
         <w:ind w:left="259" w:hanging="144"/>
       </w:pPr>
       <w:r>
         <w:rPr>
           <w:rFonts w:ascii="Arial" w:hAnsi="Arial"/>
-          <w:color w:val="111111"/>
-          <w:sz w:val="16"/>
+          <w:color w:val="202124"/>
+          <w:sz w:val="15"/>
         </w:rPr>
-        <w:t>Provisioned GCP resources including Compute Engine, Cloud Storage, IAM roles, VPC networks, firewall rules, and secure access policies.</w:t>
+        <w:t>Provisioned Compute Engine, Cloud Storage, IAM roles, VPC networks, firewall rules, and secure access policies.</w:t>
       </w:r>
     </w:p>
     <w:p>
       <w:pPr>
         <w:pStyle w:val="ListBullet"/>
-        <w:spacing w:before="0" w:after="12" w:line="240" w:lineRule="auto"/>
+        <w:spacing w:before="0" w:after="7" w:line="240" w:lineRule="auto"/>
         <w:ind w:left="259" w:hanging="144"/>
       </w:pPr>
       <w:r>
         <w:rPr>
           <w:rFonts w:ascii="Arial" w:hAnsi="Arial"/>
-          <w:color w:val="111111"/>
-          <w:sz w:val="16"/>
+          <w:color w:val="202124"/>
+          <w:sz w:val="15"/>
         </w:rPr>
-        <w:t>Supported AWS and GCP infrastructure tasks across VPC, IAM, DNS, load balancing, VPN, migration workflows, and cloud troubleshooting.</w:t>
+        <w:t>Supported AWS and GCP infrastructure tasks across DNS, VPN, load balancing, migration workflows, and troubleshooting.</w:t>
       </w:r>
     </w:p>
     <w:p>
       <w:pPr>
         <w:pStyle w:val="ListBullet"/>
-        <w:spacing w:before="0" w:after="12" w:line="240" w:lineRule="auto"/>
+        <w:spacing w:before="0" w:after="7" w:line="240" w:lineRule="auto"/>
         <w:ind w:left="259" w:hanging="144"/>
       </w:pPr>
       <w:r>
         <w:rPr>
           <w:rFonts w:ascii="Arial" w:hAnsi="Arial"/>
-          <w:color w:val="111111"/>
-          <w:sz w:val="16"/>
+          <w:color w:val="202124"/>
+          <w:sz w:val="15"/>
         </w:rPr>
-        <w:t>Configured Cloud DNS and Route 53 records, HTTPS load balancer validation, and SSL/TLS certificate workflows for domain migration labs.</w:t>
+        <w:t>Configured Cloud DNS and Route 53 records, HTTPS load balancer validation, and SSL/TLS certificate workflows.</w:t>
       </w:r>
     </w:p>
     <w:p>
       <w:pPr>
         <w:pStyle w:val="ListBullet"/>
-        <w:spacing w:before="0" w:after="12" w:line="240" w:lineRule="auto"/>
+        <w:spacing w:before="0" w:after="7" w:line="240" w:lineRule="auto"/>
         <w:ind w:left="259" w:hanging="144"/>
       </w:pPr>
       <w:r>
         <w:rPr>
           <w:rFonts w:ascii="Arial" w:hAnsi="Arial"/>
-          <w:color w:val="111111"/>
-          <w:sz w:val="16"/>
+          <w:color w:val="202124"/>
+          <w:sz w:val="15"/>
         </w:rPr>
-        <w:t>Practiced container deployment with Docker, Kubernetes/GKE, Artifact Registry, Cloud Run, Linux, Git, Bash, and Terraform fundamentals.</w:t>
+        <w:t>Practiced Docker, Kubernetes/GKE, Artifact Registry, Cloud Run, Linux, Git, Bash, and Terraform fundamentals.</w:t>
       </w:r>
     </w:p>
     <w:p>
       <w:pPr>
-        <w:spacing w:before="0" w:after="10" w:line="240" w:lineRule="auto"/>
+        <w:spacing w:before="0" w:after="7" w:line="240" w:lineRule="auto"/>
       </w:pPr>
       <w:r>
         <w:rPr>
           <w:rFonts w:ascii="Arial" w:hAnsi="Arial"/>
           <w:b/>
-          <w:color w:val="111111"/>
+          <w:color w:val="202124"/>
           <w:sz w:val="16"/>
         </w:rPr>
         <w:t>Backend Developer | Chella Corporations | Jul 2025 - Dec 2025</w:t>
@@ -303,42 +302,42 @@
     <w:p>
       <w:pPr>
         <w:pStyle w:val="ListBullet"/>
-        <w:spacing w:before="0" w:after="12" w:line="240" w:lineRule="auto"/>
+        <w:spacing w:before="0" w:after="7" w:line="240" w:lineRule="auto"/>
         <w:ind w:left="259" w:hanging="144"/>
       </w:pPr>
       <w:r>
         <w:rPr>
           <w:rFonts w:ascii="Arial" w:hAnsi="Arial"/>
-          <w:color w:val="111111"/>
-          <w:sz w:val="16"/>
+          <w:color w:val="202124"/>
+          <w:sz w:val="15"/>
         </w:rPr>
-        <w:t>Developed REST APIs using Python and FastAPI for an AI-driven medical platform, including secure authentication and service integration.</w:t>
+        <w:t>Developed REST APIs using Python and FastAPI for an AI-driven medical platform.</w:t>
       </w:r>
     </w:p>
     <w:p>
       <w:pPr>
         <w:pStyle w:val="ListBullet"/>
-        <w:spacing w:before="0" w:after="12" w:line="240" w:lineRule="auto"/>
+        <w:spacing w:before="0" w:after="7" w:line="240" w:lineRule="auto"/>
         <w:ind w:left="259" w:hanging="144"/>
       </w:pPr>
       <w:r>
         <w:rPr>
           <w:rFonts w:ascii="Arial" w:hAnsi="Arial"/>
-          <w:color w:val="111111"/>
-          <w:sz w:val="16"/>
+          <w:color w:val="202124"/>
+          <w:sz w:val="15"/>
         </w:rPr>
-        <w:t>Deployed and maintained backend services on Linux servers while supporting database integration, debugging, and API automation.</w:t>
+        <w:t>Worked with secure authentication, service integration, database integration, debugging, and Linux deployment.</w:t>
       </w:r>
     </w:p>
     <w:p>
       <w:pPr>
-        <w:spacing w:before="0" w:after="10" w:line="240" w:lineRule="auto"/>
+        <w:spacing w:before="0" w:after="7" w:line="240" w:lineRule="auto"/>
       </w:pPr>
       <w:r>
         <w:rPr>
           <w:rFonts w:ascii="Arial" w:hAnsi="Arial"/>
           <w:b/>
-          <w:color w:val="111111"/>
+          <w:color w:val="202124"/>
           <w:sz w:val="16"/>
         </w:rPr>
         <w:t>AI Application Developer Intern | Infosys Springboard | Sep 2025 - Nov 2025</w:t>
@@ -347,208 +346,208 @@
     <w:p>
       <w:pPr>
         <w:pStyle w:val="ListBullet"/>
-        <w:spacing w:before="0" w:after="12" w:line="240" w:lineRule="auto"/>
+        <w:spacing w:before="0" w:after="7" w:line="240" w:lineRule="auto"/>
         <w:ind w:left="259" w:hanging="144"/>
       </w:pPr>
       <w:r>
         <w:rPr>
           <w:rFonts w:ascii="Arial" w:hAnsi="Arial"/>
-          <w:color w:val="111111"/>
-          <w:sz w:val="16"/>
+          <w:color w:val="202124"/>
+          <w:sz w:val="15"/>
         </w:rPr>
-        <w:t>Built an AI-based compliance checker scoring system that improved process efficiency by 70%.</w:t>
+        <w:t>Built a RAG-based compliance checker system for document analysis, retrieval, scoring, and automated evaluation.</w:t>
       </w:r>
     </w:p>
     <w:p>
       <w:pPr>
         <w:pStyle w:val="ListBullet"/>
-        <w:spacing w:before="0" w:after="12" w:line="240" w:lineRule="auto"/>
+        <w:spacing w:before="0" w:after="7" w:line="240" w:lineRule="auto"/>
         <w:ind w:left="259" w:hanging="144"/>
       </w:pPr>
       <w:r>
         <w:rPr>
           <w:rFonts w:ascii="Arial" w:hAnsi="Arial"/>
-          <w:color w:val="111111"/>
-          <w:sz w:val="16"/>
+          <w:color w:val="202124"/>
+          <w:sz w:val="15"/>
         </w:rPr>
-        <w:t>Integrated GPT-based workflows for document analysis, compliance verification, and automated evaluation tasks.</w:t>
+        <w:t>Integrated GPT-based workflows to improve compliance review efficiency by 70%.</w:t>
       </w:r>
     </w:p>
     <w:p>
       <w:pPr>
-        <w:spacing w:before="60" w:after="24" w:line="240" w:lineRule="auto"/>
+        <w:spacing w:before="50" w:after="16" w:line="240" w:lineRule="auto"/>
         <w:pBdr>
-          <w:bottom w:val="single" w:sz="4" w:space="1" w:color="D9E2F3"/>
+          <w:bottom w:val="single" w:sz="4" w:space="1" w:color="DADCE0"/>
         </w:pBdr>
       </w:pPr>
       <w:r>
         <w:rPr>
           <w:rFonts w:ascii="Arial" w:hAnsi="Arial"/>
           <w:b/>
-          <w:color w:val="1F4E79"/>
-          <w:sz w:val="19"/>
+          <w:color w:val="1A73E8"/>
+          <w:sz w:val="18"/>
         </w:rPr>
-        <w:t>CLOUD PROJECTS</w:t>
+        <w:t>EDUCATION</w:t>
       </w:r>
     </w:p>
     <w:p>
       <w:pPr>
-        <w:spacing w:before="0" w:after="10" w:line="240" w:lineRule="auto"/>
+        <w:spacing w:before="0" w:after="7" w:line="240" w:lineRule="auto"/>
       </w:pPr>
       <w:r>
         <w:rPr>
           <w:rFonts w:ascii="Arial" w:hAnsi="Arial"/>
-          <w:b/>
-          <w:color w:val="111111"/>
+          <w:b w:val="0"/>
+          <w:color w:val="202124"/>
           <w:sz w:val="16"/>
         </w:rPr>
-        <w:t>AWS Route 53 to Google Cloud DNS Migration | Route 53, Cloud DNS, DNS, SSL/TLS</w:t>
+        <w:t>B.E. Cybersecurity Engineering | J.J. College of Engineering &amp; Technology, Trichy (Anna University) | 2022 - 2026 | CGPA: 9.0/10</w:t>
       </w:r>
     </w:p>
     <w:p>
       <w:pPr>
-        <w:pStyle w:val="ListBullet"/>
-        <w:spacing w:before="0" w:after="12" w:line="240" w:lineRule="auto"/>
-        <w:ind w:left="259" w:hanging="144"/>
+        <w:spacing w:before="0" w:after="7" w:line="240" w:lineRule="auto"/>
       </w:pPr>
       <w:r>
         <w:rPr>
           <w:rFonts w:ascii="Arial" w:hAnsi="Arial"/>
-          <w:color w:val="111111"/>
+          <w:b w:val="0"/>
+          <w:color w:val="202124"/>
           <w:sz w:val="16"/>
         </w:rPr>
-        <w:t>Documented zero-downtime migration for haridns.qzz.io with DNS inventory, Cloud DNS zone creation, record replication, NS cutover, validation, and rollback.</w:t>
+        <w:t>Coursework: Computer Networks, Operating Systems, Cryptography, Distributed Systems, Data Structures</w:t>
       </w:r>
     </w:p>
     <w:p>
       <w:pPr>
-        <w:pStyle w:val="ListBullet"/>
-        <w:spacing w:before="0" w:after="12" w:line="240" w:lineRule="auto"/>
-        <w:ind w:left="259" w:hanging="144"/>
-      </w:pPr>
-      <w:r>
-        <w:rPr>
-          <w:rFonts w:ascii="Arial" w:hAnsi="Arial"/>
-          <w:color w:val="111111"/>
-          <w:sz w:val="16"/>
-        </w:rPr>
-        <w:t>Recreated A, CNAME, and TXT records in Cloud DNS, validated NS/A/CNAME/TXT results with dig, and kept Route 53 active during propagation.</w:t>
-      </w:r>
-    </w:p>
-    <w:p>
-      <w:pPr>
-        <w:spacing w:before="0" w:after="10" w:line="240" w:lineRule="auto"/>
-      </w:pPr>
-      <w:r>
-        <w:rPr>
-          <w:rFonts w:ascii="Arial" w:hAnsi="Arial"/>
-          <w:b/>
-          <w:color w:val="111111"/>
-          <w:sz w:val="16"/>
-        </w:rPr>
-        <w:t>Private AWS RDS PostgreSQL to GCP Cloud SQL Migration | HA VPN, DMS, BGP</w:t>
-      </w:r>
-    </w:p>
-    <w:p>
-      <w:pPr>
-        <w:pStyle w:val="ListBullet"/>
-        <w:spacing w:before="0" w:after="12" w:line="240" w:lineRule="auto"/>
-        <w:ind w:left="259" w:hanging="144"/>
-      </w:pPr>
-      <w:r>
-        <w:rPr>
-          <w:rFonts w:ascii="Arial" w:hAnsi="Arial"/>
-          <w:color w:val="111111"/>
-          <w:sz w:val="16"/>
-        </w:rPr>
-        <w:t>Designed private migration architecture using AWS VPC/VGW, GCP HA VPN, IPsec, BGP routing, Private Services Access, and Database Migration Service.</w:t>
-      </w:r>
-    </w:p>
-    <w:p>
-      <w:pPr>
-        <w:pStyle w:val="ListBullet"/>
-        <w:spacing w:before="0" w:after="12" w:line="240" w:lineRule="auto"/>
-        <w:ind w:left="259" w:hanging="144"/>
-      </w:pPr>
-      <w:r>
-        <w:rPr>
-          <w:rFonts w:ascii="Arial" w:hAnsi="Arial"/>
-          <w:color w:val="111111"/>
-          <w:sz w:val="16"/>
-        </w:rPr>
-        <w:t>Planned logical replication, migration user setup, validation, and secure data transfer with no public internet exposure.</w:t>
-      </w:r>
-    </w:p>
-    <w:p>
-      <w:pPr>
-        <w:spacing w:before="0" w:after="10" w:line="240" w:lineRule="auto"/>
-      </w:pPr>
-      <w:r>
-        <w:rPr>
-          <w:rFonts w:ascii="Arial" w:hAnsi="Arial"/>
-          <w:b/>
-          <w:color w:val="111111"/>
-          <w:sz w:val="16"/>
-        </w:rPr>
-        <w:t>Cloud DevOps Deployment | Docker, Kubernetes, AWS CodePipeline, ECR, ECS</w:t>
-      </w:r>
-    </w:p>
-    <w:p>
-      <w:pPr>
-        <w:pStyle w:val="ListBullet"/>
-        <w:spacing w:before="0" w:after="12" w:line="240" w:lineRule="auto"/>
-        <w:ind w:left="259" w:hanging="144"/>
-      </w:pPr>
-      <w:r>
-        <w:rPr>
-          <w:rFonts w:ascii="Arial" w:hAnsi="Arial"/>
-          <w:color w:val="111111"/>
-          <w:sz w:val="16"/>
-        </w:rPr>
-        <w:t>Built container deployment workflows using Docker, GitHub, CI/CD, Amazon ECR, Amazon ECS, and blue-green deployment concepts.</w:t>
-      </w:r>
-    </w:p>
-    <w:p>
-      <w:pPr>
-        <w:pStyle w:val="ListBullet"/>
-        <w:spacing w:before="0" w:after="12" w:line="240" w:lineRule="auto"/>
-        <w:ind w:left="259" w:hanging="144"/>
-      </w:pPr>
-      <w:r>
-        <w:rPr>
-          <w:rFonts w:ascii="Arial" w:hAnsi="Arial"/>
-          <w:color w:val="111111"/>
-          <w:sz w:val="16"/>
-        </w:rPr>
-        <w:t>Practiced Kubernetes workloads with pods, deployments, services, rolling updates, and GKE/EKS cloud deployment fundamentals.</w:t>
-      </w:r>
-    </w:p>
-    <w:p>
-      <w:pPr>
-        <w:spacing w:before="60" w:after="24" w:line="240" w:lineRule="auto"/>
+        <w:spacing w:before="50" w:after="16" w:line="240" w:lineRule="auto"/>
         <w:pBdr>
-          <w:bottom w:val="single" w:sz="4" w:space="1" w:color="D9E2F3"/>
+          <w:bottom w:val="single" w:sz="4" w:space="1" w:color="DADCE0"/>
         </w:pBdr>
       </w:pPr>
       <w:r>
         <w:rPr>
           <w:rFonts w:ascii="Arial" w:hAnsi="Arial"/>
           <w:b/>
-          <w:color w:val="1F4E79"/>
-          <w:sz w:val="19"/>
+          <w:color w:val="1A73E8"/>
+          <w:sz w:val="18"/>
         </w:rPr>
-        <w:t>CERTIFICATIONS</w:t>
+        <w:t>PROJECT HIGHLIGHTS</w:t>
       </w:r>
     </w:p>
     <w:p>
       <w:pPr>
-        <w:spacing w:before="0" w:after="9" w:line="240" w:lineRule="auto"/>
+        <w:spacing w:before="0" w:after="7" w:line="240" w:lineRule="auto"/>
+      </w:pPr>
+      <w:r>
+        <w:rPr>
+          <w:rFonts w:ascii="Arial" w:hAnsi="Arial"/>
+          <w:b/>
+          <w:color w:val="202124"/>
+          <w:sz w:val="16"/>
+        </w:rPr>
+        <w:t>AWS Route 53 to Google Cloud DNS Migration</w:t>
+      </w:r>
+    </w:p>
+    <w:p>
+      <w:pPr>
+        <w:pStyle w:val="ListBullet"/>
+        <w:spacing w:before="0" w:after="7" w:line="240" w:lineRule="auto"/>
+        <w:ind w:left="259" w:hanging="144"/>
+      </w:pPr>
+      <w:r>
+        <w:rPr>
+          <w:rFonts w:ascii="Arial" w:hAnsi="Arial"/>
+          <w:color w:val="202124"/>
+          <w:sz w:val="15"/>
+        </w:rPr>
+        <w:t>Created a no-downtime DNS migration plan with Cloud DNS zone setup, record replication, NS cutover, validation, and rollback.</w:t>
+      </w:r>
+    </w:p>
+    <w:p>
+      <w:pPr>
+        <w:spacing w:before="0" w:after="7" w:line="240" w:lineRule="auto"/>
+      </w:pPr>
+      <w:r>
+        <w:rPr>
+          <w:rFonts w:ascii="Arial" w:hAnsi="Arial"/>
+          <w:b/>
+          <w:color w:val="202124"/>
+          <w:sz w:val="16"/>
+        </w:rPr>
+        <w:t>Private AWS RDS PostgreSQL to GCP Cloud SQL Migration</w:t>
+      </w:r>
+    </w:p>
+    <w:p>
+      <w:pPr>
+        <w:pStyle w:val="ListBullet"/>
+        <w:spacing w:before="0" w:after="7" w:line="240" w:lineRule="auto"/>
+        <w:ind w:left="259" w:hanging="144"/>
+      </w:pPr>
+      <w:r>
+        <w:rPr>
+          <w:rFonts w:ascii="Arial" w:hAnsi="Arial"/>
+          <w:color w:val="202124"/>
+          <w:sz w:val="15"/>
+        </w:rPr>
+        <w:t>Designed private migration architecture using AWS VPC/VGW, GCP HA VPN, IPsec, BGP, Private Services Access, and DMS.</w:t>
+      </w:r>
+    </w:p>
+    <w:p>
+      <w:pPr>
+        <w:spacing w:before="0" w:after="7" w:line="240" w:lineRule="auto"/>
+      </w:pPr>
+      <w:r>
+        <w:rPr>
+          <w:rFonts w:ascii="Arial" w:hAnsi="Arial"/>
+          <w:b/>
+          <w:color w:val="202124"/>
+          <w:sz w:val="16"/>
+        </w:rPr>
+        <w:t>Forenscope - IoT Based Digital Evidence Collector</w:t>
+      </w:r>
+    </w:p>
+    <w:p>
+      <w:pPr>
+        <w:pStyle w:val="ListBullet"/>
+        <w:spacing w:before="0" w:after="7" w:line="240" w:lineRule="auto"/>
+        <w:ind w:left="259" w:hanging="144"/>
+      </w:pPr>
+      <w:r>
+        <w:rPr>
+          <w:rFonts w:ascii="Arial" w:hAnsi="Arial"/>
+          <w:color w:val="202124"/>
+          <w:sz w:val="15"/>
+        </w:rPr>
+        <w:t>Built a Raspberry Pi forensic acquisition concept using Python, SHA-256 hashing, and secure SQLite evidence storage.</w:t>
+      </w:r>
+    </w:p>
+    <w:p>
+      <w:pPr>
+        <w:spacing w:before="50" w:after="16" w:line="240" w:lineRule="auto"/>
+        <w:pBdr>
+          <w:bottom w:val="single" w:sz="4" w:space="1" w:color="DADCE0"/>
+        </w:pBdr>
+      </w:pPr>
+      <w:r>
+        <w:rPr>
+          <w:rFonts w:ascii="Arial" w:hAnsi="Arial"/>
+          <w:b/>
+          <w:color w:val="1A73E8"/>
+          <w:sz w:val="18"/>
+        </w:rPr>
+        <w:t>CERTIFICATIONS AND LEARNING</w:t>
+      </w:r>
+    </w:p>
+    <w:p>
+      <w:pPr>
+        <w:spacing w:before="0" w:after="7" w:line="240" w:lineRule="auto"/>
       </w:pPr>
       <w:r>
         <w:rPr>
           <w:rFonts w:ascii="Arial" w:hAnsi="Arial"/>
           <w:b w:val="0"/>
-          <w:color w:val="111111"/>
+          <w:color w:val="202124"/>
           <w:sz w:val="16"/>
         </w:rPr>
         <w:t>AWS Certified Cloud Practitioner (CLF-C02)</w:t>
@@ -556,13 +555,13 @@
     </w:p>
     <w:p>
       <w:pPr>
-        <w:spacing w:before="0" w:after="9" w:line="240" w:lineRule="auto"/>
+        <w:spacing w:before="0" w:after="7" w:line="240" w:lineRule="auto"/>
       </w:pPr>
       <w:r>
         <w:rPr>
           <w:rFonts w:ascii="Arial" w:hAnsi="Arial"/>
           <w:b w:val="0"/>
-          <w:color w:val="111111"/>
+          <w:color w:val="202124"/>
           <w:sz w:val="16"/>
         </w:rPr>
         <w:t>Google Associate Cloud Engineer</w:t>
@@ -570,13 +569,13 @@
     </w:p>
     <w:p>
       <w:pPr>
-        <w:spacing w:before="0" w:after="9" w:line="240" w:lineRule="auto"/>
+        <w:spacing w:before="0" w:after="7" w:line="240" w:lineRule="auto"/>
       </w:pPr>
       <w:r>
         <w:rPr>
           <w:rFonts w:ascii="Arial" w:hAnsi="Arial"/>
           <w:b w:val="0"/>
-          <w:color w:val="111111"/>
+          <w:color w:val="202124"/>
           <w:sz w:val="16"/>
         </w:rPr>
         <w:t>Google Cloud Digital Leader Learning Path - Completed</w:t>
@@ -584,13 +583,13 @@
     </w:p>
     <w:p>
       <w:pPr>
-        <w:spacing w:before="0" w:after="9" w:line="240" w:lineRule="auto"/>
+        <w:spacing w:before="0" w:after="7" w:line="240" w:lineRule="auto"/>
       </w:pPr>
       <w:r>
         <w:rPr>
           <w:rFonts w:ascii="Arial" w:hAnsi="Arial"/>
           <w:b w:val="0"/>
-          <w:color w:val="111111"/>
+          <w:color w:val="202124"/>
           <w:sz w:val="16"/>
         </w:rPr>
         <w:t>Google Professional Cloud Architect Learning Path - Completed</w:t>
@@ -598,13 +597,13 @@
     </w:p>
     <w:p>
       <w:pPr>
-        <w:spacing w:before="0" w:after="9" w:line="240" w:lineRule="auto"/>
+        <w:spacing w:before="0" w:after="7" w:line="240" w:lineRule="auto"/>
       </w:pPr>
       <w:r>
         <w:rPr>
           <w:rFonts w:ascii="Arial" w:hAnsi="Arial"/>
           <w:b w:val="0"/>
-          <w:color w:val="111111"/>
+          <w:color w:val="202124"/>
           <w:sz w:val="16"/>
         </w:rPr>
         <w:t>EC-Council Network Defense Essentials</w:t>
@@ -612,13 +611,13 @@
     </w:p>
     <w:p>
       <w:pPr>
-        <w:spacing w:before="0" w:after="9" w:line="240" w:lineRule="auto"/>
+        <w:spacing w:before="0" w:after="7" w:line="240" w:lineRule="auto"/>
       </w:pPr>
       <w:r>
         <w:rPr>
           <w:rFonts w:ascii="Arial" w:hAnsi="Arial"/>
           <w:b w:val="0"/>
-          <w:color w:val="111111"/>
+          <w:color w:val="202124"/>
           <w:sz w:val="16"/>
         </w:rPr>
         <w:t>Cisco Networking Basics</w:t>
@@ -626,97 +625,21 @@
     </w:p>
     <w:p>
       <w:pPr>
-        <w:spacing w:before="0" w:after="9" w:line="240" w:lineRule="auto"/>
+        <w:spacing w:before="0" w:after="7" w:line="240" w:lineRule="auto"/>
       </w:pPr>
       <w:r>
         <w:rPr>
           <w:rFonts w:ascii="Arial" w:hAnsi="Arial"/>
           <w:b w:val="0"/>
-          <w:color w:val="111111"/>
+          <w:color w:val="202124"/>
           <w:sz w:val="16"/>
         </w:rPr>
         <w:t>Infosys Artificial Intelligence Primer</w:t>
       </w:r>
     </w:p>
-    <w:p>
-      <w:pPr>
-        <w:spacing w:before="60" w:after="24" w:line="240" w:lineRule="auto"/>
-        <w:pBdr>
-          <w:bottom w:val="single" w:sz="4" w:space="1" w:color="D9E2F3"/>
-        </w:pBdr>
-      </w:pPr>
-      <w:r>
-        <w:rPr>
-          <w:rFonts w:ascii="Arial" w:hAnsi="Arial"/>
-          <w:b/>
-          <w:color w:val="1F4E79"/>
-          <w:sz w:val="19"/>
-        </w:rPr>
-        <w:t>EDUCATION</w:t>
-      </w:r>
-    </w:p>
-    <w:p>
-      <w:pPr>
-        <w:spacing w:before="0" w:after="9" w:line="240" w:lineRule="auto"/>
-      </w:pPr>
-      <w:r>
-        <w:rPr>
-          <w:rFonts w:ascii="Arial" w:hAnsi="Arial"/>
-          <w:b w:val="0"/>
-          <w:color w:val="111111"/>
-          <w:sz w:val="16"/>
-        </w:rPr>
-        <w:t>B.E. Cybersecurity Engineering | J.J. College of Engineering &amp; Technology, Trichy (Anna University) | 2022 - 2026 | CGPA: 8.5/10</w:t>
-      </w:r>
-    </w:p>
-    <w:p>
-      <w:pPr>
-        <w:spacing w:before="0" w:after="9" w:line="240" w:lineRule="auto"/>
-      </w:pPr>
-      <w:r>
-        <w:rPr>
-          <w:rFonts w:ascii="Arial" w:hAnsi="Arial"/>
-          <w:b w:val="0"/>
-          <w:color w:val="111111"/>
-          <w:sz w:val="16"/>
-        </w:rPr>
-        <w:t>Coursework: Computer Networks, Operating Systems, Cryptography, Distributed Systems, Data Structures</w:t>
-      </w:r>
-    </w:p>
-    <w:p>
-      <w:pPr>
-        <w:spacing w:before="60" w:after="24" w:line="240" w:lineRule="auto"/>
-        <w:pBdr>
-          <w:bottom w:val="single" w:sz="4" w:space="1" w:color="D9E2F3"/>
-        </w:pBdr>
-      </w:pPr>
-      <w:r>
-        <w:rPr>
-          <w:rFonts w:ascii="Arial" w:hAnsi="Arial"/>
-          <w:b/>
-          <w:color w:val="1F4E79"/>
-          <w:sz w:val="19"/>
-        </w:rPr>
-        <w:t>ATS KEYWORDS</w:t>
-      </w:r>
-    </w:p>
-    <w:p>
-      <w:pPr>
-        <w:spacing w:before="0" w:after="12" w:line="240" w:lineRule="auto"/>
-      </w:pPr>
-      <w:r>
-        <w:rPr>
-          <w:rFonts w:ascii="Arial" w:hAnsi="Arial"/>
-          <w:b w:val="0"/>
-          <w:color w:val="111111"/>
-          <w:sz w:val="15"/>
-        </w:rPr>
-        <w:t>AWS Cloud Security, Cloud Engineer, Cyber Security Specialist, IAM, VPC, Route 53, Cloud DNS, EC2, RDS, VPN, Security Groups, Cloud Migration, Infrastructure Security, Network Security, DNS Migration, Database Migration, Load Balancer, SSL/TLS, Terraform, Docker, Kubernetes, Linux, Python, CI/CD, Cloud Operations, Risk Assessment, Monitoring</w:t>
-      </w:r>
-    </w:p>
     <w:sectPr>
       <w:pgSz w:w="12240" w:h="15840"/>
-      <w:pgMar w:top="605" w:right="662" w:bottom="547" w:left="662" w:header="288" w:footer="288" w:gutter="0"/>
+      <w:pgMar w:top="547" w:right="662" w:bottom="490" w:left="662" w:header="720" w:footer="720" w:gutter="0"/>
       <w:cols w:space="720"/>
       <w:docGrid w:linePitch="360"/>
     </w:sectPr>
@@ -1622,7 +1545,7 @@
     </w:pPr>
     <w:rPr>
       <w:rFonts w:ascii="Arial" w:hAnsi="Arial"/>
-      <w:sz w:val="16"/>
+      <w:sz w:val="15"/>
     </w:rPr>
   </w:style>
   <w:style w:type="paragraph" w:styleId="ListBullet2">

</xml_diff>

<commit_message>
Refresh resume and glass portfolio visuals
</commit_message>
<xml_diff>
--- a/assets/resume/Hariharan_J_Resume.docx
+++ b/assets/resume/Hariharan_J_Resume.docx
@@ -2,644 +2,2961 @@
 <file path=word/document.xml><?xml version="1.0" encoding="utf-8"?>
 <w:document xmlns:wpc="http://schemas.microsoft.com/office/word/2010/wordprocessingCanvas" xmlns:mo="http://schemas.microsoft.com/office/mac/office/2008/main" xmlns:mc="http://schemas.openxmlformats.org/markup-compatibility/2006" xmlns:mv="urn:schemas-microsoft-com:mac:vml" xmlns:o="urn:schemas-microsoft-com:office:office" xmlns:r="http://schemas.openxmlformats.org/officeDocument/2006/relationships" xmlns:m="http://schemas.openxmlformats.org/officeDocument/2006/math" xmlns:v="urn:schemas-microsoft-com:vml" xmlns:wp14="http://schemas.microsoft.com/office/word/2010/wordprocessingDrawing" xmlns:wp="http://schemas.openxmlformats.org/drawingml/2006/wordprocessingDrawing" xmlns:w10="urn:schemas-microsoft-com:office:word" xmlns:w="http://schemas.openxmlformats.org/wordprocessingml/2006/main" xmlns:w14="http://schemas.microsoft.com/office/word/2010/wordml" xmlns:wpg="http://schemas.microsoft.com/office/word/2010/wordprocessingGroup" xmlns:wpi="http://schemas.microsoft.com/office/word/2010/wordprocessingInk" xmlns:wne="http://schemas.microsoft.com/office/word/2006/wordml" xmlns:wps="http://schemas.microsoft.com/office/word/2010/wordprocessingShape" mc:Ignorable="w14 wp14">
   <w:body>
+    <w:tbl>
+      <w:tblPr>
+        <w:tblW w:type="auto" w:w="0"/>
+        <w:jc w:val="center"/>
+        <w:tblLayout w:type="autofit"/>
+        <w:tblLook w:firstColumn="1" w:firstRow="1" w:lastColumn="0" w:lastRow="0" w:noHBand="0" w:noVBand="1" w:val="04A0"/>
+      </w:tblPr>
+      <w:tblGrid>
+        <w:gridCol w:w="6768"/>
+        <w:gridCol w:w="3456"/>
+      </w:tblGrid>
+      <w:tr>
+        <w:tc>
+          <w:tcPr>
+            <w:tcW w:type="dxa" w:w="5400"/>
+            <w:vAlign w:val="top"/>
+            <w:shd w:fill="FFFFFF"/>
+            <w:tcBorders>
+              <w:top w:val="single" w:sz="8" w:space="0" w:color="DCE6F2"/>
+              <w:left w:val="single" w:sz="8" w:space="0" w:color="DCE6F2"/>
+              <w:bottom w:val="single" w:sz="8" w:space="0" w:color="DCE6F2"/>
+              <w:right w:val="single" w:sz="8" w:space="0" w:color="DCE6F2"/>
+            </w:tcBorders>
+          </w:tcPr>
+          <w:p>
+            <w:pPr>
+              <w:spacing w:after="40"/>
+              <w:jc w:val="left"/>
+            </w:pPr>
+            <w:r>
+              <w:rPr>
+                <w:rFonts w:ascii="Aptos" w:hAnsi="Aptos"/>
+                <w:b/>
+                <w:color w:val="202124"/>
+                <w:sz w:val="44"/>
+              </w:rPr>
+              <w:t>HARIHARAN J</w:t>
+            </w:r>
+          </w:p>
+          <w:p>
+            <w:r>
+              <w:rPr>
+                <w:rFonts w:ascii="Aptos" w:hAnsi="Aptos"/>
+                <w:b/>
+                <w:color w:val="1A73E8"/>
+                <w:sz w:val="19"/>
+              </w:rPr>
+              <w:t>Cloud Engineer Intern | AWS CCP | Google ACE | Cybersecurity Engineering</w:t>
+            </w:r>
+          </w:p>
+          <w:p>
+            <w:r>
+              <w:rPr>
+                <w:rFonts w:ascii="Aptos" w:hAnsi="Aptos"/>
+                <w:b w:val="0"/>
+                <w:color w:val="5F6368"/>
+                <w:sz w:val="17"/>
+              </w:rPr>
+              <w:t>Madurai, Tamil Nadu, India | +91-9500963476 | jhariharancse@gmail.com</w:t>
+            </w:r>
+          </w:p>
+          <w:p>
+            <w:r>
+              <w:rPr>
+                <w:rFonts w:ascii="Aptos" w:hAnsi="Aptos"/>
+                <w:b w:val="0"/>
+                <w:color w:val="5F6368"/>
+                <w:sz w:val="17"/>
+              </w:rPr>
+              <w:t>linkedin.com/in/hariharan-j-2a909a290 | github.com/Jhsoul69</w:t>
+            </w:r>
+          </w:p>
+        </w:tc>
+        <w:tc>
+          <w:tcPr>
+            <w:tcW w:type="dxa" w:w="5400"/>
+            <w:vAlign w:val="top"/>
+            <w:shd w:fill="FFFFFF"/>
+            <w:tcBorders>
+              <w:top w:val="single" w:sz="8" w:space="0" w:color="DCE6F2"/>
+              <w:left w:val="single" w:sz="8" w:space="0" w:color="DCE6F2"/>
+              <w:bottom w:val="single" w:sz="8" w:space="0" w:color="DCE6F2"/>
+              <w:right w:val="single" w:sz="8" w:space="0" w:color="DCE6F2"/>
+            </w:tcBorders>
+          </w:tcPr>
+          <w:p>
+            <w:pPr>
+              <w:spacing w:after="40"/>
+            </w:pPr>
+          </w:p>
+          <w:p>
+            <w:r>
+              <w:drawing>
+                <wp:inline xmlns:a="http://schemas.openxmlformats.org/drawingml/2006/main" xmlns:pic="http://schemas.openxmlformats.org/drawingml/2006/picture">
+                  <wp:extent cx="182880" cy="182880"/>
+                  <wp:docPr id="1" name="Picture 1"/>
+                  <wp:cNvGraphicFramePr>
+                    <a:graphicFrameLocks noChangeAspect="1"/>
+                  </wp:cNvGraphicFramePr>
+                  <a:graphic>
+                    <a:graphicData uri="http://schemas.openxmlformats.org/drawingml/2006/picture">
+                      <pic:pic>
+                        <pic:nvPicPr>
+                          <pic:cNvPr id="0" name="aws.png"/>
+                          <pic:cNvPicPr/>
+                        </pic:nvPicPr>
+                        <pic:blipFill>
+                          <a:blip r:embed="rId9"/>
+                          <a:stretch>
+                            <a:fillRect/>
+                          </a:stretch>
+                        </pic:blipFill>
+                        <pic:spPr>
+                          <a:xfrm>
+                            <a:off x="0" y="0"/>
+                            <a:ext cx="182880" cy="182880"/>
+                          </a:xfrm>
+                          <a:prstGeom prst="rect"/>
+                        </pic:spPr>
+                      </pic:pic>
+                    </a:graphicData>
+                  </a:graphic>
+                </wp:inline>
+              </w:drawing>
+            </w:r>
+            <w:r>
+              <w:t xml:space="preserve"> </w:t>
+            </w:r>
+            <w:r>
+              <w:rPr>
+                <w:rFonts w:ascii="Aptos" w:hAnsi="Aptos"/>
+                <w:b/>
+                <w:color w:val="253044"/>
+                <w:sz w:val="17"/>
+              </w:rPr>
+              <w:t>AWS CCP</w:t>
+            </w:r>
+          </w:p>
+          <w:p>
+            <w:r>
+              <w:drawing>
+                <wp:inline xmlns:a="http://schemas.openxmlformats.org/drawingml/2006/main" xmlns:pic="http://schemas.openxmlformats.org/drawingml/2006/picture">
+                  <wp:extent cx="182880" cy="182880"/>
+                  <wp:docPr id="2" name="Picture 2"/>
+                  <wp:cNvGraphicFramePr>
+                    <a:graphicFrameLocks noChangeAspect="1"/>
+                  </wp:cNvGraphicFramePr>
+                  <a:graphic>
+                    <a:graphicData uri="http://schemas.openxmlformats.org/drawingml/2006/picture">
+                      <pic:pic>
+                        <pic:nvPicPr>
+                          <pic:cNvPr id="0" name="googlecloud.png"/>
+                          <pic:cNvPicPr/>
+                        </pic:nvPicPr>
+                        <pic:blipFill>
+                          <a:blip r:embed="rId10"/>
+                          <a:stretch>
+                            <a:fillRect/>
+                          </a:stretch>
+                        </pic:blipFill>
+                        <pic:spPr>
+                          <a:xfrm>
+                            <a:off x="0" y="0"/>
+                            <a:ext cx="182880" cy="182880"/>
+                          </a:xfrm>
+                          <a:prstGeom prst="rect"/>
+                        </pic:spPr>
+                      </pic:pic>
+                    </a:graphicData>
+                  </a:graphic>
+                </wp:inline>
+              </w:drawing>
+            </w:r>
+            <w:r>
+              <w:t xml:space="preserve"> </w:t>
+            </w:r>
+            <w:r>
+              <w:rPr>
+                <w:rFonts w:ascii="Aptos" w:hAnsi="Aptos"/>
+                <w:b/>
+                <w:color w:val="253044"/>
+                <w:sz w:val="17"/>
+              </w:rPr>
+              <w:t>Google ACE</w:t>
+            </w:r>
+          </w:p>
+          <w:p>
+            <w:r>
+              <w:drawing>
+                <wp:inline xmlns:a="http://schemas.openxmlformats.org/drawingml/2006/main" xmlns:pic="http://schemas.openxmlformats.org/drawingml/2006/picture">
+                  <wp:extent cx="182880" cy="182880"/>
+                  <wp:docPr id="3" name="Picture 3"/>
+                  <wp:cNvGraphicFramePr>
+                    <a:graphicFrameLocks noChangeAspect="1"/>
+                  </wp:cNvGraphicFramePr>
+                  <a:graphic>
+                    <a:graphicData uri="http://schemas.openxmlformats.org/drawingml/2006/picture">
+                      <pic:pic>
+                        <pic:nvPicPr>
+                          <pic:cNvPr id="0" name="linux.png"/>
+                          <pic:cNvPicPr/>
+                        </pic:nvPicPr>
+                        <pic:blipFill>
+                          <a:blip r:embed="rId11"/>
+                          <a:stretch>
+                            <a:fillRect/>
+                          </a:stretch>
+                        </pic:blipFill>
+                        <pic:spPr>
+                          <a:xfrm>
+                            <a:off x="0" y="0"/>
+                            <a:ext cx="182880" cy="182880"/>
+                          </a:xfrm>
+                          <a:prstGeom prst="rect"/>
+                        </pic:spPr>
+                      </pic:pic>
+                    </a:graphicData>
+                  </a:graphic>
+                </wp:inline>
+              </w:drawing>
+            </w:r>
+            <w:r>
+              <w:t xml:space="preserve"> </w:t>
+            </w:r>
+            <w:r>
+              <w:rPr>
+                <w:rFonts w:ascii="Aptos" w:hAnsi="Aptos"/>
+                <w:b/>
+                <w:color w:val="253044"/>
+                <w:sz w:val="17"/>
+              </w:rPr>
+              <w:t>Cybersecurity</w:t>
+            </w:r>
+          </w:p>
+          <w:p>
+            <w:r>
+              <w:drawing>
+                <wp:inline xmlns:a="http://schemas.openxmlformats.org/drawingml/2006/main" xmlns:pic="http://schemas.openxmlformats.org/drawingml/2006/picture">
+                  <wp:extent cx="182880" cy="182880"/>
+                  <wp:docPr id="4" name="Picture 4"/>
+                  <wp:cNvGraphicFramePr>
+                    <a:graphicFrameLocks noChangeAspect="1"/>
+                  </wp:cNvGraphicFramePr>
+                  <a:graphic>
+                    <a:graphicData uri="http://schemas.openxmlformats.org/drawingml/2006/picture">
+                      <pic:pic>
+                        <pic:nvPicPr>
+                          <pic:cNvPr id="0" name="terraform.png"/>
+                          <pic:cNvPicPr/>
+                        </pic:nvPicPr>
+                        <pic:blipFill>
+                          <a:blip r:embed="rId12"/>
+                          <a:stretch>
+                            <a:fillRect/>
+                          </a:stretch>
+                        </pic:blipFill>
+                        <pic:spPr>
+                          <a:xfrm>
+                            <a:off x="0" y="0"/>
+                            <a:ext cx="182880" cy="182880"/>
+                          </a:xfrm>
+                          <a:prstGeom prst="rect"/>
+                        </pic:spPr>
+                      </pic:pic>
+                    </a:graphicData>
+                  </a:graphic>
+                </wp:inline>
+              </w:drawing>
+            </w:r>
+            <w:r>
+              <w:t xml:space="preserve"> </w:t>
+            </w:r>
+            <w:r>
+              <w:rPr>
+                <w:rFonts w:ascii="Aptos" w:hAnsi="Aptos"/>
+                <w:b/>
+                <w:color w:val="253044"/>
+                <w:sz w:val="17"/>
+              </w:rPr>
+              <w:t>DevOps</w:t>
+            </w:r>
+          </w:p>
+        </w:tc>
+      </w:tr>
+    </w:tbl>
     <w:p>
       <w:pPr>
-        <w:spacing w:before="0" w:after="7" w:line="240" w:lineRule="auto"/>
-        <w:jc w:val="center"/>
+        <w:spacing w:before="260" w:after="140"/>
       </w:pPr>
       <w:r>
         <w:rPr>
-          <w:rFonts w:ascii="Arial" w:hAnsi="Arial"/>
+          <w:rFonts w:ascii="Aptos" w:hAnsi="Aptos"/>
           <w:b/>
-          <w:color w:val="1A73E8"/>
-          <w:sz w:val="31"/>
+          <w:color w:val="202124"/>
+          <w:sz w:val="21"/>
         </w:rPr>
-        <w:t>HARIHARAN J</w:t>
+        <w:t>PROFESSIONAL SUMMARY</w:t>
+      </w:r>
+    </w:p>
+    <w:tbl>
+      <w:tblPr>
+        <w:tblW w:type="auto" w:w="0"/>
+        <w:jc w:val="center"/>
+        <w:tblLayout w:type="autofit"/>
+        <w:tblLook w:firstColumn="1" w:firstRow="1" w:lastColumn="0" w:lastRow="0" w:noHBand="0" w:noVBand="1" w:val="04A0"/>
+      </w:tblPr>
+      <w:tblGrid>
+        <w:gridCol w:w="10800"/>
+      </w:tblGrid>
+      <w:tr>
+        <w:tc>
+          <w:tcPr>
+            <w:tcW w:type="dxa" w:w="10800"/>
+            <w:vAlign w:val="top"/>
+            <w:shd w:fill="FAFDFF"/>
+            <w:tcBorders>
+              <w:top w:val="single" w:sz="8" w:space="0" w:color="DCE6F2"/>
+              <w:left w:val="single" w:sz="8" w:space="0" w:color="DCE6F2"/>
+              <w:bottom w:val="single" w:sz="8" w:space="0" w:color="DCE6F2"/>
+              <w:right w:val="single" w:sz="8" w:space="0" w:color="DCE6F2"/>
+            </w:tcBorders>
+          </w:tcPr>
+          <w:p>
+            <w:pPr>
+              <w:spacing w:after="40"/>
+            </w:pPr>
+            <w:r>
+              <w:rPr>
+                <w:rFonts w:ascii="Aptos" w:hAnsi="Aptos"/>
+                <w:b w:val="0"/>
+                <w:color w:val="3C4043"/>
+                <w:sz w:val="18"/>
+              </w:rPr>
+              <w:t>Cloud engineering fresher with hands-on AWS and Google Cloud experience across IAM, VPC, Route 53, Cloud DNS, HA VPN, database migration, load balancing, Docker, Kubernetes, Linux, Terraform, and security-aware infrastructure. Strong cybersecurity engineering foundation with backend API experience in Python, FastAPI, REST APIs, secure authentication, and automation.</w:t>
+            </w:r>
+          </w:p>
+        </w:tc>
+      </w:tr>
+    </w:tbl>
+    <w:p>
+      <w:pPr>
+        <w:spacing w:before="260" w:after="140"/>
+      </w:pPr>
+      <w:r>
+        <w:rPr>
+          <w:rFonts w:ascii="Aptos" w:hAnsi="Aptos"/>
+          <w:b/>
+          <w:color w:val="202124"/>
+          <w:sz w:val="21"/>
+        </w:rPr>
+        <w:t>CORE TECHNOLOGY STACK</w:t>
+      </w:r>
+    </w:p>
+    <w:tbl>
+      <w:tblPr>
+        <w:tblW w:type="auto" w:w="0"/>
+        <w:jc w:val="center"/>
+        <w:tblLayout w:type="autofit"/>
+        <w:tblLook w:firstColumn="1" w:firstRow="1" w:lastColumn="0" w:lastRow="0" w:noHBand="0" w:noVBand="1" w:val="04A0"/>
+      </w:tblPr>
+      <w:tblGrid>
+        <w:gridCol w:w="2700"/>
+        <w:gridCol w:w="2700"/>
+        <w:gridCol w:w="2700"/>
+        <w:gridCol w:w="2700"/>
+      </w:tblGrid>
+      <w:tr>
+        <w:tc>
+          <w:tcPr>
+            <w:tcW w:type="dxa" w:w="2700"/>
+            <w:vAlign w:val="top"/>
+            <w:shd w:fill="FFFFFF"/>
+            <w:tcBorders>
+              <w:top w:val="single" w:sz="8" w:space="0" w:color="DCE6F2"/>
+              <w:left w:val="single" w:sz="8" w:space="0" w:color="DCE6F2"/>
+              <w:bottom w:val="single" w:sz="8" w:space="0" w:color="DCE6F2"/>
+              <w:right w:val="single" w:sz="8" w:space="0" w:color="DCE6F2"/>
+            </w:tcBorders>
+          </w:tcPr>
+          <w:p>
+            <w:pPr>
+              <w:spacing w:after="40"/>
+            </w:pPr>
+            <w:r>
+              <w:drawing>
+                <wp:inline xmlns:a="http://schemas.openxmlformats.org/drawingml/2006/main" xmlns:pic="http://schemas.openxmlformats.org/drawingml/2006/picture">
+                  <wp:extent cx="182880" cy="182880"/>
+                  <wp:docPr id="5" name="Picture 5"/>
+                  <wp:cNvGraphicFramePr>
+                    <a:graphicFrameLocks noChangeAspect="1"/>
+                  </wp:cNvGraphicFramePr>
+                  <a:graphic>
+                    <a:graphicData uri="http://schemas.openxmlformats.org/drawingml/2006/picture">
+                      <pic:pic>
+                        <pic:nvPicPr>
+                          <pic:cNvPr id="0" name="googlecloud.png"/>
+                          <pic:cNvPicPr/>
+                        </pic:nvPicPr>
+                        <pic:blipFill>
+                          <a:blip r:embed="rId10"/>
+                          <a:stretch>
+                            <a:fillRect/>
+                          </a:stretch>
+                        </pic:blipFill>
+                        <pic:spPr>
+                          <a:xfrm>
+                            <a:off x="0" y="0"/>
+                            <a:ext cx="182880" cy="182880"/>
+                          </a:xfrm>
+                          <a:prstGeom prst="rect"/>
+                        </pic:spPr>
+                      </pic:pic>
+                    </a:graphicData>
+                  </a:graphic>
+                </wp:inline>
+              </w:drawing>
+            </w:r>
+            <w:r>
+              <w:t xml:space="preserve"> </w:t>
+            </w:r>
+            <w:r>
+              <w:rPr>
+                <w:rFonts w:ascii="Aptos" w:hAnsi="Aptos"/>
+                <w:b/>
+                <w:color w:val="253044"/>
+                <w:sz w:val="17"/>
+              </w:rPr>
+              <w:t>Google Cloud</w:t>
+            </w:r>
+          </w:p>
+        </w:tc>
+        <w:tc>
+          <w:tcPr>
+            <w:tcW w:type="dxa" w:w="2700"/>
+            <w:vAlign w:val="top"/>
+            <w:shd w:fill="FFFFFF"/>
+            <w:tcBorders>
+              <w:top w:val="single" w:sz="8" w:space="0" w:color="DCE6F2"/>
+              <w:left w:val="single" w:sz="8" w:space="0" w:color="DCE6F2"/>
+              <w:bottom w:val="single" w:sz="8" w:space="0" w:color="DCE6F2"/>
+              <w:right w:val="single" w:sz="8" w:space="0" w:color="DCE6F2"/>
+            </w:tcBorders>
+          </w:tcPr>
+          <w:p>
+            <w:pPr>
+              <w:spacing w:after="40"/>
+            </w:pPr>
+            <w:r>
+              <w:drawing>
+                <wp:inline xmlns:a="http://schemas.openxmlformats.org/drawingml/2006/main" xmlns:pic="http://schemas.openxmlformats.org/drawingml/2006/picture">
+                  <wp:extent cx="182880" cy="182880"/>
+                  <wp:docPr id="6" name="Picture 6"/>
+                  <wp:cNvGraphicFramePr>
+                    <a:graphicFrameLocks noChangeAspect="1"/>
+                  </wp:cNvGraphicFramePr>
+                  <a:graphic>
+                    <a:graphicData uri="http://schemas.openxmlformats.org/drawingml/2006/picture">
+                      <pic:pic>
+                        <pic:nvPicPr>
+                          <pic:cNvPr id="0" name="aws.png"/>
+                          <pic:cNvPicPr/>
+                        </pic:nvPicPr>
+                        <pic:blipFill>
+                          <a:blip r:embed="rId9"/>
+                          <a:stretch>
+                            <a:fillRect/>
+                          </a:stretch>
+                        </pic:blipFill>
+                        <pic:spPr>
+                          <a:xfrm>
+                            <a:off x="0" y="0"/>
+                            <a:ext cx="182880" cy="182880"/>
+                          </a:xfrm>
+                          <a:prstGeom prst="rect"/>
+                        </pic:spPr>
+                      </pic:pic>
+                    </a:graphicData>
+                  </a:graphic>
+                </wp:inline>
+              </w:drawing>
+            </w:r>
+            <w:r>
+              <w:t xml:space="preserve"> </w:t>
+            </w:r>
+            <w:r>
+              <w:rPr>
+                <w:rFonts w:ascii="Aptos" w:hAnsi="Aptos"/>
+                <w:b/>
+                <w:color w:val="253044"/>
+                <w:sz w:val="17"/>
+              </w:rPr>
+              <w:t>AWS</w:t>
+            </w:r>
+          </w:p>
+        </w:tc>
+        <w:tc>
+          <w:tcPr>
+            <w:tcW w:type="dxa" w:w="2700"/>
+            <w:vAlign w:val="top"/>
+            <w:shd w:fill="FFFFFF"/>
+            <w:tcBorders>
+              <w:top w:val="single" w:sz="8" w:space="0" w:color="DCE6F2"/>
+              <w:left w:val="single" w:sz="8" w:space="0" w:color="DCE6F2"/>
+              <w:bottom w:val="single" w:sz="8" w:space="0" w:color="DCE6F2"/>
+              <w:right w:val="single" w:sz="8" w:space="0" w:color="DCE6F2"/>
+            </w:tcBorders>
+          </w:tcPr>
+          <w:p>
+            <w:pPr>
+              <w:spacing w:after="40"/>
+            </w:pPr>
+            <w:r>
+              <w:drawing>
+                <wp:inline xmlns:a="http://schemas.openxmlformats.org/drawingml/2006/main" xmlns:pic="http://schemas.openxmlformats.org/drawingml/2006/picture">
+                  <wp:extent cx="182880" cy="182880"/>
+                  <wp:docPr id="7" name="Picture 7"/>
+                  <wp:cNvGraphicFramePr>
+                    <a:graphicFrameLocks noChangeAspect="1"/>
+                  </wp:cNvGraphicFramePr>
+                  <a:graphic>
+                    <a:graphicData uri="http://schemas.openxmlformats.org/drawingml/2006/picture">
+                      <pic:pic>
+                        <pic:nvPicPr>
+                          <pic:cNvPr id="0" name="docker.png"/>
+                          <pic:cNvPicPr/>
+                        </pic:nvPicPr>
+                        <pic:blipFill>
+                          <a:blip r:embed="rId13"/>
+                          <a:stretch>
+                            <a:fillRect/>
+                          </a:stretch>
+                        </pic:blipFill>
+                        <pic:spPr>
+                          <a:xfrm>
+                            <a:off x="0" y="0"/>
+                            <a:ext cx="182880" cy="182880"/>
+                          </a:xfrm>
+                          <a:prstGeom prst="rect"/>
+                        </pic:spPr>
+                      </pic:pic>
+                    </a:graphicData>
+                  </a:graphic>
+                </wp:inline>
+              </w:drawing>
+            </w:r>
+            <w:r>
+              <w:t xml:space="preserve"> </w:t>
+            </w:r>
+            <w:r>
+              <w:rPr>
+                <w:rFonts w:ascii="Aptos" w:hAnsi="Aptos"/>
+                <w:b/>
+                <w:color w:val="253044"/>
+                <w:sz w:val="17"/>
+              </w:rPr>
+              <w:t>Docker</w:t>
+            </w:r>
+          </w:p>
+        </w:tc>
+        <w:tc>
+          <w:tcPr>
+            <w:tcW w:type="dxa" w:w="2700"/>
+            <w:vAlign w:val="top"/>
+            <w:shd w:fill="FFFFFF"/>
+            <w:tcBorders>
+              <w:top w:val="single" w:sz="8" w:space="0" w:color="DCE6F2"/>
+              <w:left w:val="single" w:sz="8" w:space="0" w:color="DCE6F2"/>
+              <w:bottom w:val="single" w:sz="8" w:space="0" w:color="DCE6F2"/>
+              <w:right w:val="single" w:sz="8" w:space="0" w:color="DCE6F2"/>
+            </w:tcBorders>
+          </w:tcPr>
+          <w:p>
+            <w:pPr>
+              <w:spacing w:after="40"/>
+            </w:pPr>
+            <w:r>
+              <w:drawing>
+                <wp:inline xmlns:a="http://schemas.openxmlformats.org/drawingml/2006/main" xmlns:pic="http://schemas.openxmlformats.org/drawingml/2006/picture">
+                  <wp:extent cx="182880" cy="182880"/>
+                  <wp:docPr id="8" name="Picture 8"/>
+                  <wp:cNvGraphicFramePr>
+                    <a:graphicFrameLocks noChangeAspect="1"/>
+                  </wp:cNvGraphicFramePr>
+                  <a:graphic>
+                    <a:graphicData uri="http://schemas.openxmlformats.org/drawingml/2006/picture">
+                      <pic:pic>
+                        <pic:nvPicPr>
+                          <pic:cNvPr id="0" name="kubernetes.png"/>
+                          <pic:cNvPicPr/>
+                        </pic:nvPicPr>
+                        <pic:blipFill>
+                          <a:blip r:embed="rId14"/>
+                          <a:stretch>
+                            <a:fillRect/>
+                          </a:stretch>
+                        </pic:blipFill>
+                        <pic:spPr>
+                          <a:xfrm>
+                            <a:off x="0" y="0"/>
+                            <a:ext cx="182880" cy="182880"/>
+                          </a:xfrm>
+                          <a:prstGeom prst="rect"/>
+                        </pic:spPr>
+                      </pic:pic>
+                    </a:graphicData>
+                  </a:graphic>
+                </wp:inline>
+              </w:drawing>
+            </w:r>
+            <w:r>
+              <w:t xml:space="preserve"> </w:t>
+            </w:r>
+            <w:r>
+              <w:rPr>
+                <w:rFonts w:ascii="Aptos" w:hAnsi="Aptos"/>
+                <w:b/>
+                <w:color w:val="253044"/>
+                <w:sz w:val="17"/>
+              </w:rPr>
+              <w:t>Kubernetes</w:t>
+            </w:r>
+          </w:p>
+        </w:tc>
+      </w:tr>
+      <w:tr>
+        <w:tc>
+          <w:tcPr>
+            <w:tcW w:type="dxa" w:w="2700"/>
+            <w:vAlign w:val="top"/>
+            <w:shd w:fill="FFFFFF"/>
+            <w:tcBorders>
+              <w:top w:val="single" w:sz="8" w:space="0" w:color="DCE6F2"/>
+              <w:left w:val="single" w:sz="8" w:space="0" w:color="DCE6F2"/>
+              <w:bottom w:val="single" w:sz="8" w:space="0" w:color="DCE6F2"/>
+              <w:right w:val="single" w:sz="8" w:space="0" w:color="DCE6F2"/>
+            </w:tcBorders>
+          </w:tcPr>
+          <w:p>
+            <w:pPr>
+              <w:spacing w:after="40"/>
+            </w:pPr>
+            <w:r>
+              <w:drawing>
+                <wp:inline xmlns:a="http://schemas.openxmlformats.org/drawingml/2006/main" xmlns:pic="http://schemas.openxmlformats.org/drawingml/2006/picture">
+                  <wp:extent cx="182880" cy="182880"/>
+                  <wp:docPr id="9" name="Picture 9"/>
+                  <wp:cNvGraphicFramePr>
+                    <a:graphicFrameLocks noChangeAspect="1"/>
+                  </wp:cNvGraphicFramePr>
+                  <a:graphic>
+                    <a:graphicData uri="http://schemas.openxmlformats.org/drawingml/2006/picture">
+                      <pic:pic>
+                        <pic:nvPicPr>
+                          <pic:cNvPr id="0" name="terraform.png"/>
+                          <pic:cNvPicPr/>
+                        </pic:nvPicPr>
+                        <pic:blipFill>
+                          <a:blip r:embed="rId12"/>
+                          <a:stretch>
+                            <a:fillRect/>
+                          </a:stretch>
+                        </pic:blipFill>
+                        <pic:spPr>
+                          <a:xfrm>
+                            <a:off x="0" y="0"/>
+                            <a:ext cx="182880" cy="182880"/>
+                          </a:xfrm>
+                          <a:prstGeom prst="rect"/>
+                        </pic:spPr>
+                      </pic:pic>
+                    </a:graphicData>
+                  </a:graphic>
+                </wp:inline>
+              </w:drawing>
+            </w:r>
+            <w:r>
+              <w:t xml:space="preserve"> </w:t>
+            </w:r>
+            <w:r>
+              <w:rPr>
+                <w:rFonts w:ascii="Aptos" w:hAnsi="Aptos"/>
+                <w:b/>
+                <w:color w:val="253044"/>
+                <w:sz w:val="17"/>
+              </w:rPr>
+              <w:t>Terraform</w:t>
+            </w:r>
+          </w:p>
+        </w:tc>
+        <w:tc>
+          <w:tcPr>
+            <w:tcW w:type="dxa" w:w="2700"/>
+            <w:vAlign w:val="top"/>
+            <w:shd w:fill="FFFFFF"/>
+            <w:tcBorders>
+              <w:top w:val="single" w:sz="8" w:space="0" w:color="DCE6F2"/>
+              <w:left w:val="single" w:sz="8" w:space="0" w:color="DCE6F2"/>
+              <w:bottom w:val="single" w:sz="8" w:space="0" w:color="DCE6F2"/>
+              <w:right w:val="single" w:sz="8" w:space="0" w:color="DCE6F2"/>
+            </w:tcBorders>
+          </w:tcPr>
+          <w:p>
+            <w:pPr>
+              <w:spacing w:after="40"/>
+            </w:pPr>
+            <w:r>
+              <w:drawing>
+                <wp:inline xmlns:a="http://schemas.openxmlformats.org/drawingml/2006/main" xmlns:pic="http://schemas.openxmlformats.org/drawingml/2006/picture">
+                  <wp:extent cx="182880" cy="182880"/>
+                  <wp:docPr id="10" name="Picture 10"/>
+                  <wp:cNvGraphicFramePr>
+                    <a:graphicFrameLocks noChangeAspect="1"/>
+                  </wp:cNvGraphicFramePr>
+                  <a:graphic>
+                    <a:graphicData uri="http://schemas.openxmlformats.org/drawingml/2006/picture">
+                      <pic:pic>
+                        <pic:nvPicPr>
+                          <pic:cNvPr id="0" name="linux.png"/>
+                          <pic:cNvPicPr/>
+                        </pic:nvPicPr>
+                        <pic:blipFill>
+                          <a:blip r:embed="rId11"/>
+                          <a:stretch>
+                            <a:fillRect/>
+                          </a:stretch>
+                        </pic:blipFill>
+                        <pic:spPr>
+                          <a:xfrm>
+                            <a:off x="0" y="0"/>
+                            <a:ext cx="182880" cy="182880"/>
+                          </a:xfrm>
+                          <a:prstGeom prst="rect"/>
+                        </pic:spPr>
+                      </pic:pic>
+                    </a:graphicData>
+                  </a:graphic>
+                </wp:inline>
+              </w:drawing>
+            </w:r>
+            <w:r>
+              <w:t xml:space="preserve"> </w:t>
+            </w:r>
+            <w:r>
+              <w:rPr>
+                <w:rFonts w:ascii="Aptos" w:hAnsi="Aptos"/>
+                <w:b/>
+                <w:color w:val="253044"/>
+                <w:sz w:val="17"/>
+              </w:rPr>
+              <w:t>Linux</w:t>
+            </w:r>
+          </w:p>
+        </w:tc>
+        <w:tc>
+          <w:tcPr>
+            <w:tcW w:type="dxa" w:w="2700"/>
+            <w:vAlign w:val="top"/>
+            <w:shd w:fill="FFFFFF"/>
+            <w:tcBorders>
+              <w:top w:val="single" w:sz="8" w:space="0" w:color="DCE6F2"/>
+              <w:left w:val="single" w:sz="8" w:space="0" w:color="DCE6F2"/>
+              <w:bottom w:val="single" w:sz="8" w:space="0" w:color="DCE6F2"/>
+              <w:right w:val="single" w:sz="8" w:space="0" w:color="DCE6F2"/>
+            </w:tcBorders>
+          </w:tcPr>
+          <w:p>
+            <w:pPr>
+              <w:spacing w:after="40"/>
+            </w:pPr>
+            <w:r>
+              <w:drawing>
+                <wp:inline xmlns:a="http://schemas.openxmlformats.org/drawingml/2006/main" xmlns:pic="http://schemas.openxmlformats.org/drawingml/2006/picture">
+                  <wp:extent cx="182880" cy="182880"/>
+                  <wp:docPr id="11" name="Picture 11"/>
+                  <wp:cNvGraphicFramePr>
+                    <a:graphicFrameLocks noChangeAspect="1"/>
+                  </wp:cNvGraphicFramePr>
+                  <a:graphic>
+                    <a:graphicData uri="http://schemas.openxmlformats.org/drawingml/2006/picture">
+                      <pic:pic>
+                        <pic:nvPicPr>
+                          <pic:cNvPr id="0" name="git.png"/>
+                          <pic:cNvPicPr/>
+                        </pic:nvPicPr>
+                        <pic:blipFill>
+                          <a:blip r:embed="rId15"/>
+                          <a:stretch>
+                            <a:fillRect/>
+                          </a:stretch>
+                        </pic:blipFill>
+                        <pic:spPr>
+                          <a:xfrm>
+                            <a:off x="0" y="0"/>
+                            <a:ext cx="182880" cy="182880"/>
+                          </a:xfrm>
+                          <a:prstGeom prst="rect"/>
+                        </pic:spPr>
+                      </pic:pic>
+                    </a:graphicData>
+                  </a:graphic>
+                </wp:inline>
+              </w:drawing>
+            </w:r>
+            <w:r>
+              <w:t xml:space="preserve"> </w:t>
+            </w:r>
+            <w:r>
+              <w:rPr>
+                <w:rFonts w:ascii="Aptos" w:hAnsi="Aptos"/>
+                <w:b/>
+                <w:color w:val="253044"/>
+                <w:sz w:val="17"/>
+              </w:rPr>
+              <w:t>Git</w:t>
+            </w:r>
+          </w:p>
+        </w:tc>
+        <w:tc>
+          <w:tcPr>
+            <w:tcW w:type="dxa" w:w="2700"/>
+            <w:vAlign w:val="top"/>
+            <w:shd w:fill="FFFFFF"/>
+            <w:tcBorders>
+              <w:top w:val="single" w:sz="8" w:space="0" w:color="DCE6F2"/>
+              <w:left w:val="single" w:sz="8" w:space="0" w:color="DCE6F2"/>
+              <w:bottom w:val="single" w:sz="8" w:space="0" w:color="DCE6F2"/>
+              <w:right w:val="single" w:sz="8" w:space="0" w:color="DCE6F2"/>
+            </w:tcBorders>
+          </w:tcPr>
+          <w:p>
+            <w:pPr>
+              <w:spacing w:after="40"/>
+            </w:pPr>
+            <w:r>
+              <w:drawing>
+                <wp:inline xmlns:a="http://schemas.openxmlformats.org/drawingml/2006/main" xmlns:pic="http://schemas.openxmlformats.org/drawingml/2006/picture">
+                  <wp:extent cx="182880" cy="182880"/>
+                  <wp:docPr id="12" name="Picture 12"/>
+                  <wp:cNvGraphicFramePr>
+                    <a:graphicFrameLocks noChangeAspect="1"/>
+                  </wp:cNvGraphicFramePr>
+                  <a:graphic>
+                    <a:graphicData uri="http://schemas.openxmlformats.org/drawingml/2006/picture">
+                      <pic:pic>
+                        <pic:nvPicPr>
+                          <pic:cNvPr id="0" name="python.png"/>
+                          <pic:cNvPicPr/>
+                        </pic:nvPicPr>
+                        <pic:blipFill>
+                          <a:blip r:embed="rId16"/>
+                          <a:stretch>
+                            <a:fillRect/>
+                          </a:stretch>
+                        </pic:blipFill>
+                        <pic:spPr>
+                          <a:xfrm>
+                            <a:off x="0" y="0"/>
+                            <a:ext cx="182880" cy="182880"/>
+                          </a:xfrm>
+                          <a:prstGeom prst="rect"/>
+                        </pic:spPr>
+                      </pic:pic>
+                    </a:graphicData>
+                  </a:graphic>
+                </wp:inline>
+              </w:drawing>
+            </w:r>
+            <w:r>
+              <w:t xml:space="preserve"> </w:t>
+            </w:r>
+            <w:r>
+              <w:rPr>
+                <w:rFonts w:ascii="Aptos" w:hAnsi="Aptos"/>
+                <w:b/>
+                <w:color w:val="253044"/>
+                <w:sz w:val="17"/>
+              </w:rPr>
+              <w:t>Python</w:t>
+            </w:r>
+          </w:p>
+        </w:tc>
+      </w:tr>
+      <w:tr>
+        <w:tc>
+          <w:tcPr>
+            <w:tcW w:type="dxa" w:w="2700"/>
+            <w:vAlign w:val="top"/>
+            <w:shd w:fill="FFFFFF"/>
+            <w:tcBorders>
+              <w:top w:val="single" w:sz="8" w:space="0" w:color="DCE6F2"/>
+              <w:left w:val="single" w:sz="8" w:space="0" w:color="DCE6F2"/>
+              <w:bottom w:val="single" w:sz="8" w:space="0" w:color="DCE6F2"/>
+              <w:right w:val="single" w:sz="8" w:space="0" w:color="DCE6F2"/>
+            </w:tcBorders>
+          </w:tcPr>
+          <w:p>
+            <w:pPr>
+              <w:spacing w:after="40"/>
+            </w:pPr>
+            <w:r>
+              <w:drawing>
+                <wp:inline xmlns:a="http://schemas.openxmlformats.org/drawingml/2006/main" xmlns:pic="http://schemas.openxmlformats.org/drawingml/2006/picture">
+                  <wp:extent cx="182880" cy="182880"/>
+                  <wp:docPr id="13" name="Picture 13"/>
+                  <wp:cNvGraphicFramePr>
+                    <a:graphicFrameLocks noChangeAspect="1"/>
+                  </wp:cNvGraphicFramePr>
+                  <a:graphic>
+                    <a:graphicData uri="http://schemas.openxmlformats.org/drawingml/2006/picture">
+                      <pic:pic>
+                        <pic:nvPicPr>
+                          <pic:cNvPr id="0" name="java.png"/>
+                          <pic:cNvPicPr/>
+                        </pic:nvPicPr>
+                        <pic:blipFill>
+                          <a:blip r:embed="rId17"/>
+                          <a:stretch>
+                            <a:fillRect/>
+                          </a:stretch>
+                        </pic:blipFill>
+                        <pic:spPr>
+                          <a:xfrm>
+                            <a:off x="0" y="0"/>
+                            <a:ext cx="182880" cy="182880"/>
+                          </a:xfrm>
+                          <a:prstGeom prst="rect"/>
+                        </pic:spPr>
+                      </pic:pic>
+                    </a:graphicData>
+                  </a:graphic>
+                </wp:inline>
+              </w:drawing>
+            </w:r>
+            <w:r>
+              <w:t xml:space="preserve"> </w:t>
+            </w:r>
+            <w:r>
+              <w:rPr>
+                <w:rFonts w:ascii="Aptos" w:hAnsi="Aptos"/>
+                <w:b/>
+                <w:color w:val="253044"/>
+                <w:sz w:val="17"/>
+              </w:rPr>
+              <w:t>Java</w:t>
+            </w:r>
+          </w:p>
+        </w:tc>
+        <w:tc>
+          <w:tcPr>
+            <w:tcW w:type="dxa" w:w="2700"/>
+            <w:vAlign w:val="top"/>
+            <w:shd w:fill="FFFFFF"/>
+            <w:tcBorders>
+              <w:top w:val="single" w:sz="8" w:space="0" w:color="DCE6F2"/>
+              <w:left w:val="single" w:sz="8" w:space="0" w:color="DCE6F2"/>
+              <w:bottom w:val="single" w:sz="8" w:space="0" w:color="DCE6F2"/>
+              <w:right w:val="single" w:sz="8" w:space="0" w:color="DCE6F2"/>
+            </w:tcBorders>
+          </w:tcPr>
+          <w:p>
+            <w:pPr>
+              <w:spacing w:after="40"/>
+            </w:pPr>
+            <w:r>
+              <w:drawing>
+                <wp:inline xmlns:a="http://schemas.openxmlformats.org/drawingml/2006/main" xmlns:pic="http://schemas.openxmlformats.org/drawingml/2006/picture">
+                  <wp:extent cx="182880" cy="182880"/>
+                  <wp:docPr id="14" name="Picture 14"/>
+                  <wp:cNvGraphicFramePr>
+                    <a:graphicFrameLocks noChangeAspect="1"/>
+                  </wp:cNvGraphicFramePr>
+                  <a:graphic>
+                    <a:graphicData uri="http://schemas.openxmlformats.org/drawingml/2006/picture">
+                      <pic:pic>
+                        <pic:nvPicPr>
+                          <pic:cNvPr id="0" name="postgresql.png"/>
+                          <pic:cNvPicPr/>
+                        </pic:nvPicPr>
+                        <pic:blipFill>
+                          <a:blip r:embed="rId18"/>
+                          <a:stretch>
+                            <a:fillRect/>
+                          </a:stretch>
+                        </pic:blipFill>
+                        <pic:spPr>
+                          <a:xfrm>
+                            <a:off x="0" y="0"/>
+                            <a:ext cx="182880" cy="182880"/>
+                          </a:xfrm>
+                          <a:prstGeom prst="rect"/>
+                        </pic:spPr>
+                      </pic:pic>
+                    </a:graphicData>
+                  </a:graphic>
+                </wp:inline>
+              </w:drawing>
+            </w:r>
+            <w:r>
+              <w:t xml:space="preserve"> </w:t>
+            </w:r>
+            <w:r>
+              <w:rPr>
+                <w:rFonts w:ascii="Aptos" w:hAnsi="Aptos"/>
+                <w:b/>
+                <w:color w:val="253044"/>
+                <w:sz w:val="17"/>
+              </w:rPr>
+              <w:t>PostgreSQL</w:t>
+            </w:r>
+          </w:p>
+        </w:tc>
+        <w:tc>
+          <w:tcPr>
+            <w:tcW w:type="dxa" w:w="2700"/>
+            <w:vAlign w:val="top"/>
+            <w:shd w:fill="FFFFFF"/>
+            <w:tcBorders>
+              <w:top w:val="single" w:sz="8" w:space="0" w:color="DCE6F2"/>
+              <w:left w:val="single" w:sz="8" w:space="0" w:color="DCE6F2"/>
+              <w:bottom w:val="single" w:sz="8" w:space="0" w:color="DCE6F2"/>
+              <w:right w:val="single" w:sz="8" w:space="0" w:color="DCE6F2"/>
+            </w:tcBorders>
+          </w:tcPr>
+          <w:p>
+            <w:pPr>
+              <w:spacing w:after="40"/>
+            </w:pPr>
+            <w:r>
+              <w:drawing>
+                <wp:inline xmlns:a="http://schemas.openxmlformats.org/drawingml/2006/main" xmlns:pic="http://schemas.openxmlformats.org/drawingml/2006/picture">
+                  <wp:extent cx="182880" cy="182880"/>
+                  <wp:docPr id="15" name="Picture 15"/>
+                  <wp:cNvGraphicFramePr>
+                    <a:graphicFrameLocks noChangeAspect="1"/>
+                  </wp:cNvGraphicFramePr>
+                  <a:graphic>
+                    <a:graphicData uri="http://schemas.openxmlformats.org/drawingml/2006/picture">
+                      <pic:pic>
+                        <pic:nvPicPr>
+                          <pic:cNvPr id="0" name="fastapi.png"/>
+                          <pic:cNvPicPr/>
+                        </pic:nvPicPr>
+                        <pic:blipFill>
+                          <a:blip r:embed="rId19"/>
+                          <a:stretch>
+                            <a:fillRect/>
+                          </a:stretch>
+                        </pic:blipFill>
+                        <pic:spPr>
+                          <a:xfrm>
+                            <a:off x="0" y="0"/>
+                            <a:ext cx="182880" cy="182880"/>
+                          </a:xfrm>
+                          <a:prstGeom prst="rect"/>
+                        </pic:spPr>
+                      </pic:pic>
+                    </a:graphicData>
+                  </a:graphic>
+                </wp:inline>
+              </w:drawing>
+            </w:r>
+            <w:r>
+              <w:t xml:space="preserve"> </w:t>
+            </w:r>
+            <w:r>
+              <w:rPr>
+                <w:rFonts w:ascii="Aptos" w:hAnsi="Aptos"/>
+                <w:b/>
+                <w:color w:val="253044"/>
+                <w:sz w:val="17"/>
+              </w:rPr>
+              <w:t>FastAPI</w:t>
+            </w:r>
+          </w:p>
+        </w:tc>
+        <w:tc>
+          <w:tcPr>
+            <w:tcW w:type="dxa" w:w="2700"/>
+            <w:vAlign w:val="top"/>
+            <w:shd w:fill="FFFFFF"/>
+            <w:tcBorders>
+              <w:top w:val="single" w:sz="8" w:space="0" w:color="DCE6F2"/>
+              <w:left w:val="single" w:sz="8" w:space="0" w:color="DCE6F2"/>
+              <w:bottom w:val="single" w:sz="8" w:space="0" w:color="DCE6F2"/>
+              <w:right w:val="single" w:sz="8" w:space="0" w:color="DCE6F2"/>
+            </w:tcBorders>
+          </w:tcPr>
+          <w:p>
+            <w:pPr>
+              <w:spacing w:after="40"/>
+            </w:pPr>
+            <w:r>
+              <w:drawing>
+                <wp:inline xmlns:a="http://schemas.openxmlformats.org/drawingml/2006/main" xmlns:pic="http://schemas.openxmlformats.org/drawingml/2006/picture">
+                  <wp:extent cx="182880" cy="182880"/>
+                  <wp:docPr id="16" name="Picture 16"/>
+                  <wp:cNvGraphicFramePr>
+                    <a:graphicFrameLocks noChangeAspect="1"/>
+                  </wp:cNvGraphicFramePr>
+                  <a:graphic>
+                    <a:graphicData uri="http://schemas.openxmlformats.org/drawingml/2006/picture">
+                      <pic:pic>
+                        <pic:nvPicPr>
+                          <pic:cNvPr id="0" name="postman.png"/>
+                          <pic:cNvPicPr/>
+                        </pic:nvPicPr>
+                        <pic:blipFill>
+                          <a:blip r:embed="rId20"/>
+                          <a:stretch>
+                            <a:fillRect/>
+                          </a:stretch>
+                        </pic:blipFill>
+                        <pic:spPr>
+                          <a:xfrm>
+                            <a:off x="0" y="0"/>
+                            <a:ext cx="182880" cy="182880"/>
+                          </a:xfrm>
+                          <a:prstGeom prst="rect"/>
+                        </pic:spPr>
+                      </pic:pic>
+                    </a:graphicData>
+                  </a:graphic>
+                </wp:inline>
+              </w:drawing>
+            </w:r>
+            <w:r>
+              <w:t xml:space="preserve"> </w:t>
+            </w:r>
+            <w:r>
+              <w:rPr>
+                <w:rFonts w:ascii="Aptos" w:hAnsi="Aptos"/>
+                <w:b/>
+                <w:color w:val="253044"/>
+                <w:sz w:val="17"/>
+              </w:rPr>
+              <w:t>Postman</w:t>
+            </w:r>
+          </w:p>
+        </w:tc>
+      </w:tr>
+    </w:tbl>
+    <w:p>
+      <w:pPr>
+        <w:spacing w:before="260" w:after="140"/>
+      </w:pPr>
+      <w:r>
+        <w:rPr>
+          <w:rFonts w:ascii="Aptos" w:hAnsi="Aptos"/>
+          <w:b/>
+          <w:color w:val="202124"/>
+          <w:sz w:val="21"/>
+        </w:rPr>
+        <w:t>PROFESSIONAL EXPERIENCE</w:t>
+      </w:r>
+    </w:p>
+    <w:tbl>
+      <w:tblPr>
+        <w:tblW w:type="auto" w:w="0"/>
+        <w:jc w:val="center"/>
+        <w:tblLayout w:type="autofit"/>
+        <w:tblLook w:firstColumn="1" w:firstRow="1" w:lastColumn="0" w:lastRow="0" w:noHBand="0" w:noVBand="1" w:val="04A0"/>
+      </w:tblPr>
+      <w:tblGrid>
+        <w:gridCol w:w="10800"/>
+      </w:tblGrid>
+      <w:tr>
+        <w:tc>
+          <w:tcPr>
+            <w:tcW w:type="dxa" w:w="10800"/>
+            <w:vAlign w:val="top"/>
+            <w:shd w:fill="FFFFFF"/>
+            <w:tcBorders>
+              <w:top w:val="single" w:sz="8" w:space="0" w:color="DCE6F2"/>
+              <w:left w:val="single" w:sz="8" w:space="0" w:color="DCE6F2"/>
+              <w:bottom w:val="single" w:sz="8" w:space="0" w:color="DCE6F2"/>
+              <w:right w:val="single" w:sz="8" w:space="0" w:color="DCE6F2"/>
+            </w:tcBorders>
+          </w:tcPr>
+          <w:p>
+            <w:pPr>
+              <w:spacing w:after="40"/>
+            </w:pPr>
+            <w:r>
+              <w:drawing>
+                <wp:inline xmlns:a="http://schemas.openxmlformats.org/drawingml/2006/main" xmlns:pic="http://schemas.openxmlformats.org/drawingml/2006/picture">
+                  <wp:extent cx="201168" cy="201168"/>
+                  <wp:docPr id="17" name="Picture 17"/>
+                  <wp:cNvGraphicFramePr>
+                    <a:graphicFrameLocks noChangeAspect="1"/>
+                  </wp:cNvGraphicFramePr>
+                  <a:graphic>
+                    <a:graphicData uri="http://schemas.openxmlformats.org/drawingml/2006/picture">
+                      <pic:pic>
+                        <pic:nvPicPr>
+                          <pic:cNvPr id="0" name="googlecloud.png"/>
+                          <pic:cNvPicPr/>
+                        </pic:nvPicPr>
+                        <pic:blipFill>
+                          <a:blip r:embed="rId10"/>
+                          <a:stretch>
+                            <a:fillRect/>
+                          </a:stretch>
+                        </pic:blipFill>
+                        <pic:spPr>
+                          <a:xfrm>
+                            <a:off x="0" y="0"/>
+                            <a:ext cx="201168" cy="201168"/>
+                          </a:xfrm>
+                          <a:prstGeom prst="rect"/>
+                        </pic:spPr>
+                      </pic:pic>
+                    </a:graphicData>
+                  </a:graphic>
+                </wp:inline>
+              </w:drawing>
+            </w:r>
+            <w:r>
+              <w:t xml:space="preserve"> </w:t>
+            </w:r>
+            <w:r>
+              <w:rPr>
+                <w:rFonts w:ascii="Aptos" w:hAnsi="Aptos"/>
+                <w:b/>
+                <w:color w:val="202124"/>
+                <w:sz w:val="20"/>
+              </w:rPr>
+              <w:t>Cloud Engineer Intern</w:t>
+            </w:r>
+            <w:r>
+              <w:rPr>
+                <w:rFonts w:ascii="Aptos" w:hAnsi="Aptos"/>
+                <w:b/>
+                <w:color w:val="1A73E8"/>
+                <w:sz w:val="17"/>
+              </w:rPr>
+              <w:t xml:space="preserve">  |  GCP + GKE</w:t>
+            </w:r>
+          </w:p>
+          <w:p>
+            <w:r>
+              <w:rPr>
+                <w:rFonts w:ascii="Aptos" w:hAnsi="Aptos"/>
+                <w:b w:val="0"/>
+                <w:color w:val="5F6368"/>
+                <w:sz w:val="17"/>
+              </w:rPr>
+              <w:t>Cloud Ambassadors, Google Cloud Partner | Jan 2026 - Present</w:t>
+            </w:r>
+          </w:p>
+          <w:p>
+            <w:pPr>
+              <w:pStyle w:val="ListBullet"/>
+              <w:spacing w:after="50"/>
+              <w:ind w:left="259"/>
+            </w:pPr>
+            <w:r>
+              <w:rPr>
+                <w:rFonts w:ascii="Aptos" w:hAnsi="Aptos"/>
+                <w:b w:val="0"/>
+                <w:color w:val="3C4043"/>
+                <w:sz w:val="17"/>
+              </w:rPr>
+              <w:t>Provisioned Compute Engine, Cloud Storage, IAM roles, VPC networks, firewall rules, and secure access policies.</w:t>
+            </w:r>
+          </w:p>
+          <w:p>
+            <w:pPr>
+              <w:pStyle w:val="ListBullet"/>
+              <w:spacing w:after="50"/>
+              <w:ind w:left="259"/>
+            </w:pPr>
+            <w:r>
+              <w:rPr>
+                <w:rFonts w:ascii="Aptos" w:hAnsi="Aptos"/>
+                <w:b w:val="0"/>
+                <w:color w:val="3C4043"/>
+                <w:sz w:val="17"/>
+              </w:rPr>
+              <w:t>Supported AWS and GCP tasks across VPC, IAM, DNS, load balancing, VPN, migration workflows, and troubleshooting.</w:t>
+            </w:r>
+          </w:p>
+          <w:p>
+            <w:pPr>
+              <w:pStyle w:val="ListBullet"/>
+              <w:spacing w:after="50"/>
+              <w:ind w:left="259"/>
+            </w:pPr>
+            <w:r>
+              <w:rPr>
+                <w:rFonts w:ascii="Aptos" w:hAnsi="Aptos"/>
+                <w:b w:val="0"/>
+                <w:color w:val="3C4043"/>
+                <w:sz w:val="17"/>
+              </w:rPr>
+              <w:t>Configured Cloud DNS and Route 53 records, HTTPS load balancer validation, and SSL/TLS certificate workflows.</w:t>
+            </w:r>
+          </w:p>
+          <w:p>
+            <w:pPr>
+              <w:pStyle w:val="ListBullet"/>
+              <w:spacing w:after="50"/>
+              <w:ind w:left="259"/>
+            </w:pPr>
+            <w:r>
+              <w:rPr>
+                <w:rFonts w:ascii="Aptos" w:hAnsi="Aptos"/>
+                <w:b w:val="0"/>
+                <w:color w:val="3C4043"/>
+                <w:sz w:val="17"/>
+              </w:rPr>
+              <w:t>Practiced Docker, Kubernetes/GKE, Artifact Registry, Cloud Run, Linux, Git, Bash, and Terraform fundamentals.</w:t>
+            </w:r>
+          </w:p>
+        </w:tc>
+      </w:tr>
+    </w:tbl>
+    <w:tbl>
+      <w:tblPr>
+        <w:tblW w:type="auto" w:w="0"/>
+        <w:jc w:val="center"/>
+        <w:tblLayout w:type="autofit"/>
+        <w:tblLook w:firstColumn="1" w:firstRow="1" w:lastColumn="0" w:lastRow="0" w:noHBand="0" w:noVBand="1" w:val="04A0"/>
+      </w:tblPr>
+      <w:tblGrid>
+        <w:gridCol w:w="10800"/>
+      </w:tblGrid>
+      <w:tr>
+        <w:tc>
+          <w:tcPr>
+            <w:tcW w:type="dxa" w:w="10800"/>
+            <w:vAlign w:val="top"/>
+            <w:shd w:fill="FFFFFF"/>
+            <w:tcBorders>
+              <w:top w:val="single" w:sz="8" w:space="0" w:color="DCE6F2"/>
+              <w:left w:val="single" w:sz="8" w:space="0" w:color="DCE6F2"/>
+              <w:bottom w:val="single" w:sz="8" w:space="0" w:color="DCE6F2"/>
+              <w:right w:val="single" w:sz="8" w:space="0" w:color="DCE6F2"/>
+            </w:tcBorders>
+          </w:tcPr>
+          <w:p>
+            <w:pPr>
+              <w:spacing w:after="40"/>
+            </w:pPr>
+            <w:r>
+              <w:drawing>
+                <wp:inline xmlns:a="http://schemas.openxmlformats.org/drawingml/2006/main" xmlns:pic="http://schemas.openxmlformats.org/drawingml/2006/picture">
+                  <wp:extent cx="201168" cy="201168"/>
+                  <wp:docPr id="18" name="Picture 18"/>
+                  <wp:cNvGraphicFramePr>
+                    <a:graphicFrameLocks noChangeAspect="1"/>
+                  </wp:cNvGraphicFramePr>
+                  <a:graphic>
+                    <a:graphicData uri="http://schemas.openxmlformats.org/drawingml/2006/picture">
+                      <pic:pic>
+                        <pic:nvPicPr>
+                          <pic:cNvPr id="0" name="python.png"/>
+                          <pic:cNvPicPr/>
+                        </pic:nvPicPr>
+                        <pic:blipFill>
+                          <a:blip r:embed="rId16"/>
+                          <a:stretch>
+                            <a:fillRect/>
+                          </a:stretch>
+                        </pic:blipFill>
+                        <pic:spPr>
+                          <a:xfrm>
+                            <a:off x="0" y="0"/>
+                            <a:ext cx="201168" cy="201168"/>
+                          </a:xfrm>
+                          <a:prstGeom prst="rect"/>
+                        </pic:spPr>
+                      </pic:pic>
+                    </a:graphicData>
+                  </a:graphic>
+                </wp:inline>
+              </w:drawing>
+            </w:r>
+            <w:r>
+              <w:t xml:space="preserve"> </w:t>
+            </w:r>
+            <w:r>
+              <w:rPr>
+                <w:rFonts w:ascii="Aptos" w:hAnsi="Aptos"/>
+                <w:b/>
+                <w:color w:val="202124"/>
+                <w:sz w:val="20"/>
+              </w:rPr>
+              <w:t>Backend Developer</w:t>
+            </w:r>
+            <w:r>
+              <w:rPr>
+                <w:rFonts w:ascii="Aptos" w:hAnsi="Aptos"/>
+                <w:b/>
+                <w:color w:val="1A73E8"/>
+                <w:sz w:val="17"/>
+              </w:rPr>
+              <w:t xml:space="preserve">  |  APIs + Linux</w:t>
+            </w:r>
+          </w:p>
+          <w:p>
+            <w:r>
+              <w:rPr>
+                <w:rFonts w:ascii="Aptos" w:hAnsi="Aptos"/>
+                <w:b w:val="0"/>
+                <w:color w:val="5F6368"/>
+                <w:sz w:val="17"/>
+              </w:rPr>
+              <w:t>Chella Corporations | Jul 2025 - Dec 2025</w:t>
+            </w:r>
+          </w:p>
+          <w:p>
+            <w:pPr>
+              <w:pStyle w:val="ListBullet"/>
+              <w:spacing w:after="50"/>
+              <w:ind w:left="259"/>
+            </w:pPr>
+            <w:r>
+              <w:rPr>
+                <w:rFonts w:ascii="Aptos" w:hAnsi="Aptos"/>
+                <w:b w:val="0"/>
+                <w:color w:val="3C4043"/>
+                <w:sz w:val="17"/>
+              </w:rPr>
+              <w:t>Developed REST APIs using Python and FastAPI for an AI-driven medical platform.</w:t>
+            </w:r>
+          </w:p>
+          <w:p>
+            <w:pPr>
+              <w:pStyle w:val="ListBullet"/>
+              <w:spacing w:after="50"/>
+              <w:ind w:left="259"/>
+            </w:pPr>
+            <w:r>
+              <w:rPr>
+                <w:rFonts w:ascii="Aptos" w:hAnsi="Aptos"/>
+                <w:b w:val="0"/>
+                <w:color w:val="3C4043"/>
+                <w:sz w:val="17"/>
+              </w:rPr>
+              <w:t>Worked with secure authentication, service integration, database integration, debugging, and API automation.</w:t>
+            </w:r>
+          </w:p>
+          <w:p>
+            <w:pPr>
+              <w:pStyle w:val="ListBullet"/>
+              <w:spacing w:after="50"/>
+              <w:ind w:left="259"/>
+            </w:pPr>
+            <w:r>
+              <w:rPr>
+                <w:rFonts w:ascii="Aptos" w:hAnsi="Aptos"/>
+                <w:b w:val="0"/>
+                <w:color w:val="3C4043"/>
+                <w:sz w:val="17"/>
+              </w:rPr>
+              <w:t>Deployed and maintained backend services on Linux servers, strengthening cloud operations readiness.</w:t>
+            </w:r>
+          </w:p>
+        </w:tc>
+      </w:tr>
+    </w:tbl>
+    <w:tbl>
+      <w:tblPr>
+        <w:tblW w:type="auto" w:w="0"/>
+        <w:jc w:val="center"/>
+        <w:tblLayout w:type="autofit"/>
+        <w:tblLook w:firstColumn="1" w:firstRow="1" w:lastColumn="0" w:lastRow="0" w:noHBand="0" w:noVBand="1" w:val="04A0"/>
+      </w:tblPr>
+      <w:tblGrid>
+        <w:gridCol w:w="10800"/>
+      </w:tblGrid>
+      <w:tr>
+        <w:tc>
+          <w:tcPr>
+            <w:tcW w:type="dxa" w:w="10800"/>
+            <w:vAlign w:val="top"/>
+            <w:shd w:fill="FFFFFF"/>
+            <w:tcBorders>
+              <w:top w:val="single" w:sz="8" w:space="0" w:color="DCE6F2"/>
+              <w:left w:val="single" w:sz="8" w:space="0" w:color="DCE6F2"/>
+              <w:bottom w:val="single" w:sz="8" w:space="0" w:color="DCE6F2"/>
+              <w:right w:val="single" w:sz="8" w:space="0" w:color="DCE6F2"/>
+            </w:tcBorders>
+          </w:tcPr>
+          <w:p>
+            <w:pPr>
+              <w:spacing w:after="40"/>
+            </w:pPr>
+            <w:r>
+              <w:drawing>
+                <wp:inline xmlns:a="http://schemas.openxmlformats.org/drawingml/2006/main" xmlns:pic="http://schemas.openxmlformats.org/drawingml/2006/picture">
+                  <wp:extent cx="201168" cy="201168"/>
+                  <wp:docPr id="19" name="Picture 19"/>
+                  <wp:cNvGraphicFramePr>
+                    <a:graphicFrameLocks noChangeAspect="1"/>
+                  </wp:cNvGraphicFramePr>
+                  <a:graphic>
+                    <a:graphicData uri="http://schemas.openxmlformats.org/drawingml/2006/picture">
+                      <pic:pic>
+                        <pic:nvPicPr>
+                          <pic:cNvPr id="0" name="infosys.png"/>
+                          <pic:cNvPicPr/>
+                        </pic:nvPicPr>
+                        <pic:blipFill>
+                          <a:blip r:embed="rId21"/>
+                          <a:stretch>
+                            <a:fillRect/>
+                          </a:stretch>
+                        </pic:blipFill>
+                        <pic:spPr>
+                          <a:xfrm>
+                            <a:off x="0" y="0"/>
+                            <a:ext cx="201168" cy="201168"/>
+                          </a:xfrm>
+                          <a:prstGeom prst="rect"/>
+                        </pic:spPr>
+                      </pic:pic>
+                    </a:graphicData>
+                  </a:graphic>
+                </wp:inline>
+              </w:drawing>
+            </w:r>
+            <w:r>
+              <w:t xml:space="preserve"> </w:t>
+            </w:r>
+            <w:r>
+              <w:rPr>
+                <w:rFonts w:ascii="Aptos" w:hAnsi="Aptos"/>
+                <w:b/>
+                <w:color w:val="202124"/>
+                <w:sz w:val="20"/>
+              </w:rPr>
+              <w:t>AI Application Developer Intern</w:t>
+            </w:r>
+            <w:r>
+              <w:rPr>
+                <w:rFonts w:ascii="Aptos" w:hAnsi="Aptos"/>
+                <w:b/>
+                <w:color w:val="1A73E8"/>
+                <w:sz w:val="17"/>
+              </w:rPr>
+              <w:t xml:space="preserve">  |  RAG System</w:t>
+            </w:r>
+          </w:p>
+          <w:p>
+            <w:r>
+              <w:rPr>
+                <w:rFonts w:ascii="Aptos" w:hAnsi="Aptos"/>
+                <w:b w:val="0"/>
+                <w:color w:val="5F6368"/>
+                <w:sz w:val="17"/>
+              </w:rPr>
+              <w:t>Infosys Springboard | Sep 2025 - Nov 2025</w:t>
+            </w:r>
+          </w:p>
+          <w:p>
+            <w:pPr>
+              <w:pStyle w:val="ListBullet"/>
+              <w:spacing w:after="50"/>
+              <w:ind w:left="259"/>
+            </w:pPr>
+            <w:r>
+              <w:rPr>
+                <w:rFonts w:ascii="Aptos" w:hAnsi="Aptos"/>
+                <w:b w:val="0"/>
+                <w:color w:val="3C4043"/>
+                <w:sz w:val="17"/>
+              </w:rPr>
+              <w:t>Built a RAG-based compliance checker system for document retrieval, analysis, scoring, and automated evaluation.</w:t>
+            </w:r>
+          </w:p>
+          <w:p>
+            <w:pPr>
+              <w:pStyle w:val="ListBullet"/>
+              <w:spacing w:after="50"/>
+              <w:ind w:left="259"/>
+            </w:pPr>
+            <w:r>
+              <w:rPr>
+                <w:rFonts w:ascii="Aptos" w:hAnsi="Aptos"/>
+                <w:b w:val="0"/>
+                <w:color w:val="3C4043"/>
+                <w:sz w:val="17"/>
+              </w:rPr>
+              <w:t>Integrated GPT-based workflows to improve compliance review efficiency by 70%.</w:t>
+            </w:r>
+          </w:p>
+        </w:tc>
+      </w:tr>
+    </w:tbl>
+    <w:p>
+      <w:r>
+        <w:br w:type="page"/>
       </w:r>
     </w:p>
     <w:p>
       <w:pPr>
-        <w:spacing w:before="0" w:after="6" w:line="240" w:lineRule="auto"/>
-        <w:jc w:val="center"/>
+        <w:spacing w:before="260" w:after="140"/>
       </w:pPr>
       <w:r>
         <w:rPr>
-          <w:rFonts w:ascii="Arial" w:hAnsi="Arial"/>
-          <w:b w:val="0"/>
+          <w:rFonts w:ascii="Aptos" w:hAnsi="Aptos"/>
+          <w:b/>
           <w:color w:val="202124"/>
-          <w:sz w:val="16"/>
+          <w:sz w:val="21"/>
         </w:rPr>
-        <w:t>Madurai, Tamil Nadu, India | +91-9500963476 | jhariharancse@gmail.com</w:t>
+        <w:t>PROJECT HIGHLIGHTS</w:t>
       </w:r>
     </w:p>
+    <w:tbl>
+      <w:tblPr>
+        <w:tblW w:type="auto" w:w="0"/>
+        <w:jc w:val="center"/>
+        <w:tblLayout w:type="autofit"/>
+        <w:tblLook w:firstColumn="1" w:firstRow="1" w:lastColumn="0" w:lastRow="0" w:noHBand="0" w:noVBand="1" w:val="04A0"/>
+      </w:tblPr>
+      <w:tblGrid>
+        <w:gridCol w:w="10800"/>
+      </w:tblGrid>
+      <w:tr>
+        <w:tc>
+          <w:tcPr>
+            <w:tcW w:type="dxa" w:w="10800"/>
+            <w:vAlign w:val="top"/>
+            <w:shd w:fill="FFFFFF"/>
+            <w:tcBorders>
+              <w:top w:val="single" w:sz="8" w:space="0" w:color="DCE6F2"/>
+              <w:left w:val="single" w:sz="8" w:space="0" w:color="DCE6F2"/>
+              <w:bottom w:val="single" w:sz="8" w:space="0" w:color="DCE6F2"/>
+              <w:right w:val="single" w:sz="8" w:space="0" w:color="DCE6F2"/>
+            </w:tcBorders>
+          </w:tcPr>
+          <w:p>
+            <w:pPr>
+              <w:spacing w:after="40"/>
+            </w:pPr>
+            <w:r>
+              <w:drawing>
+                <wp:inline xmlns:a="http://schemas.openxmlformats.org/drawingml/2006/main" xmlns:pic="http://schemas.openxmlformats.org/drawingml/2006/picture">
+                  <wp:extent cx="182880" cy="182880"/>
+                  <wp:docPr id="20" name="Picture 20"/>
+                  <wp:cNvGraphicFramePr>
+                    <a:graphicFrameLocks noChangeAspect="1"/>
+                  </wp:cNvGraphicFramePr>
+                  <a:graphic>
+                    <a:graphicData uri="http://schemas.openxmlformats.org/drawingml/2006/picture">
+                      <pic:pic>
+                        <pic:nvPicPr>
+                          <pic:cNvPr id="0" name="aws.png"/>
+                          <pic:cNvPicPr/>
+                        </pic:nvPicPr>
+                        <pic:blipFill>
+                          <a:blip r:embed="rId9"/>
+                          <a:stretch>
+                            <a:fillRect/>
+                          </a:stretch>
+                        </pic:blipFill>
+                        <pic:spPr>
+                          <a:xfrm>
+                            <a:off x="0" y="0"/>
+                            <a:ext cx="182880" cy="182880"/>
+                          </a:xfrm>
+                          <a:prstGeom prst="rect"/>
+                        </pic:spPr>
+                      </pic:pic>
+                    </a:graphicData>
+                  </a:graphic>
+                </wp:inline>
+              </w:drawing>
+            </w:r>
+            <w:r>
+              <w:t xml:space="preserve"> </w:t>
+            </w:r>
+            <w:r>
+              <w:rPr>
+                <w:rFonts w:ascii="Aptos" w:hAnsi="Aptos"/>
+                <w:b/>
+                <w:color w:val="202124"/>
+                <w:sz w:val="19"/>
+              </w:rPr>
+              <w:t>AWS Route 53 to Google Cloud DNS Migration</w:t>
+            </w:r>
+          </w:p>
+          <w:p>
+            <w:r>
+              <w:rPr>
+                <w:rFonts w:ascii="Aptos" w:hAnsi="Aptos"/>
+                <w:b w:val="0"/>
+                <w:color w:val="3C4043"/>
+                <w:sz w:val="17"/>
+              </w:rPr>
+              <w:t>Documented zero-downtime domain migration for haridns.qzz.io with DNS inventory, Cloud DNS zone creation, record replication, NS cutover, validation, and rollback.</w:t>
+            </w:r>
+          </w:p>
+        </w:tc>
+      </w:tr>
+    </w:tbl>
+    <w:tbl>
+      <w:tblPr>
+        <w:tblW w:type="auto" w:w="0"/>
+        <w:jc w:val="center"/>
+        <w:tblLayout w:type="autofit"/>
+        <w:tblLook w:firstColumn="1" w:firstRow="1" w:lastColumn="0" w:lastRow="0" w:noHBand="0" w:noVBand="1" w:val="04A0"/>
+      </w:tblPr>
+      <w:tblGrid>
+        <w:gridCol w:w="10800"/>
+      </w:tblGrid>
+      <w:tr>
+        <w:tc>
+          <w:tcPr>
+            <w:tcW w:type="dxa" w:w="10800"/>
+            <w:vAlign w:val="top"/>
+            <w:shd w:fill="FFFFFF"/>
+            <w:tcBorders>
+              <w:top w:val="single" w:sz="8" w:space="0" w:color="DCE6F2"/>
+              <w:left w:val="single" w:sz="8" w:space="0" w:color="DCE6F2"/>
+              <w:bottom w:val="single" w:sz="8" w:space="0" w:color="DCE6F2"/>
+              <w:right w:val="single" w:sz="8" w:space="0" w:color="DCE6F2"/>
+            </w:tcBorders>
+          </w:tcPr>
+          <w:p>
+            <w:pPr>
+              <w:spacing w:after="40"/>
+            </w:pPr>
+            <w:r>
+              <w:drawing>
+                <wp:inline xmlns:a="http://schemas.openxmlformats.org/drawingml/2006/main" xmlns:pic="http://schemas.openxmlformats.org/drawingml/2006/picture">
+                  <wp:extent cx="182880" cy="182880"/>
+                  <wp:docPr id="21" name="Picture 21"/>
+                  <wp:cNvGraphicFramePr>
+                    <a:graphicFrameLocks noChangeAspect="1"/>
+                  </wp:cNvGraphicFramePr>
+                  <a:graphic>
+                    <a:graphicData uri="http://schemas.openxmlformats.org/drawingml/2006/picture">
+                      <pic:pic>
+                        <pic:nvPicPr>
+                          <pic:cNvPr id="0" name="postgresql.png"/>
+                          <pic:cNvPicPr/>
+                        </pic:nvPicPr>
+                        <pic:blipFill>
+                          <a:blip r:embed="rId18"/>
+                          <a:stretch>
+                            <a:fillRect/>
+                          </a:stretch>
+                        </pic:blipFill>
+                        <pic:spPr>
+                          <a:xfrm>
+                            <a:off x="0" y="0"/>
+                            <a:ext cx="182880" cy="182880"/>
+                          </a:xfrm>
+                          <a:prstGeom prst="rect"/>
+                        </pic:spPr>
+                      </pic:pic>
+                    </a:graphicData>
+                  </a:graphic>
+                </wp:inline>
+              </w:drawing>
+            </w:r>
+            <w:r>
+              <w:t xml:space="preserve"> </w:t>
+            </w:r>
+            <w:r>
+              <w:rPr>
+                <w:rFonts w:ascii="Aptos" w:hAnsi="Aptos"/>
+                <w:b/>
+                <w:color w:val="202124"/>
+                <w:sz w:val="19"/>
+              </w:rPr>
+              <w:t>Private AWS RDS PostgreSQL to GCP Cloud SQL Migration</w:t>
+            </w:r>
+          </w:p>
+          <w:p>
+            <w:r>
+              <w:rPr>
+                <w:rFonts w:ascii="Aptos" w:hAnsi="Aptos"/>
+                <w:b w:val="0"/>
+                <w:color w:val="3C4043"/>
+                <w:sz w:val="17"/>
+              </w:rPr>
+              <w:t>Designed private PostgreSQL migration using AWS VPC/VGW, GCP HA VPN, IPsec, BGP, Private Services Access, and Database Migration Service.</w:t>
+            </w:r>
+          </w:p>
+        </w:tc>
+      </w:tr>
+    </w:tbl>
+    <w:tbl>
+      <w:tblPr>
+        <w:tblW w:type="auto" w:w="0"/>
+        <w:jc w:val="center"/>
+        <w:tblLayout w:type="autofit"/>
+        <w:tblLook w:firstColumn="1" w:firstRow="1" w:lastColumn="0" w:lastRow="0" w:noHBand="0" w:noVBand="1" w:val="04A0"/>
+      </w:tblPr>
+      <w:tblGrid>
+        <w:gridCol w:w="10800"/>
+      </w:tblGrid>
+      <w:tr>
+        <w:tc>
+          <w:tcPr>
+            <w:tcW w:type="dxa" w:w="10800"/>
+            <w:vAlign w:val="top"/>
+            <w:shd w:fill="FFFFFF"/>
+            <w:tcBorders>
+              <w:top w:val="single" w:sz="8" w:space="0" w:color="DCE6F2"/>
+              <w:left w:val="single" w:sz="8" w:space="0" w:color="DCE6F2"/>
+              <w:bottom w:val="single" w:sz="8" w:space="0" w:color="DCE6F2"/>
+              <w:right w:val="single" w:sz="8" w:space="0" w:color="DCE6F2"/>
+            </w:tcBorders>
+          </w:tcPr>
+          <w:p>
+            <w:pPr>
+              <w:spacing w:after="40"/>
+            </w:pPr>
+            <w:r>
+              <w:drawing>
+                <wp:inline xmlns:a="http://schemas.openxmlformats.org/drawingml/2006/main" xmlns:pic="http://schemas.openxmlformats.org/drawingml/2006/picture">
+                  <wp:extent cx="182880" cy="182880"/>
+                  <wp:docPr id="22" name="Picture 22"/>
+                  <wp:cNvGraphicFramePr>
+                    <a:graphicFrameLocks noChangeAspect="1"/>
+                  </wp:cNvGraphicFramePr>
+                  <a:graphic>
+                    <a:graphicData uri="http://schemas.openxmlformats.org/drawingml/2006/picture">
+                      <pic:pic>
+                        <pic:nvPicPr>
+                          <pic:cNvPr id="0" name="googlecloud.png"/>
+                          <pic:cNvPicPr/>
+                        </pic:nvPicPr>
+                        <pic:blipFill>
+                          <a:blip r:embed="rId10"/>
+                          <a:stretch>
+                            <a:fillRect/>
+                          </a:stretch>
+                        </pic:blipFill>
+                        <pic:spPr>
+                          <a:xfrm>
+                            <a:off x="0" y="0"/>
+                            <a:ext cx="182880" cy="182880"/>
+                          </a:xfrm>
+                          <a:prstGeom prst="rect"/>
+                        </pic:spPr>
+                      </pic:pic>
+                    </a:graphicData>
+                  </a:graphic>
+                </wp:inline>
+              </w:drawing>
+            </w:r>
+            <w:r>
+              <w:t xml:space="preserve"> </w:t>
+            </w:r>
+            <w:r>
+              <w:rPr>
+                <w:rFonts w:ascii="Aptos" w:hAnsi="Aptos"/>
+                <w:b/>
+                <w:color w:val="202124"/>
+                <w:sz w:val="19"/>
+              </w:rPr>
+              <w:t>Private Cloud Storage Behind Load Balancer</w:t>
+            </w:r>
+          </w:p>
+          <w:p>
+            <w:r>
+              <w:rPr>
+                <w:rFonts w:ascii="Aptos" w:hAnsi="Aptos"/>
+                <w:b w:val="0"/>
+                <w:color w:val="3C4043"/>
+                <w:sz w:val="17"/>
+              </w:rPr>
+              <w:t>Built a GCP pattern for private Cloud Storage access through a global external application load balancer with backend bucket validation.</w:t>
+            </w:r>
+          </w:p>
+        </w:tc>
+      </w:tr>
+    </w:tbl>
+    <w:tbl>
+      <w:tblPr>
+        <w:tblW w:type="auto" w:w="0"/>
+        <w:jc w:val="center"/>
+        <w:tblLayout w:type="autofit"/>
+        <w:tblLook w:firstColumn="1" w:firstRow="1" w:lastColumn="0" w:lastRow="0" w:noHBand="0" w:noVBand="1" w:val="04A0"/>
+      </w:tblPr>
+      <w:tblGrid>
+        <w:gridCol w:w="10800"/>
+      </w:tblGrid>
+      <w:tr>
+        <w:tc>
+          <w:tcPr>
+            <w:tcW w:type="dxa" w:w="10800"/>
+            <w:vAlign w:val="top"/>
+            <w:shd w:fill="FFFFFF"/>
+            <w:tcBorders>
+              <w:top w:val="single" w:sz="8" w:space="0" w:color="DCE6F2"/>
+              <w:left w:val="single" w:sz="8" w:space="0" w:color="DCE6F2"/>
+              <w:bottom w:val="single" w:sz="8" w:space="0" w:color="DCE6F2"/>
+              <w:right w:val="single" w:sz="8" w:space="0" w:color="DCE6F2"/>
+            </w:tcBorders>
+          </w:tcPr>
+          <w:p>
+            <w:pPr>
+              <w:spacing w:after="40"/>
+            </w:pPr>
+            <w:r>
+              <w:drawing>
+                <wp:inline xmlns:a="http://schemas.openxmlformats.org/drawingml/2006/main" xmlns:pic="http://schemas.openxmlformats.org/drawingml/2006/picture">
+                  <wp:extent cx="182880" cy="182880"/>
+                  <wp:docPr id="23" name="Picture 23"/>
+                  <wp:cNvGraphicFramePr>
+                    <a:graphicFrameLocks noChangeAspect="1"/>
+                  </wp:cNvGraphicFramePr>
+                  <a:graphic>
+                    <a:graphicData uri="http://schemas.openxmlformats.org/drawingml/2006/picture">
+                      <pic:pic>
+                        <pic:nvPicPr>
+                          <pic:cNvPr id="0" name="googlecloud.png"/>
+                          <pic:cNvPicPr/>
+                        </pic:nvPicPr>
+                        <pic:blipFill>
+                          <a:blip r:embed="rId10"/>
+                          <a:stretch>
+                            <a:fillRect/>
+                          </a:stretch>
+                        </pic:blipFill>
+                        <pic:spPr>
+                          <a:xfrm>
+                            <a:off x="0" y="0"/>
+                            <a:ext cx="182880" cy="182880"/>
+                          </a:xfrm>
+                          <a:prstGeom prst="rect"/>
+                        </pic:spPr>
+                      </pic:pic>
+                    </a:graphicData>
+                  </a:graphic>
+                </wp:inline>
+              </w:drawing>
+            </w:r>
+            <w:r>
+              <w:t xml:space="preserve"> </w:t>
+            </w:r>
+            <w:r>
+              <w:rPr>
+                <w:rFonts w:ascii="Aptos" w:hAnsi="Aptos"/>
+                <w:b/>
+                <w:color w:val="202124"/>
+                <w:sz w:val="19"/>
+              </w:rPr>
+              <w:t>AWS to GCP Site-to-Site VPN</w:t>
+            </w:r>
+          </w:p>
+          <w:p>
+            <w:r>
+              <w:rPr>
+                <w:rFonts w:ascii="Aptos" w:hAnsi="Aptos"/>
+                <w:b w:val="0"/>
+                <w:color w:val="3C4043"/>
+                <w:sz w:val="17"/>
+              </w:rPr>
+              <w:t>Prepared VPN documentation covering AWS and GCP networking, secure tunnel configuration, routing, validation, and hybrid cloud connectivity.</w:t>
+            </w:r>
+          </w:p>
+        </w:tc>
+      </w:tr>
+    </w:tbl>
+    <w:tbl>
+      <w:tblPr>
+        <w:tblW w:type="auto" w:w="0"/>
+        <w:jc w:val="center"/>
+        <w:tblLayout w:type="autofit"/>
+        <w:tblLook w:firstColumn="1" w:firstRow="1" w:lastColumn="0" w:lastRow="0" w:noHBand="0" w:noVBand="1" w:val="04A0"/>
+      </w:tblPr>
+      <w:tblGrid>
+        <w:gridCol w:w="10800"/>
+      </w:tblGrid>
+      <w:tr>
+        <w:tc>
+          <w:tcPr>
+            <w:tcW w:type="dxa" w:w="10800"/>
+            <w:vAlign w:val="top"/>
+            <w:shd w:fill="FFFFFF"/>
+            <w:tcBorders>
+              <w:top w:val="single" w:sz="8" w:space="0" w:color="DCE6F2"/>
+              <w:left w:val="single" w:sz="8" w:space="0" w:color="DCE6F2"/>
+              <w:bottom w:val="single" w:sz="8" w:space="0" w:color="DCE6F2"/>
+              <w:right w:val="single" w:sz="8" w:space="0" w:color="DCE6F2"/>
+            </w:tcBorders>
+          </w:tcPr>
+          <w:p>
+            <w:pPr>
+              <w:spacing w:after="40"/>
+            </w:pPr>
+            <w:r>
+              <w:drawing>
+                <wp:inline xmlns:a="http://schemas.openxmlformats.org/drawingml/2006/main" xmlns:pic="http://schemas.openxmlformats.org/drawingml/2006/picture">
+                  <wp:extent cx="182880" cy="182880"/>
+                  <wp:docPr id="24" name="Picture 24"/>
+                  <wp:cNvGraphicFramePr>
+                    <a:graphicFrameLocks noChangeAspect="1"/>
+                  </wp:cNvGraphicFramePr>
+                  <a:graphic>
+                    <a:graphicData uri="http://schemas.openxmlformats.org/drawingml/2006/picture">
+                      <pic:pic>
+                        <pic:nvPicPr>
+                          <pic:cNvPr id="0" name="linux.png"/>
+                          <pic:cNvPicPr/>
+                        </pic:nvPicPr>
+                        <pic:blipFill>
+                          <a:blip r:embed="rId11"/>
+                          <a:stretch>
+                            <a:fillRect/>
+                          </a:stretch>
+                        </pic:blipFill>
+                        <pic:spPr>
+                          <a:xfrm>
+                            <a:off x="0" y="0"/>
+                            <a:ext cx="182880" cy="182880"/>
+                          </a:xfrm>
+                          <a:prstGeom prst="rect"/>
+                        </pic:spPr>
+                      </pic:pic>
+                    </a:graphicData>
+                  </a:graphic>
+                </wp:inline>
+              </w:drawing>
+            </w:r>
+            <w:r>
+              <w:t xml:space="preserve"> </w:t>
+            </w:r>
+            <w:r>
+              <w:rPr>
+                <w:rFonts w:ascii="Aptos" w:hAnsi="Aptos"/>
+                <w:b/>
+                <w:color w:val="202124"/>
+                <w:sz w:val="19"/>
+              </w:rPr>
+              <w:t>Forenscope - IoT Digital Evidence Collector</w:t>
+            </w:r>
+          </w:p>
+          <w:p>
+            <w:r>
+              <w:rPr>
+                <w:rFonts w:ascii="Aptos" w:hAnsi="Aptos"/>
+                <w:b w:val="0"/>
+                <w:color w:val="3C4043"/>
+                <w:sz w:val="17"/>
+              </w:rPr>
+              <w:t>Created an IoT-driven evidence collection concept aligned to cybersecurity investigation, integrity, and secure evidence handling workflows.</w:t>
+            </w:r>
+          </w:p>
+        </w:tc>
+      </w:tr>
+    </w:tbl>
     <w:p>
       <w:pPr>
-        <w:spacing w:before="0" w:after="6" w:line="240" w:lineRule="auto"/>
-        <w:jc w:val="center"/>
+        <w:spacing w:before="260" w:after="140"/>
       </w:pPr>
       <w:r>
         <w:rPr>
-          <w:rFonts w:ascii="Arial" w:hAnsi="Arial"/>
-          <w:b w:val="0"/>
-          <w:color w:val="202124"/>
-          <w:sz w:val="16"/>
-        </w:rPr>
-        <w:t>LinkedIn: www.linkedin.com/in/hariharan-j-2a909a290 | GitHub: github.com/Jhsoul69</w:t>
-      </w:r>
-    </w:p>
-    <w:p>
-      <w:pPr>
-        <w:spacing w:before="0" w:after="6" w:line="240" w:lineRule="auto"/>
-        <w:jc w:val="center"/>
-      </w:pPr>
-      <w:r>
-        <w:rPr>
-          <w:rFonts w:ascii="Arial" w:hAnsi="Arial"/>
+          <w:rFonts w:ascii="Aptos" w:hAnsi="Aptos"/>
           <w:b/>
           <w:color w:val="202124"/>
-          <w:sz w:val="17"/>
-        </w:rPr>
-        <w:t>Cloud Engineer Intern | AWS CCP | Google ACE | Cybersecurity Engineering</w:t>
-      </w:r>
-    </w:p>
-    <w:p>
-      <w:pPr>
-        <w:spacing w:before="50" w:after="16" w:line="240" w:lineRule="auto"/>
-        <w:pBdr>
-          <w:bottom w:val="single" w:sz="4" w:space="1" w:color="DADCE0"/>
-        </w:pBdr>
-      </w:pPr>
-      <w:r>
-        <w:rPr>
-          <w:rFonts w:ascii="Arial" w:hAnsi="Arial"/>
-          <w:b/>
-          <w:color w:val="1A73E8"/>
-          <w:sz w:val="18"/>
-        </w:rPr>
-        <w:t>PROFESSIONAL SUMMARY</w:t>
-      </w:r>
-    </w:p>
-    <w:p>
-      <w:pPr>
-        <w:spacing w:before="0" w:after="7" w:line="240" w:lineRule="auto"/>
-      </w:pPr>
-      <w:r>
-        <w:rPr>
-          <w:rFonts w:ascii="Arial" w:hAnsi="Arial"/>
-          <w:b w:val="0"/>
-          <w:color w:val="202124"/>
-          <w:sz w:val="16"/>
-        </w:rPr>
-        <w:t>Cloud Engineer Intern with hands-on experience across Google Cloud Platform and AWS. AWS Certified Cloud Practitioner and Google Associate Cloud Engineer with strong foundations in cloud infrastructure, IAM, VPC networking, DNS, Linux administration, Python APIs, Docker, Kubernetes, Terraform basics, cloud migration, and security-aware deployment. Cybersecurity Engineering student with practical exposure to secure access, SSL/TLS, routing, VPN, backend services, and RAG-based AI systems.</w:t>
-      </w:r>
-    </w:p>
-    <w:p>
-      <w:pPr>
-        <w:spacing w:before="50" w:after="16" w:line="240" w:lineRule="auto"/>
-        <w:pBdr>
-          <w:bottom w:val="single" w:sz="4" w:space="1" w:color="DADCE0"/>
-        </w:pBdr>
-      </w:pPr>
-      <w:r>
-        <w:rPr>
-          <w:rFonts w:ascii="Arial" w:hAnsi="Arial"/>
-          <w:b/>
-          <w:color w:val="1A73E8"/>
-          <w:sz w:val="18"/>
+          <w:sz w:val="21"/>
         </w:rPr>
         <w:t>TECHNICAL SKILLS</w:t>
       </w:r>
     </w:p>
+    <w:tbl>
+      <w:tblPr>
+        <w:tblW w:type="auto" w:w="0"/>
+        <w:jc w:val="center"/>
+        <w:tblLayout w:type="autofit"/>
+        <w:tblLook w:firstColumn="1" w:firstRow="1" w:lastColumn="0" w:lastRow="0" w:noHBand="0" w:noVBand="1" w:val="04A0"/>
+      </w:tblPr>
+      <w:tblGrid>
+        <w:gridCol w:w="5400"/>
+        <w:gridCol w:w="5400"/>
+      </w:tblGrid>
+      <w:tr>
+        <w:tc>
+          <w:tcPr>
+            <w:tcW w:type="dxa" w:w="5400"/>
+            <w:vAlign w:val="top"/>
+            <w:shd w:fill="FFFFFF"/>
+            <w:tcBorders>
+              <w:top w:val="single" w:sz="8" w:space="0" w:color="DCE6F2"/>
+              <w:left w:val="single" w:sz="8" w:space="0" w:color="DCE6F2"/>
+              <w:bottom w:val="single" w:sz="8" w:space="0" w:color="DCE6F2"/>
+              <w:right w:val="single" w:sz="8" w:space="0" w:color="DCE6F2"/>
+            </w:tcBorders>
+          </w:tcPr>
+          <w:p>
+            <w:pPr>
+              <w:spacing w:after="40"/>
+            </w:pPr>
+            <w:r>
+              <w:rPr>
+                <w:rFonts w:ascii="Aptos" w:hAnsi="Aptos"/>
+                <w:b/>
+                <w:color w:val="202124"/>
+                <w:sz w:val="18"/>
+              </w:rPr>
+              <w:t>Cloud Platforms</w:t>
+            </w:r>
+          </w:p>
+        </w:tc>
+        <w:tc>
+          <w:tcPr>
+            <w:tcW w:type="dxa" w:w="5400"/>
+            <w:vAlign w:val="top"/>
+            <w:shd w:fill="FFFFFF"/>
+            <w:tcBorders>
+              <w:top w:val="single" w:sz="8" w:space="0" w:color="DCE6F2"/>
+              <w:left w:val="single" w:sz="8" w:space="0" w:color="DCE6F2"/>
+              <w:bottom w:val="single" w:sz="8" w:space="0" w:color="DCE6F2"/>
+              <w:right w:val="single" w:sz="8" w:space="0" w:color="DCE6F2"/>
+            </w:tcBorders>
+          </w:tcPr>
+          <w:p>
+            <w:pPr>
+              <w:spacing w:after="40"/>
+            </w:pPr>
+            <w:r>
+              <w:rPr>
+                <w:rFonts w:ascii="Aptos" w:hAnsi="Aptos"/>
+                <w:b w:val="0"/>
+                <w:color w:val="3C4043"/>
+                <w:sz w:val="17"/>
+              </w:rPr>
+              <w:t>AWS: IAM, EC2, S3, VPC, Route 53, RDS, ECR, ECS, CodePipeline. Google Cloud: IAM, Compute Engine, VPC, Cloud DNS, Cloud SQL, Cloud Storage, Cloud Run, GKE, Artifact Registry.</w:t>
+            </w:r>
+          </w:p>
+        </w:tc>
+      </w:tr>
+      <w:tr>
+        <w:tc>
+          <w:tcPr>
+            <w:tcW w:type="dxa" w:w="5400"/>
+            <w:vAlign w:val="top"/>
+            <w:shd w:fill="FFFFFF"/>
+            <w:tcBorders>
+              <w:top w:val="single" w:sz="8" w:space="0" w:color="DCE6F2"/>
+              <w:left w:val="single" w:sz="8" w:space="0" w:color="DCE6F2"/>
+              <w:bottom w:val="single" w:sz="8" w:space="0" w:color="DCE6F2"/>
+              <w:right w:val="single" w:sz="8" w:space="0" w:color="DCE6F2"/>
+            </w:tcBorders>
+          </w:tcPr>
+          <w:p>
+            <w:pPr>
+              <w:spacing w:after="40"/>
+            </w:pPr>
+            <w:r>
+              <w:rPr>
+                <w:rFonts w:ascii="Aptos" w:hAnsi="Aptos"/>
+                <w:b/>
+                <w:color w:val="202124"/>
+                <w:sz w:val="18"/>
+              </w:rPr>
+              <w:t>Security and Networking</w:t>
+            </w:r>
+          </w:p>
+        </w:tc>
+        <w:tc>
+          <w:tcPr>
+            <w:tcW w:type="dxa" w:w="5400"/>
+            <w:vAlign w:val="top"/>
+            <w:shd w:fill="FFFFFF"/>
+            <w:tcBorders>
+              <w:top w:val="single" w:sz="8" w:space="0" w:color="DCE6F2"/>
+              <w:left w:val="single" w:sz="8" w:space="0" w:color="DCE6F2"/>
+              <w:bottom w:val="single" w:sz="8" w:space="0" w:color="DCE6F2"/>
+              <w:right w:val="single" w:sz="8" w:space="0" w:color="DCE6F2"/>
+            </w:tcBorders>
+          </w:tcPr>
+          <w:p>
+            <w:pPr>
+              <w:spacing w:after="40"/>
+            </w:pPr>
+            <w:r>
+              <w:rPr>
+                <w:rFonts w:ascii="Aptos" w:hAnsi="Aptos"/>
+                <w:b w:val="0"/>
+                <w:color w:val="3C4043"/>
+                <w:sz w:val="17"/>
+              </w:rPr>
+              <w:t>Least-privilege IAM, security groups, firewall rules, subnetting, routing, VPN, BGP, DNS, SSL/TLS, monitoring basics, Linux hardening fundamentals.</w:t>
+            </w:r>
+          </w:p>
+        </w:tc>
+      </w:tr>
+      <w:tr>
+        <w:tc>
+          <w:tcPr>
+            <w:tcW w:type="dxa" w:w="5400"/>
+            <w:vAlign w:val="top"/>
+            <w:shd w:fill="FFFFFF"/>
+            <w:tcBorders>
+              <w:top w:val="single" w:sz="8" w:space="0" w:color="DCE6F2"/>
+              <w:left w:val="single" w:sz="8" w:space="0" w:color="DCE6F2"/>
+              <w:bottom w:val="single" w:sz="8" w:space="0" w:color="DCE6F2"/>
+              <w:right w:val="single" w:sz="8" w:space="0" w:color="DCE6F2"/>
+            </w:tcBorders>
+          </w:tcPr>
+          <w:p>
+            <w:pPr>
+              <w:spacing w:after="40"/>
+            </w:pPr>
+            <w:r>
+              <w:rPr>
+                <w:rFonts w:ascii="Aptos" w:hAnsi="Aptos"/>
+                <w:b/>
+                <w:color w:val="202124"/>
+                <w:sz w:val="18"/>
+              </w:rPr>
+              <w:t>DevOps and Automation</w:t>
+            </w:r>
+          </w:p>
+        </w:tc>
+        <w:tc>
+          <w:tcPr>
+            <w:tcW w:type="dxa" w:w="5400"/>
+            <w:vAlign w:val="top"/>
+            <w:shd w:fill="FFFFFF"/>
+            <w:tcBorders>
+              <w:top w:val="single" w:sz="8" w:space="0" w:color="DCE6F2"/>
+              <w:left w:val="single" w:sz="8" w:space="0" w:color="DCE6F2"/>
+              <w:bottom w:val="single" w:sz="8" w:space="0" w:color="DCE6F2"/>
+              <w:right w:val="single" w:sz="8" w:space="0" w:color="DCE6F2"/>
+            </w:tcBorders>
+          </w:tcPr>
+          <w:p>
+            <w:pPr>
+              <w:spacing w:after="40"/>
+            </w:pPr>
+            <w:r>
+              <w:rPr>
+                <w:rFonts w:ascii="Aptos" w:hAnsi="Aptos"/>
+                <w:b w:val="0"/>
+                <w:color w:val="3C4043"/>
+                <w:sz w:val="17"/>
+              </w:rPr>
+              <w:t>Docker, Kubernetes, Terraform fundamentals, GitHub Actions, AWS CodePipeline, Bash, Linux operations, Postman, CI/CD deployment practice.</w:t>
+            </w:r>
+          </w:p>
+        </w:tc>
+      </w:tr>
+      <w:tr>
+        <w:tc>
+          <w:tcPr>
+            <w:tcW w:type="dxa" w:w="5400"/>
+            <w:vAlign w:val="top"/>
+            <w:shd w:fill="FFFFFF"/>
+            <w:tcBorders>
+              <w:top w:val="single" w:sz="8" w:space="0" w:color="DCE6F2"/>
+              <w:left w:val="single" w:sz="8" w:space="0" w:color="DCE6F2"/>
+              <w:bottom w:val="single" w:sz="8" w:space="0" w:color="DCE6F2"/>
+              <w:right w:val="single" w:sz="8" w:space="0" w:color="DCE6F2"/>
+            </w:tcBorders>
+          </w:tcPr>
+          <w:p>
+            <w:pPr>
+              <w:spacing w:after="40"/>
+            </w:pPr>
+            <w:r>
+              <w:rPr>
+                <w:rFonts w:ascii="Aptos" w:hAnsi="Aptos"/>
+                <w:b/>
+                <w:color w:val="202124"/>
+                <w:sz w:val="18"/>
+              </w:rPr>
+              <w:t>Programming and Backend</w:t>
+            </w:r>
+          </w:p>
+        </w:tc>
+        <w:tc>
+          <w:tcPr>
+            <w:tcW w:type="dxa" w:w="5400"/>
+            <w:vAlign w:val="top"/>
+            <w:shd w:fill="FFFFFF"/>
+            <w:tcBorders>
+              <w:top w:val="single" w:sz="8" w:space="0" w:color="DCE6F2"/>
+              <w:left w:val="single" w:sz="8" w:space="0" w:color="DCE6F2"/>
+              <w:bottom w:val="single" w:sz="8" w:space="0" w:color="DCE6F2"/>
+              <w:right w:val="single" w:sz="8" w:space="0" w:color="DCE6F2"/>
+            </w:tcBorders>
+          </w:tcPr>
+          <w:p>
+            <w:pPr>
+              <w:spacing w:after="40"/>
+            </w:pPr>
+            <w:r>
+              <w:rPr>
+                <w:rFonts w:ascii="Aptos" w:hAnsi="Aptos"/>
+                <w:b w:val="0"/>
+                <w:color w:val="3C4043"/>
+                <w:sz w:val="17"/>
+              </w:rPr>
+              <w:t>Python, FastAPI, Java, REST APIs, secure authentication, database integration, API debugging, backend automation, PostgreSQL.</w:t>
+            </w:r>
+          </w:p>
+        </w:tc>
+      </w:tr>
+    </w:tbl>
     <w:p>
       <w:pPr>
-        <w:spacing w:before="0" w:after="7" w:line="240" w:lineRule="auto"/>
+        <w:spacing w:before="260" w:after="140"/>
       </w:pPr>
       <w:r>
         <w:rPr>
-          <w:rFonts w:ascii="Arial" w:hAnsi="Arial"/>
-          <w:b w:val="0"/>
+          <w:rFonts w:ascii="Aptos" w:hAnsi="Aptos"/>
+          <w:b/>
           <w:color w:val="202124"/>
-          <w:sz w:val="16"/>
+          <w:sz w:val="21"/>
         </w:rPr>
-        <w:t>Cloud Platforms: Google Cloud Platform, Amazon Web Services</w:t>
+        <w:t>CERTIFICATIONS AND LEARNING</w:t>
       </w:r>
     </w:p>
+    <w:tbl>
+      <w:tblPr>
+        <w:tblW w:type="auto" w:w="0"/>
+        <w:jc w:val="center"/>
+        <w:tblLayout w:type="autofit"/>
+        <w:tblLook w:firstColumn="1" w:firstRow="1" w:lastColumn="0" w:lastRow="0" w:noHBand="0" w:noVBand="1" w:val="04A0"/>
+      </w:tblPr>
+      <w:tblGrid>
+        <w:gridCol w:w="5400"/>
+        <w:gridCol w:w="5400"/>
+      </w:tblGrid>
+      <w:tr>
+        <w:tc>
+          <w:tcPr>
+            <w:tcW w:type="dxa" w:w="5400"/>
+            <w:vAlign w:val="top"/>
+            <w:shd w:fill="FFFFFF"/>
+            <w:tcBorders>
+              <w:top w:val="single" w:sz="8" w:space="0" w:color="DCE6F2"/>
+              <w:left w:val="single" w:sz="8" w:space="0" w:color="DCE6F2"/>
+              <w:bottom w:val="single" w:sz="8" w:space="0" w:color="DCE6F2"/>
+              <w:right w:val="single" w:sz="8" w:space="0" w:color="DCE6F2"/>
+            </w:tcBorders>
+          </w:tcPr>
+          <w:p>
+            <w:pPr>
+              <w:spacing w:after="40"/>
+            </w:pPr>
+            <w:r>
+              <w:drawing>
+                <wp:inline xmlns:a="http://schemas.openxmlformats.org/drawingml/2006/main" xmlns:pic="http://schemas.openxmlformats.org/drawingml/2006/picture">
+                  <wp:extent cx="182880" cy="182880"/>
+                  <wp:docPr id="25" name="Picture 25"/>
+                  <wp:cNvGraphicFramePr>
+                    <a:graphicFrameLocks noChangeAspect="1"/>
+                  </wp:cNvGraphicFramePr>
+                  <a:graphic>
+                    <a:graphicData uri="http://schemas.openxmlformats.org/drawingml/2006/picture">
+                      <pic:pic>
+                        <pic:nvPicPr>
+                          <pic:cNvPr id="0" name="aws.png"/>
+                          <pic:cNvPicPr/>
+                        </pic:nvPicPr>
+                        <pic:blipFill>
+                          <a:blip r:embed="rId9"/>
+                          <a:stretch>
+                            <a:fillRect/>
+                          </a:stretch>
+                        </pic:blipFill>
+                        <pic:spPr>
+                          <a:xfrm>
+                            <a:off x="0" y="0"/>
+                            <a:ext cx="182880" cy="182880"/>
+                          </a:xfrm>
+                          <a:prstGeom prst="rect"/>
+                        </pic:spPr>
+                      </pic:pic>
+                    </a:graphicData>
+                  </a:graphic>
+                </wp:inline>
+              </w:drawing>
+            </w:r>
+            <w:r>
+              <w:t xml:space="preserve"> </w:t>
+            </w:r>
+            <w:r>
+              <w:rPr>
+                <w:rFonts w:ascii="Aptos" w:hAnsi="Aptos"/>
+                <w:b/>
+                <w:color w:val="202124"/>
+                <w:sz w:val="17"/>
+              </w:rPr>
+              <w:t>AWS Certified Cloud Practitioner</w:t>
+            </w:r>
+          </w:p>
+          <w:p>
+            <w:r>
+              <w:rPr>
+                <w:rFonts w:ascii="Aptos" w:hAnsi="Aptos"/>
+                <w:b w:val="0"/>
+                <w:color w:val="3C4043"/>
+                <w:sz w:val="16"/>
+              </w:rPr>
+              <w:t>Cloud concepts, AWS core services, security, pricing, and support fundamentals.</w:t>
+            </w:r>
+          </w:p>
+        </w:tc>
+        <w:tc>
+          <w:tcPr>
+            <w:tcW w:type="dxa" w:w="5400"/>
+            <w:vAlign w:val="top"/>
+            <w:shd w:fill="FFFFFF"/>
+            <w:tcBorders>
+              <w:top w:val="single" w:sz="8" w:space="0" w:color="DCE6F2"/>
+              <w:left w:val="single" w:sz="8" w:space="0" w:color="DCE6F2"/>
+              <w:bottom w:val="single" w:sz="8" w:space="0" w:color="DCE6F2"/>
+              <w:right w:val="single" w:sz="8" w:space="0" w:color="DCE6F2"/>
+            </w:tcBorders>
+          </w:tcPr>
+          <w:p>
+            <w:pPr>
+              <w:spacing w:after="40"/>
+            </w:pPr>
+            <w:r>
+              <w:drawing>
+                <wp:inline xmlns:a="http://schemas.openxmlformats.org/drawingml/2006/main" xmlns:pic="http://schemas.openxmlformats.org/drawingml/2006/picture">
+                  <wp:extent cx="182880" cy="182880"/>
+                  <wp:docPr id="26" name="Picture 26"/>
+                  <wp:cNvGraphicFramePr>
+                    <a:graphicFrameLocks noChangeAspect="1"/>
+                  </wp:cNvGraphicFramePr>
+                  <a:graphic>
+                    <a:graphicData uri="http://schemas.openxmlformats.org/drawingml/2006/picture">
+                      <pic:pic>
+                        <pic:nvPicPr>
+                          <pic:cNvPr id="0" name="googlecloud.png"/>
+                          <pic:cNvPicPr/>
+                        </pic:nvPicPr>
+                        <pic:blipFill>
+                          <a:blip r:embed="rId10"/>
+                          <a:stretch>
+                            <a:fillRect/>
+                          </a:stretch>
+                        </pic:blipFill>
+                        <pic:spPr>
+                          <a:xfrm>
+                            <a:off x="0" y="0"/>
+                            <a:ext cx="182880" cy="182880"/>
+                          </a:xfrm>
+                          <a:prstGeom prst="rect"/>
+                        </pic:spPr>
+                      </pic:pic>
+                    </a:graphicData>
+                  </a:graphic>
+                </wp:inline>
+              </w:drawing>
+            </w:r>
+            <w:r>
+              <w:t xml:space="preserve"> </w:t>
+            </w:r>
+            <w:r>
+              <w:rPr>
+                <w:rFonts w:ascii="Aptos" w:hAnsi="Aptos"/>
+                <w:b/>
+                <w:color w:val="202124"/>
+                <w:sz w:val="17"/>
+              </w:rPr>
+              <w:t>Google Associate Cloud Engineer</w:t>
+            </w:r>
+          </w:p>
+          <w:p>
+            <w:r>
+              <w:rPr>
+                <w:rFonts w:ascii="Aptos" w:hAnsi="Aptos"/>
+                <w:b w:val="0"/>
+                <w:color w:val="3C4043"/>
+                <w:sz w:val="16"/>
+              </w:rPr>
+              <w:t>Google Cloud deployment, operations, IAM, networking, and managed services foundation.</w:t>
+            </w:r>
+          </w:p>
+        </w:tc>
+      </w:tr>
+      <w:tr>
+        <w:tc>
+          <w:tcPr>
+            <w:tcW w:type="dxa" w:w="5400"/>
+            <w:vAlign w:val="top"/>
+            <w:shd w:fill="FFFFFF"/>
+            <w:tcBorders>
+              <w:top w:val="single" w:sz="8" w:space="0" w:color="DCE6F2"/>
+              <w:left w:val="single" w:sz="8" w:space="0" w:color="DCE6F2"/>
+              <w:bottom w:val="single" w:sz="8" w:space="0" w:color="DCE6F2"/>
+              <w:right w:val="single" w:sz="8" w:space="0" w:color="DCE6F2"/>
+            </w:tcBorders>
+          </w:tcPr>
+          <w:p>
+            <w:pPr>
+              <w:spacing w:after="40"/>
+            </w:pPr>
+            <w:r>
+              <w:drawing>
+                <wp:inline xmlns:a="http://schemas.openxmlformats.org/drawingml/2006/main" xmlns:pic="http://schemas.openxmlformats.org/drawingml/2006/picture">
+                  <wp:extent cx="182880" cy="182880"/>
+                  <wp:docPr id="27" name="Picture 27"/>
+                  <wp:cNvGraphicFramePr>
+                    <a:graphicFrameLocks noChangeAspect="1"/>
+                  </wp:cNvGraphicFramePr>
+                  <a:graphic>
+                    <a:graphicData uri="http://schemas.openxmlformats.org/drawingml/2006/picture">
+                      <pic:pic>
+                        <pic:nvPicPr>
+                          <pic:cNvPr id="0" name="googlecloud.png"/>
+                          <pic:cNvPicPr/>
+                        </pic:nvPicPr>
+                        <pic:blipFill>
+                          <a:blip r:embed="rId10"/>
+                          <a:stretch>
+                            <a:fillRect/>
+                          </a:stretch>
+                        </pic:blipFill>
+                        <pic:spPr>
+                          <a:xfrm>
+                            <a:off x="0" y="0"/>
+                            <a:ext cx="182880" cy="182880"/>
+                          </a:xfrm>
+                          <a:prstGeom prst="rect"/>
+                        </pic:spPr>
+                      </pic:pic>
+                    </a:graphicData>
+                  </a:graphic>
+                </wp:inline>
+              </w:drawing>
+            </w:r>
+            <w:r>
+              <w:t xml:space="preserve"> </w:t>
+            </w:r>
+            <w:r>
+              <w:rPr>
+                <w:rFonts w:ascii="Aptos" w:hAnsi="Aptos"/>
+                <w:b/>
+                <w:color w:val="202124"/>
+                <w:sz w:val="17"/>
+              </w:rPr>
+              <w:t>Google Cloud Digital Leader Learning Path</w:t>
+            </w:r>
+          </w:p>
+          <w:p>
+            <w:r>
+              <w:rPr>
+                <w:rFonts w:ascii="Aptos" w:hAnsi="Aptos"/>
+                <w:b w:val="0"/>
+                <w:color w:val="3C4043"/>
+                <w:sz w:val="16"/>
+              </w:rPr>
+              <w:t>Cloud transformation, Google Cloud products, data, AI, security, and business value.</w:t>
+            </w:r>
+          </w:p>
+        </w:tc>
+        <w:tc>
+          <w:tcPr>
+            <w:tcW w:type="dxa" w:w="5400"/>
+            <w:vAlign w:val="top"/>
+            <w:shd w:fill="FFFFFF"/>
+            <w:tcBorders>
+              <w:top w:val="single" w:sz="8" w:space="0" w:color="DCE6F2"/>
+              <w:left w:val="single" w:sz="8" w:space="0" w:color="DCE6F2"/>
+              <w:bottom w:val="single" w:sz="8" w:space="0" w:color="DCE6F2"/>
+              <w:right w:val="single" w:sz="8" w:space="0" w:color="DCE6F2"/>
+            </w:tcBorders>
+          </w:tcPr>
+          <w:p>
+            <w:pPr>
+              <w:spacing w:after="40"/>
+            </w:pPr>
+            <w:r>
+              <w:drawing>
+                <wp:inline xmlns:a="http://schemas.openxmlformats.org/drawingml/2006/main" xmlns:pic="http://schemas.openxmlformats.org/drawingml/2006/picture">
+                  <wp:extent cx="182880" cy="182880"/>
+                  <wp:docPr id="28" name="Picture 28"/>
+                  <wp:cNvGraphicFramePr>
+                    <a:graphicFrameLocks noChangeAspect="1"/>
+                  </wp:cNvGraphicFramePr>
+                  <a:graphic>
+                    <a:graphicData uri="http://schemas.openxmlformats.org/drawingml/2006/picture">
+                      <pic:pic>
+                        <pic:nvPicPr>
+                          <pic:cNvPr id="0" name="googlecloud.png"/>
+                          <pic:cNvPicPr/>
+                        </pic:nvPicPr>
+                        <pic:blipFill>
+                          <a:blip r:embed="rId10"/>
+                          <a:stretch>
+                            <a:fillRect/>
+                          </a:stretch>
+                        </pic:blipFill>
+                        <pic:spPr>
+                          <a:xfrm>
+                            <a:off x="0" y="0"/>
+                            <a:ext cx="182880" cy="182880"/>
+                          </a:xfrm>
+                          <a:prstGeom prst="rect"/>
+                        </pic:spPr>
+                      </pic:pic>
+                    </a:graphicData>
+                  </a:graphic>
+                </wp:inline>
+              </w:drawing>
+            </w:r>
+            <w:r>
+              <w:t xml:space="preserve"> </w:t>
+            </w:r>
+            <w:r>
+              <w:rPr>
+                <w:rFonts w:ascii="Aptos" w:hAnsi="Aptos"/>
+                <w:b/>
+                <w:color w:val="202124"/>
+                <w:sz w:val="17"/>
+              </w:rPr>
+              <w:t>Google Professional Cloud Architect Learning Path</w:t>
+            </w:r>
+          </w:p>
+          <w:p>
+            <w:r>
+              <w:rPr>
+                <w:rFonts w:ascii="Aptos" w:hAnsi="Aptos"/>
+                <w:b w:val="0"/>
+                <w:color w:val="3C4043"/>
+                <w:sz w:val="16"/>
+              </w:rPr>
+              <w:t>Cloud architecture, infrastructure design, security, reliability, operations, and migration planning.</w:t>
+            </w:r>
+          </w:p>
+        </w:tc>
+      </w:tr>
+      <w:tr>
+        <w:tc>
+          <w:tcPr>
+            <w:tcW w:type="dxa" w:w="5400"/>
+            <w:vAlign w:val="top"/>
+            <w:shd w:fill="FFFFFF"/>
+            <w:tcBorders>
+              <w:top w:val="single" w:sz="8" w:space="0" w:color="DCE6F2"/>
+              <w:left w:val="single" w:sz="8" w:space="0" w:color="DCE6F2"/>
+              <w:bottom w:val="single" w:sz="8" w:space="0" w:color="DCE6F2"/>
+              <w:right w:val="single" w:sz="8" w:space="0" w:color="DCE6F2"/>
+            </w:tcBorders>
+          </w:tcPr>
+          <w:p>
+            <w:pPr>
+              <w:spacing w:after="40"/>
+            </w:pPr>
+            <w:r>
+              <w:drawing>
+                <wp:inline xmlns:a="http://schemas.openxmlformats.org/drawingml/2006/main" xmlns:pic="http://schemas.openxmlformats.org/drawingml/2006/picture">
+                  <wp:extent cx="182880" cy="182880"/>
+                  <wp:docPr id="29" name="Picture 29"/>
+                  <wp:cNvGraphicFramePr>
+                    <a:graphicFrameLocks noChangeAspect="1"/>
+                  </wp:cNvGraphicFramePr>
+                  <a:graphic>
+                    <a:graphicData uri="http://schemas.openxmlformats.org/drawingml/2006/picture">
+                      <pic:pic>
+                        <pic:nvPicPr>
+                          <pic:cNvPr id="0" name="linux.png"/>
+                          <pic:cNvPicPr/>
+                        </pic:nvPicPr>
+                        <pic:blipFill>
+                          <a:blip r:embed="rId11"/>
+                          <a:stretch>
+                            <a:fillRect/>
+                          </a:stretch>
+                        </pic:blipFill>
+                        <pic:spPr>
+                          <a:xfrm>
+                            <a:off x="0" y="0"/>
+                            <a:ext cx="182880" cy="182880"/>
+                          </a:xfrm>
+                          <a:prstGeom prst="rect"/>
+                        </pic:spPr>
+                      </pic:pic>
+                    </a:graphicData>
+                  </a:graphic>
+                </wp:inline>
+              </w:drawing>
+            </w:r>
+            <w:r>
+              <w:t xml:space="preserve"> </w:t>
+            </w:r>
+            <w:r>
+              <w:rPr>
+                <w:rFonts w:ascii="Aptos" w:hAnsi="Aptos"/>
+                <w:b/>
+                <w:color w:val="202124"/>
+                <w:sz w:val="17"/>
+              </w:rPr>
+              <w:t>EC-Council Network Defense Essentials</w:t>
+            </w:r>
+          </w:p>
+          <w:p>
+            <w:r>
+              <w:rPr>
+                <w:rFonts w:ascii="Aptos" w:hAnsi="Aptos"/>
+                <w:b w:val="0"/>
+                <w:color w:val="3C4043"/>
+                <w:sz w:val="16"/>
+              </w:rPr>
+              <w:t>Network defense, security fundamentals, and threat-aware engineering basics.</w:t>
+            </w:r>
+          </w:p>
+        </w:tc>
+        <w:tc>
+          <w:tcPr>
+            <w:tcW w:type="dxa" w:w="5400"/>
+            <w:vAlign w:val="top"/>
+            <w:shd w:fill="FFFFFF"/>
+            <w:tcBorders>
+              <w:top w:val="single" w:sz="8" w:space="0" w:color="DCE6F2"/>
+              <w:left w:val="single" w:sz="8" w:space="0" w:color="DCE6F2"/>
+              <w:bottom w:val="single" w:sz="8" w:space="0" w:color="DCE6F2"/>
+              <w:right w:val="single" w:sz="8" w:space="0" w:color="DCE6F2"/>
+            </w:tcBorders>
+          </w:tcPr>
+          <w:p>
+            <w:pPr>
+              <w:spacing w:after="40"/>
+            </w:pPr>
+            <w:r>
+              <w:drawing>
+                <wp:inline xmlns:a="http://schemas.openxmlformats.org/drawingml/2006/main" xmlns:pic="http://schemas.openxmlformats.org/drawingml/2006/picture">
+                  <wp:extent cx="182880" cy="182880"/>
+                  <wp:docPr id="30" name="Picture 30"/>
+                  <wp:cNvGraphicFramePr>
+                    <a:graphicFrameLocks noChangeAspect="1"/>
+                  </wp:cNvGraphicFramePr>
+                  <a:graphic>
+                    <a:graphicData uri="http://schemas.openxmlformats.org/drawingml/2006/picture">
+                      <pic:pic>
+                        <pic:nvPicPr>
+                          <pic:cNvPr id="0" name="cisco.png"/>
+                          <pic:cNvPicPr/>
+                        </pic:nvPicPr>
+                        <pic:blipFill>
+                          <a:blip r:embed="rId22"/>
+                          <a:stretch>
+                            <a:fillRect/>
+                          </a:stretch>
+                        </pic:blipFill>
+                        <pic:spPr>
+                          <a:xfrm>
+                            <a:off x="0" y="0"/>
+                            <a:ext cx="182880" cy="182880"/>
+                          </a:xfrm>
+                          <a:prstGeom prst="rect"/>
+                        </pic:spPr>
+                      </pic:pic>
+                    </a:graphicData>
+                  </a:graphic>
+                </wp:inline>
+              </w:drawing>
+            </w:r>
+            <w:r>
+              <w:t xml:space="preserve"> </w:t>
+            </w:r>
+            <w:r>
+              <w:rPr>
+                <w:rFonts w:ascii="Aptos" w:hAnsi="Aptos"/>
+                <w:b/>
+                <w:color w:val="202124"/>
+                <w:sz w:val="17"/>
+              </w:rPr>
+              <w:t>Cisco Networking Basics</w:t>
+            </w:r>
+          </w:p>
+          <w:p>
+            <w:r>
+              <w:rPr>
+                <w:rFonts w:ascii="Aptos" w:hAnsi="Aptos"/>
+                <w:b w:val="0"/>
+                <w:color w:val="3C4043"/>
+                <w:sz w:val="16"/>
+              </w:rPr>
+              <w:t>Networking concepts that support cloud, Linux, backend, and DevOps workflows.</w:t>
+            </w:r>
+          </w:p>
+        </w:tc>
+      </w:tr>
+      <w:tr>
+        <w:tc>
+          <w:tcPr>
+            <w:tcW w:type="dxa" w:w="5400"/>
+            <w:vAlign w:val="top"/>
+            <w:shd w:fill="FFFFFF"/>
+            <w:tcBorders>
+              <w:top w:val="single" w:sz="8" w:space="0" w:color="DCE6F2"/>
+              <w:left w:val="single" w:sz="8" w:space="0" w:color="DCE6F2"/>
+              <w:bottom w:val="single" w:sz="8" w:space="0" w:color="DCE6F2"/>
+              <w:right w:val="single" w:sz="8" w:space="0" w:color="DCE6F2"/>
+            </w:tcBorders>
+          </w:tcPr>
+          <w:p>
+            <w:pPr>
+              <w:spacing w:after="40"/>
+            </w:pPr>
+            <w:r>
+              <w:drawing>
+                <wp:inline xmlns:a="http://schemas.openxmlformats.org/drawingml/2006/main" xmlns:pic="http://schemas.openxmlformats.org/drawingml/2006/picture">
+                  <wp:extent cx="182880" cy="182880"/>
+                  <wp:docPr id="31" name="Picture 31"/>
+                  <wp:cNvGraphicFramePr>
+                    <a:graphicFrameLocks noChangeAspect="1"/>
+                  </wp:cNvGraphicFramePr>
+                  <a:graphic>
+                    <a:graphicData uri="http://schemas.openxmlformats.org/drawingml/2006/picture">
+                      <pic:pic>
+                        <pic:nvPicPr>
+                          <pic:cNvPr id="0" name="infosys.png"/>
+                          <pic:cNvPicPr/>
+                        </pic:nvPicPr>
+                        <pic:blipFill>
+                          <a:blip r:embed="rId21"/>
+                          <a:stretch>
+                            <a:fillRect/>
+                          </a:stretch>
+                        </pic:blipFill>
+                        <pic:spPr>
+                          <a:xfrm>
+                            <a:off x="0" y="0"/>
+                            <a:ext cx="182880" cy="182880"/>
+                          </a:xfrm>
+                          <a:prstGeom prst="rect"/>
+                        </pic:spPr>
+                      </pic:pic>
+                    </a:graphicData>
+                  </a:graphic>
+                </wp:inline>
+              </w:drawing>
+            </w:r>
+            <w:r>
+              <w:t xml:space="preserve"> </w:t>
+            </w:r>
+            <w:r>
+              <w:rPr>
+                <w:rFonts w:ascii="Aptos" w:hAnsi="Aptos"/>
+                <w:b/>
+                <w:color w:val="202124"/>
+                <w:sz w:val="17"/>
+              </w:rPr>
+              <w:t>Infosys AI Primer</w:t>
+            </w:r>
+          </w:p>
+          <w:p>
+            <w:r>
+              <w:rPr>
+                <w:rFonts w:ascii="Aptos" w:hAnsi="Aptos"/>
+                <w:b w:val="0"/>
+                <w:color w:val="3C4043"/>
+                <w:sz w:val="16"/>
+              </w:rPr>
+              <w:t>AI workflow fundamentals used in compliance automation and backend project work.</w:t>
+            </w:r>
+          </w:p>
+        </w:tc>
+        <w:tc>
+          <w:tcPr>
+            <w:tcW w:type="dxa" w:w="5400"/>
+            <w:vAlign w:val="top"/>
+            <w:shd w:fill="FFFFFF"/>
+            <w:tcBorders>
+              <w:top w:val="single" w:sz="8" w:space="0" w:color="DCE6F2"/>
+              <w:left w:val="single" w:sz="8" w:space="0" w:color="DCE6F2"/>
+              <w:bottom w:val="single" w:sz="8" w:space="0" w:color="DCE6F2"/>
+              <w:right w:val="single" w:sz="8" w:space="0" w:color="DCE6F2"/>
+            </w:tcBorders>
+          </w:tcPr>
+          <w:p>
+            <w:pPr>
+              <w:spacing w:after="40"/>
+            </w:pPr>
+          </w:p>
+        </w:tc>
+      </w:tr>
+    </w:tbl>
     <w:p>
       <w:pPr>
-        <w:spacing w:before="0" w:after="7" w:line="240" w:lineRule="auto"/>
+        <w:spacing w:before="260" w:after="140"/>
       </w:pPr>
       <w:r>
         <w:rPr>
-          <w:rFonts w:ascii="Arial" w:hAnsi="Arial"/>
-          <w:b w:val="0"/>
-          <w:color w:val="202124"/>
-          <w:sz w:val="16"/>
-        </w:rPr>
-        <w:t>AWS: IAM, EC2, S3, VPC, Route 53, RDS, ECS, ECR, EKS, CloudWatch, CodePipeline, Security Groups, NAT Gateway, VPN</w:t>
-      </w:r>
-    </w:p>
-    <w:p>
-      <w:pPr>
-        <w:spacing w:before="0" w:after="7" w:line="240" w:lineRule="auto"/>
-      </w:pPr>
-      <w:r>
-        <w:rPr>
-          <w:rFonts w:ascii="Arial" w:hAnsi="Arial"/>
-          <w:b w:val="0"/>
-          <w:color w:val="202124"/>
-          <w:sz w:val="16"/>
-        </w:rPr>
-        <w:t>GCP: Compute Engine, Cloud Storage, Cloud IAM, VPC, Firewall Rules, Cloud DNS, GKE, Cloud Run, Cloud SQL, Load Balancing</w:t>
-      </w:r>
-    </w:p>
-    <w:p>
-      <w:pPr>
-        <w:spacing w:before="0" w:after="7" w:line="240" w:lineRule="auto"/>
-      </w:pPr>
-      <w:r>
-        <w:rPr>
-          <w:rFonts w:ascii="Arial" w:hAnsi="Arial"/>
-          <w:b w:val="0"/>
-          <w:color w:val="202124"/>
-          <w:sz w:val="16"/>
-        </w:rPr>
-        <w:t>DevOps and Tools: Docker, Kubernetes, Terraform, Git, GitHub Actions, Linux, Bash, Postman</w:t>
-      </w:r>
-    </w:p>
-    <w:p>
-      <w:pPr>
-        <w:spacing w:before="0" w:after="7" w:line="240" w:lineRule="auto"/>
-      </w:pPr>
-      <w:r>
-        <w:rPr>
-          <w:rFonts w:ascii="Arial" w:hAnsi="Arial"/>
-          <w:b w:val="0"/>
-          <w:color w:val="202124"/>
-          <w:sz w:val="16"/>
-        </w:rPr>
-        <w:t>Programming and Backend: Python, FastAPI, REST APIs, Java, SQL</w:t>
-      </w:r>
-    </w:p>
-    <w:p>
-      <w:pPr>
-        <w:spacing w:before="0" w:after="7" w:line="240" w:lineRule="auto"/>
-      </w:pPr>
-      <w:r>
-        <w:rPr>
-          <w:rFonts w:ascii="Arial" w:hAnsi="Arial"/>
-          <w:b w:val="0"/>
-          <w:color w:val="202124"/>
-          <w:sz w:val="16"/>
-        </w:rPr>
-        <w:t>Networking and Security: TCP/IP, DNS, VPN, HTTP/HTTPS, SSL/TLS, subnetting, routing, Nmap, Wireshark, IAM least privilege</w:t>
-      </w:r>
-    </w:p>
-    <w:p>
-      <w:pPr>
-        <w:spacing w:before="50" w:after="16" w:line="240" w:lineRule="auto"/>
-        <w:pBdr>
-          <w:bottom w:val="single" w:sz="4" w:space="1" w:color="DADCE0"/>
-        </w:pBdr>
-      </w:pPr>
-      <w:r>
-        <w:rPr>
-          <w:rFonts w:ascii="Arial" w:hAnsi="Arial"/>
-          <w:b/>
-          <w:color w:val="1A73E8"/>
-          <w:sz w:val="18"/>
-        </w:rPr>
-        <w:t>PROFESSIONAL EXPERIENCE</w:t>
-      </w:r>
-    </w:p>
-    <w:p>
-      <w:pPr>
-        <w:spacing w:before="0" w:after="7" w:line="240" w:lineRule="auto"/>
-      </w:pPr>
-      <w:r>
-        <w:rPr>
-          <w:rFonts w:ascii="Arial" w:hAnsi="Arial"/>
+          <w:rFonts w:ascii="Aptos" w:hAnsi="Aptos"/>
           <w:b/>
           <w:color w:val="202124"/>
-          <w:sz w:val="16"/>
-        </w:rPr>
-        <w:t>Cloud Engineer Intern | Cloud Ambassadors, Google Cloud Partner | Jan 2026 - Present</w:t>
-      </w:r>
-    </w:p>
-    <w:p>
-      <w:pPr>
-        <w:pStyle w:val="ListBullet"/>
-        <w:spacing w:before="0" w:after="7" w:line="240" w:lineRule="auto"/>
-        <w:ind w:left="259" w:hanging="144"/>
-      </w:pPr>
-      <w:r>
-        <w:rPr>
-          <w:rFonts w:ascii="Arial" w:hAnsi="Arial"/>
-          <w:color w:val="202124"/>
-          <w:sz w:val="15"/>
-        </w:rPr>
-        <w:t>Provisioned Compute Engine, Cloud Storage, IAM roles, VPC networks, firewall rules, and secure access policies.</w:t>
-      </w:r>
-    </w:p>
-    <w:p>
-      <w:pPr>
-        <w:pStyle w:val="ListBullet"/>
-        <w:spacing w:before="0" w:after="7" w:line="240" w:lineRule="auto"/>
-        <w:ind w:left="259" w:hanging="144"/>
-      </w:pPr>
-      <w:r>
-        <w:rPr>
-          <w:rFonts w:ascii="Arial" w:hAnsi="Arial"/>
-          <w:color w:val="202124"/>
-          <w:sz w:val="15"/>
-        </w:rPr>
-        <w:t>Supported AWS and GCP infrastructure tasks across DNS, VPN, load balancing, migration workflows, and troubleshooting.</w:t>
-      </w:r>
-    </w:p>
-    <w:p>
-      <w:pPr>
-        <w:pStyle w:val="ListBullet"/>
-        <w:spacing w:before="0" w:after="7" w:line="240" w:lineRule="auto"/>
-        <w:ind w:left="259" w:hanging="144"/>
-      </w:pPr>
-      <w:r>
-        <w:rPr>
-          <w:rFonts w:ascii="Arial" w:hAnsi="Arial"/>
-          <w:color w:val="202124"/>
-          <w:sz w:val="15"/>
-        </w:rPr>
-        <w:t>Configured Cloud DNS and Route 53 records, HTTPS load balancer validation, and SSL/TLS certificate workflows.</w:t>
-      </w:r>
-    </w:p>
-    <w:p>
-      <w:pPr>
-        <w:pStyle w:val="ListBullet"/>
-        <w:spacing w:before="0" w:after="7" w:line="240" w:lineRule="auto"/>
-        <w:ind w:left="259" w:hanging="144"/>
-      </w:pPr>
-      <w:r>
-        <w:rPr>
-          <w:rFonts w:ascii="Arial" w:hAnsi="Arial"/>
-          <w:color w:val="202124"/>
-          <w:sz w:val="15"/>
-        </w:rPr>
-        <w:t>Practiced Docker, Kubernetes/GKE, Artifact Registry, Cloud Run, Linux, Git, Bash, and Terraform fundamentals.</w:t>
-      </w:r>
-    </w:p>
-    <w:p>
-      <w:pPr>
-        <w:spacing w:before="0" w:after="7" w:line="240" w:lineRule="auto"/>
-      </w:pPr>
-      <w:r>
-        <w:rPr>
-          <w:rFonts w:ascii="Arial" w:hAnsi="Arial"/>
-          <w:b/>
-          <w:color w:val="202124"/>
-          <w:sz w:val="16"/>
-        </w:rPr>
-        <w:t>Backend Developer | Chella Corporations | Jul 2025 - Dec 2025</w:t>
-      </w:r>
-    </w:p>
-    <w:p>
-      <w:pPr>
-        <w:pStyle w:val="ListBullet"/>
-        <w:spacing w:before="0" w:after="7" w:line="240" w:lineRule="auto"/>
-        <w:ind w:left="259" w:hanging="144"/>
-      </w:pPr>
-      <w:r>
-        <w:rPr>
-          <w:rFonts w:ascii="Arial" w:hAnsi="Arial"/>
-          <w:color w:val="202124"/>
-          <w:sz w:val="15"/>
-        </w:rPr>
-        <w:t>Developed REST APIs using Python and FastAPI for an AI-driven medical platform.</w:t>
-      </w:r>
-    </w:p>
-    <w:p>
-      <w:pPr>
-        <w:pStyle w:val="ListBullet"/>
-        <w:spacing w:before="0" w:after="7" w:line="240" w:lineRule="auto"/>
-        <w:ind w:left="259" w:hanging="144"/>
-      </w:pPr>
-      <w:r>
-        <w:rPr>
-          <w:rFonts w:ascii="Arial" w:hAnsi="Arial"/>
-          <w:color w:val="202124"/>
-          <w:sz w:val="15"/>
-        </w:rPr>
-        <w:t>Worked with secure authentication, service integration, database integration, debugging, and Linux deployment.</w:t>
-      </w:r>
-    </w:p>
-    <w:p>
-      <w:pPr>
-        <w:spacing w:before="0" w:after="7" w:line="240" w:lineRule="auto"/>
-      </w:pPr>
-      <w:r>
-        <w:rPr>
-          <w:rFonts w:ascii="Arial" w:hAnsi="Arial"/>
-          <w:b/>
-          <w:color w:val="202124"/>
-          <w:sz w:val="16"/>
-        </w:rPr>
-        <w:t>AI Application Developer Intern | Infosys Springboard | Sep 2025 - Nov 2025</w:t>
-      </w:r>
-    </w:p>
-    <w:p>
-      <w:pPr>
-        <w:pStyle w:val="ListBullet"/>
-        <w:spacing w:before="0" w:after="7" w:line="240" w:lineRule="auto"/>
-        <w:ind w:left="259" w:hanging="144"/>
-      </w:pPr>
-      <w:r>
-        <w:rPr>
-          <w:rFonts w:ascii="Arial" w:hAnsi="Arial"/>
-          <w:color w:val="202124"/>
-          <w:sz w:val="15"/>
-        </w:rPr>
-        <w:t>Built a RAG-based compliance checker system for document analysis, retrieval, scoring, and automated evaluation.</w:t>
-      </w:r>
-    </w:p>
-    <w:p>
-      <w:pPr>
-        <w:pStyle w:val="ListBullet"/>
-        <w:spacing w:before="0" w:after="7" w:line="240" w:lineRule="auto"/>
-        <w:ind w:left="259" w:hanging="144"/>
-      </w:pPr>
-      <w:r>
-        <w:rPr>
-          <w:rFonts w:ascii="Arial" w:hAnsi="Arial"/>
-          <w:color w:val="202124"/>
-          <w:sz w:val="15"/>
-        </w:rPr>
-        <w:t>Integrated GPT-based workflows to improve compliance review efficiency by 70%.</w:t>
-      </w:r>
-    </w:p>
-    <w:p>
-      <w:pPr>
-        <w:spacing w:before="50" w:after="16" w:line="240" w:lineRule="auto"/>
-        <w:pBdr>
-          <w:bottom w:val="single" w:sz="4" w:space="1" w:color="DADCE0"/>
-        </w:pBdr>
-      </w:pPr>
-      <w:r>
-        <w:rPr>
-          <w:rFonts w:ascii="Arial" w:hAnsi="Arial"/>
-          <w:b/>
-          <w:color w:val="1A73E8"/>
-          <w:sz w:val="18"/>
+          <w:sz w:val="21"/>
         </w:rPr>
         <w:t>EDUCATION</w:t>
       </w:r>
     </w:p>
-    <w:p>
-      <w:pPr>
-        <w:spacing w:before="0" w:after="7" w:line="240" w:lineRule="auto"/>
-      </w:pPr>
-      <w:r>
-        <w:rPr>
-          <w:rFonts w:ascii="Arial" w:hAnsi="Arial"/>
-          <w:b w:val="0"/>
-          <w:color w:val="202124"/>
-          <w:sz w:val="16"/>
-        </w:rPr>
-        <w:t>B.E. Cybersecurity Engineering | J.J. College of Engineering &amp; Technology, Trichy (Anna University) | 2022 - 2026 | CGPA: 9.0/10</w:t>
-      </w:r>
-    </w:p>
-    <w:p>
-      <w:pPr>
-        <w:spacing w:before="0" w:after="7" w:line="240" w:lineRule="auto"/>
-      </w:pPr>
-      <w:r>
-        <w:rPr>
-          <w:rFonts w:ascii="Arial" w:hAnsi="Arial"/>
-          <w:b w:val="0"/>
-          <w:color w:val="202124"/>
-          <w:sz w:val="16"/>
-        </w:rPr>
-        <w:t>Coursework: Computer Networks, Operating Systems, Cryptography, Distributed Systems, Data Structures</w:t>
-      </w:r>
-    </w:p>
-    <w:p>
-      <w:pPr>
-        <w:spacing w:before="50" w:after="16" w:line="240" w:lineRule="auto"/>
-        <w:pBdr>
-          <w:bottom w:val="single" w:sz="4" w:space="1" w:color="DADCE0"/>
-        </w:pBdr>
-      </w:pPr>
-      <w:r>
-        <w:rPr>
-          <w:rFonts w:ascii="Arial" w:hAnsi="Arial"/>
-          <w:b/>
-          <w:color w:val="1A73E8"/>
-          <w:sz w:val="18"/>
-        </w:rPr>
-        <w:t>PROJECT HIGHLIGHTS</w:t>
-      </w:r>
-    </w:p>
-    <w:p>
-      <w:pPr>
-        <w:spacing w:before="0" w:after="7" w:line="240" w:lineRule="auto"/>
-      </w:pPr>
-      <w:r>
-        <w:rPr>
-          <w:rFonts w:ascii="Arial" w:hAnsi="Arial"/>
-          <w:b/>
-          <w:color w:val="202124"/>
-          <w:sz w:val="16"/>
-        </w:rPr>
-        <w:t>AWS Route 53 to Google Cloud DNS Migration</w:t>
-      </w:r>
-    </w:p>
-    <w:p>
-      <w:pPr>
-        <w:pStyle w:val="ListBullet"/>
-        <w:spacing w:before="0" w:after="7" w:line="240" w:lineRule="auto"/>
-        <w:ind w:left="259" w:hanging="144"/>
-      </w:pPr>
-      <w:r>
-        <w:rPr>
-          <w:rFonts w:ascii="Arial" w:hAnsi="Arial"/>
-          <w:color w:val="202124"/>
-          <w:sz w:val="15"/>
-        </w:rPr>
-        <w:t>Created a no-downtime DNS migration plan with Cloud DNS zone setup, record replication, NS cutover, validation, and rollback.</w:t>
-      </w:r>
-    </w:p>
-    <w:p>
-      <w:pPr>
-        <w:spacing w:before="0" w:after="7" w:line="240" w:lineRule="auto"/>
-      </w:pPr>
-      <w:r>
-        <w:rPr>
-          <w:rFonts w:ascii="Arial" w:hAnsi="Arial"/>
-          <w:b/>
-          <w:color w:val="202124"/>
-          <w:sz w:val="16"/>
-        </w:rPr>
-        <w:t>Private AWS RDS PostgreSQL to GCP Cloud SQL Migration</w:t>
-      </w:r>
-    </w:p>
-    <w:p>
-      <w:pPr>
-        <w:pStyle w:val="ListBullet"/>
-        <w:spacing w:before="0" w:after="7" w:line="240" w:lineRule="auto"/>
-        <w:ind w:left="259" w:hanging="144"/>
-      </w:pPr>
-      <w:r>
-        <w:rPr>
-          <w:rFonts w:ascii="Arial" w:hAnsi="Arial"/>
-          <w:color w:val="202124"/>
-          <w:sz w:val="15"/>
-        </w:rPr>
-        <w:t>Designed private migration architecture using AWS VPC/VGW, GCP HA VPN, IPsec, BGP, Private Services Access, and DMS.</w:t>
-      </w:r>
-    </w:p>
-    <w:p>
-      <w:pPr>
-        <w:spacing w:before="0" w:after="7" w:line="240" w:lineRule="auto"/>
-      </w:pPr>
-      <w:r>
-        <w:rPr>
-          <w:rFonts w:ascii="Arial" w:hAnsi="Arial"/>
-          <w:b/>
-          <w:color w:val="202124"/>
-          <w:sz w:val="16"/>
-        </w:rPr>
-        <w:t>Forenscope - IoT Based Digital Evidence Collector</w:t>
-      </w:r>
-    </w:p>
-    <w:p>
-      <w:pPr>
-        <w:pStyle w:val="ListBullet"/>
-        <w:spacing w:before="0" w:after="7" w:line="240" w:lineRule="auto"/>
-        <w:ind w:left="259" w:hanging="144"/>
-      </w:pPr>
-      <w:r>
-        <w:rPr>
-          <w:rFonts w:ascii="Arial" w:hAnsi="Arial"/>
-          <w:color w:val="202124"/>
-          <w:sz w:val="15"/>
-        </w:rPr>
-        <w:t>Built a Raspberry Pi forensic acquisition concept using Python, SHA-256 hashing, and secure SQLite evidence storage.</w:t>
-      </w:r>
-    </w:p>
-    <w:p>
-      <w:pPr>
-        <w:spacing w:before="50" w:after="16" w:line="240" w:lineRule="auto"/>
-        <w:pBdr>
-          <w:bottom w:val="single" w:sz="4" w:space="1" w:color="DADCE0"/>
-        </w:pBdr>
-      </w:pPr>
-      <w:r>
-        <w:rPr>
-          <w:rFonts w:ascii="Arial" w:hAnsi="Arial"/>
-          <w:b/>
-          <w:color w:val="1A73E8"/>
-          <w:sz w:val="18"/>
-        </w:rPr>
-        <w:t>CERTIFICATIONS AND LEARNING</w:t>
-      </w:r>
-    </w:p>
-    <w:p>
-      <w:pPr>
-        <w:spacing w:before="0" w:after="7" w:line="240" w:lineRule="auto"/>
-      </w:pPr>
-      <w:r>
-        <w:rPr>
-          <w:rFonts w:ascii="Arial" w:hAnsi="Arial"/>
-          <w:b w:val="0"/>
-          <w:color w:val="202124"/>
-          <w:sz w:val="16"/>
-        </w:rPr>
-        <w:t>AWS Certified Cloud Practitioner (CLF-C02)</w:t>
-      </w:r>
-    </w:p>
-    <w:p>
-      <w:pPr>
-        <w:spacing w:before="0" w:after="7" w:line="240" w:lineRule="auto"/>
-      </w:pPr>
-      <w:r>
-        <w:rPr>
-          <w:rFonts w:ascii="Arial" w:hAnsi="Arial"/>
-          <w:b w:val="0"/>
-          <w:color w:val="202124"/>
-          <w:sz w:val="16"/>
-        </w:rPr>
-        <w:t>Google Associate Cloud Engineer</w:t>
-      </w:r>
-    </w:p>
-    <w:p>
-      <w:pPr>
-        <w:spacing w:before="0" w:after="7" w:line="240" w:lineRule="auto"/>
-      </w:pPr>
-      <w:r>
-        <w:rPr>
-          <w:rFonts w:ascii="Arial" w:hAnsi="Arial"/>
-          <w:b w:val="0"/>
-          <w:color w:val="202124"/>
-          <w:sz w:val="16"/>
-        </w:rPr>
-        <w:t>Google Cloud Digital Leader Learning Path - Completed</w:t>
-      </w:r>
-    </w:p>
-    <w:p>
-      <w:pPr>
-        <w:spacing w:before="0" w:after="7" w:line="240" w:lineRule="auto"/>
-      </w:pPr>
-      <w:r>
-        <w:rPr>
-          <w:rFonts w:ascii="Arial" w:hAnsi="Arial"/>
-          <w:b w:val="0"/>
-          <w:color w:val="202124"/>
-          <w:sz w:val="16"/>
-        </w:rPr>
-        <w:t>Google Professional Cloud Architect Learning Path - Completed</w:t>
-      </w:r>
-    </w:p>
-    <w:p>
-      <w:pPr>
-        <w:spacing w:before="0" w:after="7" w:line="240" w:lineRule="auto"/>
-      </w:pPr>
-      <w:r>
-        <w:rPr>
-          <w:rFonts w:ascii="Arial" w:hAnsi="Arial"/>
-          <w:b w:val="0"/>
-          <w:color w:val="202124"/>
-          <w:sz w:val="16"/>
-        </w:rPr>
-        <w:t>EC-Council Network Defense Essentials</w:t>
-      </w:r>
-    </w:p>
-    <w:p>
-      <w:pPr>
-        <w:spacing w:before="0" w:after="7" w:line="240" w:lineRule="auto"/>
-      </w:pPr>
-      <w:r>
-        <w:rPr>
-          <w:rFonts w:ascii="Arial" w:hAnsi="Arial"/>
-          <w:b w:val="0"/>
-          <w:color w:val="202124"/>
-          <w:sz w:val="16"/>
-        </w:rPr>
-        <w:t>Cisco Networking Basics</w:t>
-      </w:r>
-    </w:p>
-    <w:p>
-      <w:pPr>
-        <w:spacing w:before="0" w:after="7" w:line="240" w:lineRule="auto"/>
-      </w:pPr>
-      <w:r>
-        <w:rPr>
-          <w:rFonts w:ascii="Arial" w:hAnsi="Arial"/>
-          <w:b w:val="0"/>
-          <w:color w:val="202124"/>
-          <w:sz w:val="16"/>
-        </w:rPr>
-        <w:t>Infosys Artificial Intelligence Primer</w:t>
-      </w:r>
-    </w:p>
+    <w:tbl>
+      <w:tblPr>
+        <w:tblW w:type="auto" w:w="0"/>
+        <w:jc w:val="center"/>
+        <w:tblLayout w:type="autofit"/>
+        <w:tblLook w:firstColumn="1" w:firstRow="1" w:lastColumn="0" w:lastRow="0" w:noHBand="0" w:noVBand="1" w:val="04A0"/>
+      </w:tblPr>
+      <w:tblGrid>
+        <w:gridCol w:w="10800"/>
+      </w:tblGrid>
+      <w:tr>
+        <w:tc>
+          <w:tcPr>
+            <w:tcW w:type="dxa" w:w="10800"/>
+            <w:vAlign w:val="top"/>
+            <w:shd w:fill="FFFFFF"/>
+            <w:tcBorders>
+              <w:top w:val="single" w:sz="8" w:space="0" w:color="DCE6F2"/>
+              <w:left w:val="single" w:sz="8" w:space="0" w:color="DCE6F2"/>
+              <w:bottom w:val="single" w:sz="8" w:space="0" w:color="DCE6F2"/>
+              <w:right w:val="single" w:sz="8" w:space="0" w:color="DCE6F2"/>
+            </w:tcBorders>
+          </w:tcPr>
+          <w:p>
+            <w:pPr>
+              <w:spacing w:after="40"/>
+            </w:pPr>
+            <w:r>
+              <w:rPr>
+                <w:rFonts w:ascii="Aptos" w:hAnsi="Aptos"/>
+                <w:b/>
+                <w:color w:val="202124"/>
+                <w:sz w:val="20"/>
+              </w:rPr>
+              <w:t>B.E. Cybersecurity Engineering</w:t>
+            </w:r>
+          </w:p>
+          <w:p>
+            <w:r>
+              <w:rPr>
+                <w:rFonts w:ascii="Aptos" w:hAnsi="Aptos"/>
+                <w:b w:val="0"/>
+                <w:color w:val="5F6368"/>
+                <w:sz w:val="17"/>
+              </w:rPr>
+              <w:t>J.J. College of Engineering and Technology | Anna University | 2022 - 2026 | CGPA: 9.0/10</w:t>
+            </w:r>
+          </w:p>
+          <w:p>
+            <w:r>
+              <w:rPr>
+                <w:rFonts w:ascii="Aptos" w:hAnsi="Aptos"/>
+                <w:b w:val="0"/>
+                <w:color w:val="3C4043"/>
+                <w:sz w:val="17"/>
+              </w:rPr>
+              <w:t>Coursework and practice aligned to computer networks, operating systems, cryptography, distributed systems, cloud infrastructure, and security.</w:t>
+            </w:r>
+          </w:p>
+        </w:tc>
+      </w:tr>
+    </w:tbl>
     <w:sectPr>
       <w:pgSz w:w="12240" w:h="15840"/>
-      <w:pgMar w:top="547" w:right="662" w:bottom="490" w:left="662" w:header="720" w:footer="720" w:gutter="0"/>
+      <w:pgMar w:top="648" w:right="720" w:bottom="648" w:left="720" w:header="720" w:footer="720" w:gutter="0"/>
       <w:cols w:space="720"/>
       <w:docGrid w:linePitch="360"/>
     </w:sectPr>
@@ -1010,10 +3327,6 @@
     <w:name w:val="Normal"/>
     <w:qFormat/>
     <w:rsid w:val="00FC693F"/>
-    <w:rPr>
-      <w:rFonts w:ascii="Arial" w:hAnsi="Arial"/>
-      <w:sz w:val="16"/>
-    </w:rPr>
   </w:style>
   <w:style w:type="paragraph" w:styleId="Header">
     <w:name w:val="header"/>
@@ -1543,10 +3856,6 @@
       </w:numPr>
       <w:contextualSpacing/>
     </w:pPr>
-    <w:rPr>
-      <w:rFonts w:ascii="Arial" w:hAnsi="Arial"/>
-      <w:sz w:val="15"/>
-    </w:rPr>
   </w:style>
   <w:style w:type="paragraph" w:styleId="ListBullet2">
     <w:name w:val="List Bullet 2"/>

</xml_diff>

<commit_message>
Add certification proof assets
</commit_message>
<xml_diff>
--- a/assets/resume/Hariharan_J_Resume.docx
+++ b/assets/resume/Hariharan_J_Resume.docx
@@ -10,8 +10,8 @@
         <w:tblLook w:firstColumn="1" w:firstRow="1" w:lastColumn="0" w:lastRow="0" w:noHBand="0" w:noVBand="1" w:val="04A0"/>
       </w:tblPr>
       <w:tblGrid>
-        <w:gridCol w:w="6768"/>
-        <w:gridCol w:w="3456"/>
+        <w:gridCol w:w="5400"/>
+        <w:gridCol w:w="5400"/>
       </w:tblGrid>
       <w:tr>
         <w:tc>
@@ -29,7 +29,6 @@
           <w:p>
             <w:pPr>
               <w:spacing w:after="40"/>
-              <w:jc w:val="left"/>
             </w:pPr>
             <w:r>
               <w:rPr>
@@ -153,7 +152,7 @@
                     <a:graphicData uri="http://schemas.openxmlformats.org/drawingml/2006/picture">
                       <pic:pic>
                         <pic:nvPicPr>
-                          <pic:cNvPr id="0" name="googlecloud.png"/>
+                          <pic:cNvPr id="0" name="google-associate-cloud-engineer-badge.png"/>
                           <pic:cNvPicPr/>
                         </pic:nvPicPr>
                         <pic:blipFill>
@@ -401,7 +400,7 @@
                           <pic:cNvPicPr/>
                         </pic:nvPicPr>
                         <pic:blipFill>
-                          <a:blip r:embed="rId10"/>
+                          <a:blip r:embed="rId13"/>
                           <a:stretch>
                             <a:fillRect/>
                           </a:stretch>
@@ -529,7 +528,7 @@
                           <pic:cNvPicPr/>
                         </pic:nvPicPr>
                         <pic:blipFill>
-                          <a:blip r:embed="rId13"/>
+                          <a:blip r:embed="rId14"/>
                           <a:stretch>
                             <a:fillRect/>
                           </a:stretch>
@@ -593,7 +592,7 @@
                           <pic:cNvPicPr/>
                         </pic:nvPicPr>
                         <pic:blipFill>
-                          <a:blip r:embed="rId14"/>
+                          <a:blip r:embed="rId15"/>
                           <a:stretch>
                             <a:fillRect/>
                           </a:stretch>
@@ -787,7 +786,7 @@
                           <pic:cNvPicPr/>
                         </pic:nvPicPr>
                         <pic:blipFill>
-                          <a:blip r:embed="rId15"/>
+                          <a:blip r:embed="rId16"/>
                           <a:stretch>
                             <a:fillRect/>
                           </a:stretch>
@@ -851,7 +850,7 @@
                           <pic:cNvPicPr/>
                         </pic:nvPicPr>
                         <pic:blipFill>
-                          <a:blip r:embed="rId16"/>
+                          <a:blip r:embed="rId17"/>
                           <a:stretch>
                             <a:fillRect/>
                           </a:stretch>
@@ -917,7 +916,7 @@
                           <pic:cNvPicPr/>
                         </pic:nvPicPr>
                         <pic:blipFill>
-                          <a:blip r:embed="rId17"/>
+                          <a:blip r:embed="rId18"/>
                           <a:stretch>
                             <a:fillRect/>
                           </a:stretch>
@@ -981,7 +980,7 @@
                           <pic:cNvPicPr/>
                         </pic:nvPicPr>
                         <pic:blipFill>
-                          <a:blip r:embed="rId18"/>
+                          <a:blip r:embed="rId19"/>
                           <a:stretch>
                             <a:fillRect/>
                           </a:stretch>
@@ -1045,7 +1044,7 @@
                           <pic:cNvPicPr/>
                         </pic:nvPicPr>
                         <pic:blipFill>
-                          <a:blip r:embed="rId19"/>
+                          <a:blip r:embed="rId20"/>
                           <a:stretch>
                             <a:fillRect/>
                           </a:stretch>
@@ -1109,7 +1108,7 @@
                           <pic:cNvPicPr/>
                         </pic:nvPicPr>
                         <pic:blipFill>
-                          <a:blip r:embed="rId20"/>
+                          <a:blip r:embed="rId21"/>
                           <a:stretch>
                             <a:fillRect/>
                           </a:stretch>
@@ -1200,7 +1199,7 @@
                           <pic:cNvPicPr/>
                         </pic:nvPicPr>
                         <pic:blipFill>
-                          <a:blip r:embed="rId10"/>
+                          <a:blip r:embed="rId13"/>
                           <a:stretch>
                             <a:fillRect/>
                           </a:stretch>
@@ -1361,7 +1360,7 @@
                           <pic:cNvPicPr/>
                         </pic:nvPicPr>
                         <pic:blipFill>
-                          <a:blip r:embed="rId16"/>
+                          <a:blip r:embed="rId17"/>
                           <a:stretch>
                             <a:fillRect/>
                           </a:stretch>
@@ -1506,7 +1505,7 @@
                           <pic:cNvPicPr/>
                         </pic:nvPicPr>
                         <pic:blipFill>
-                          <a:blip r:embed="rId21"/>
+                          <a:blip r:embed="rId22"/>
                           <a:stretch>
                             <a:fillRect/>
                           </a:stretch>
@@ -1693,7 +1692,7 @@
                 <w:color w:val="3C4043"/>
                 <w:sz w:val="17"/>
               </w:rPr>
-              <w:t>Documented zero-downtime domain migration for haridns.qzz.io with DNS inventory, Cloud DNS zone creation, record replication, NS cutover, validation, and rollback.</w:t>
+              <w:t>Zero-downtime domain migration with DNS inventory, Cloud DNS zone setup, record replication, NS cutover, validation, and rollback.</w:t>
             </w:r>
           </w:p>
         </w:tc>
@@ -1742,7 +1741,7 @@
                           <pic:cNvPicPr/>
                         </pic:nvPicPr>
                         <pic:blipFill>
-                          <a:blip r:embed="rId18"/>
+                          <a:blip r:embed="rId19"/>
                           <a:stretch>
                             <a:fillRect/>
                           </a:stretch>
@@ -1781,7 +1780,7 @@
                 <w:color w:val="3C4043"/>
                 <w:sz w:val="17"/>
               </w:rPr>
-              <w:t>Designed private PostgreSQL migration using AWS VPC/VGW, GCP HA VPN, IPsec, BGP, Private Services Access, and Database Migration Service.</w:t>
+              <w:t>Private PostgreSQL migration using AWS VPC/VGW, GCP HA VPN, IPsec, BGP, Private Services Access, and DMS.</w:t>
             </w:r>
           </w:p>
         </w:tc>
@@ -1830,7 +1829,7 @@
                           <pic:cNvPicPr/>
                         </pic:nvPicPr>
                         <pic:blipFill>
-                          <a:blip r:embed="rId10"/>
+                          <a:blip r:embed="rId13"/>
                           <a:stretch>
                             <a:fillRect/>
                           </a:stretch>
@@ -1869,7 +1868,7 @@
                 <w:color w:val="3C4043"/>
                 <w:sz w:val="17"/>
               </w:rPr>
-              <w:t>Built a GCP pattern for private Cloud Storage access through a global external application load balancer with backend bucket validation.</w:t>
+              <w:t>GCP private Cloud Storage access pattern using global external application load balancer and backend bucket validation.</w:t>
             </w:r>
           </w:p>
         </w:tc>
@@ -1918,7 +1917,7 @@
                           <pic:cNvPicPr/>
                         </pic:nvPicPr>
                         <pic:blipFill>
-                          <a:blip r:embed="rId10"/>
+                          <a:blip r:embed="rId13"/>
                           <a:stretch>
                             <a:fillRect/>
                           </a:stretch>
@@ -1957,7 +1956,7 @@
                 <w:color w:val="3C4043"/>
                 <w:sz w:val="17"/>
               </w:rPr>
-              <w:t>Prepared VPN documentation covering AWS and GCP networking, secure tunnel configuration, routing, validation, and hybrid cloud connectivity.</w:t>
+              <w:t>Hybrid cloud VPN documentation covering secure tunnel configuration, routing, validation, and connectivity checks.</w:t>
             </w:r>
           </w:p>
         </w:tc>
@@ -2045,7 +2044,7 @@
                 <w:color w:val="3C4043"/>
                 <w:sz w:val="17"/>
               </w:rPr>
-              <w:t>Created an IoT-driven evidence collection concept aligned to cybersecurity investigation, integrity, and secure evidence handling workflows.</w:t>
+              <w:t>IoT-driven evidence collection concept aligned to cybersecurity investigation, integrity, and secure handling workflows.</w:t>
             </w:r>
           </w:p>
         </w:tc>
@@ -2398,7 +2397,7 @@
                 <w:color w:val="3C4043"/>
                 <w:sz w:val="16"/>
               </w:rPr>
-              <w:t>Cloud concepts, AWS core services, security, pricing, and support fundamentals.</w:t>
+              <w:t>AWS core services, security, pricing, and support fundamentals.</w:t>
             </w:r>
           </w:p>
         </w:tc>
@@ -2430,7 +2429,7 @@
                     <a:graphicData uri="http://schemas.openxmlformats.org/drawingml/2006/picture">
                       <pic:pic>
                         <pic:nvPicPr>
-                          <pic:cNvPr id="0" name="googlecloud.png"/>
+                          <pic:cNvPr id="0" name="google-associate-cloud-engineer-badge.png"/>
                           <pic:cNvPicPr/>
                         </pic:nvPicPr>
                         <pic:blipFill>
@@ -2473,7 +2472,7 @@
                 <w:color w:val="3C4043"/>
                 <w:sz w:val="16"/>
               </w:rPr>
-              <w:t>Google Cloud deployment, operations, IAM, networking, and managed services foundation.</w:t>
+              <w:t>Google Cloud deployment, IAM, networking, and operations foundation.</w:t>
             </w:r>
           </w:p>
         </w:tc>
@@ -2507,11 +2506,86 @@
                     <a:graphicData uri="http://schemas.openxmlformats.org/drawingml/2006/picture">
                       <pic:pic>
                         <pic:nvPicPr>
+                          <pic:cNvPr id="0" name="aws.png"/>
+                          <pic:cNvPicPr/>
+                        </pic:nvPicPr>
+                        <pic:blipFill>
+                          <a:blip r:embed="rId9"/>
+                          <a:stretch>
+                            <a:fillRect/>
+                          </a:stretch>
+                        </pic:blipFill>
+                        <pic:spPr>
+                          <a:xfrm>
+                            <a:off x="0" y="0"/>
+                            <a:ext cx="182880" cy="182880"/>
+                          </a:xfrm>
+                          <a:prstGeom prst="rect"/>
+                        </pic:spPr>
+                      </pic:pic>
+                    </a:graphicData>
+                  </a:graphic>
+                </wp:inline>
+              </w:drawing>
+            </w:r>
+            <w:r>
+              <w:t xml:space="preserve"> </w:t>
+            </w:r>
+            <w:r>
+              <w:rPr>
+                <w:rFonts w:ascii="Aptos" w:hAnsi="Aptos"/>
+                <w:b/>
+                <w:color w:val="202124"/>
+                <w:sz w:val="17"/>
+              </w:rPr>
+              <w:t>AWS re/Start Cloud Practitioner - TN Skill Corporation</w:t>
+            </w:r>
+          </w:p>
+          <w:p>
+            <w:r>
+              <w:rPr>
+                <w:rFonts w:ascii="Aptos" w:hAnsi="Aptos"/>
+                <w:b w:val="0"/>
+                <w:color w:val="3C4043"/>
+                <w:sz w:val="16"/>
+              </w:rPr>
+              <w:t>Skill Competency certificate issued 22-05-2026; certificate no. TNSC-VN-ITS-AWS-0526-0005; scorecard 98.00%, Grade A+.</w:t>
+            </w:r>
+          </w:p>
+        </w:tc>
+        <w:tc>
+          <w:tcPr>
+            <w:tcW w:type="dxa" w:w="5400"/>
+            <w:vAlign w:val="top"/>
+            <w:shd w:fill="FFFFFF"/>
+            <w:tcBorders>
+              <w:top w:val="single" w:sz="8" w:space="0" w:color="DCE6F2"/>
+              <w:left w:val="single" w:sz="8" w:space="0" w:color="DCE6F2"/>
+              <w:bottom w:val="single" w:sz="8" w:space="0" w:color="DCE6F2"/>
+              <w:right w:val="single" w:sz="8" w:space="0" w:color="DCE6F2"/>
+            </w:tcBorders>
+          </w:tcPr>
+          <w:p>
+            <w:pPr>
+              <w:spacing w:after="40"/>
+            </w:pPr>
+            <w:r>
+              <w:drawing>
+                <wp:inline xmlns:a="http://schemas.openxmlformats.org/drawingml/2006/main" xmlns:pic="http://schemas.openxmlformats.org/drawingml/2006/picture">
+                  <wp:extent cx="182880" cy="182880"/>
+                  <wp:docPr id="28" name="Picture 28"/>
+                  <wp:cNvGraphicFramePr>
+                    <a:graphicFrameLocks noChangeAspect="1"/>
+                  </wp:cNvGraphicFramePr>
+                  <a:graphic>
+                    <a:graphicData uri="http://schemas.openxmlformats.org/drawingml/2006/picture">
+                      <pic:pic>
+                        <pic:nvPicPr>
                           <pic:cNvPr id="0" name="googlecloud.png"/>
                           <pic:cNvPicPr/>
                         </pic:nvPicPr>
                         <pic:blipFill>
-                          <a:blip r:embed="rId10"/>
+                          <a:blip r:embed="rId13"/>
                           <a:stretch>
                             <a:fillRect/>
                           </a:stretch>
@@ -2550,10 +2624,12 @@
                 <w:color w:val="3C4043"/>
                 <w:sz w:val="16"/>
               </w:rPr>
-              <w:t>Cloud transformation, Google Cloud products, data, AI, security, and business value.</w:t>
+              <w:t>Cloud transformation, Google Cloud products, data, AI, security, and value.</w:t>
             </w:r>
           </w:p>
         </w:tc>
+      </w:tr>
+      <w:tr>
         <w:tc>
           <w:tcPr>
             <w:tcW w:type="dxa" w:w="5400"/>
@@ -2574,7 +2650,7 @@
               <w:drawing>
                 <wp:inline xmlns:a="http://schemas.openxmlformats.org/drawingml/2006/main" xmlns:pic="http://schemas.openxmlformats.org/drawingml/2006/picture">
                   <wp:extent cx="182880" cy="182880"/>
-                  <wp:docPr id="28" name="Picture 28"/>
+                  <wp:docPr id="29" name="Picture 29"/>
                   <wp:cNvGraphicFramePr>
                     <a:graphicFrameLocks noChangeAspect="1"/>
                   </wp:cNvGraphicFramePr>
@@ -2586,7 +2662,7 @@
                           <pic:cNvPicPr/>
                         </pic:nvPicPr>
                         <pic:blipFill>
-                          <a:blip r:embed="rId10"/>
+                          <a:blip r:embed="rId13"/>
                           <a:stretch>
                             <a:fillRect/>
                           </a:stretch>
@@ -2625,12 +2701,10 @@
                 <w:color w:val="3C4043"/>
                 <w:sz w:val="16"/>
               </w:rPr>
-              <w:t>Cloud architecture, infrastructure design, security, reliability, operations, and migration planning.</w:t>
+              <w:t>Architecture, infrastructure design, security, reliability, operations, and migration planning.</w:t>
             </w:r>
           </w:p>
         </w:tc>
-      </w:tr>
-      <w:tr>
         <w:tc>
           <w:tcPr>
             <w:tcW w:type="dxa" w:w="5400"/>
@@ -2651,7 +2725,7 @@
               <w:drawing>
                 <wp:inline xmlns:a="http://schemas.openxmlformats.org/drawingml/2006/main" xmlns:pic="http://schemas.openxmlformats.org/drawingml/2006/picture">
                   <wp:extent cx="182880" cy="182880"/>
-                  <wp:docPr id="29" name="Picture 29"/>
+                  <wp:docPr id="30" name="Picture 30"/>
                   <wp:cNvGraphicFramePr>
                     <a:graphicFrameLocks noChangeAspect="1"/>
                   </wp:cNvGraphicFramePr>
@@ -2706,6 +2780,8 @@
             </w:r>
           </w:p>
         </w:tc>
+      </w:tr>
+      <w:tr>
         <w:tc>
           <w:tcPr>
             <w:tcW w:type="dxa" w:w="5400"/>
@@ -2726,7 +2802,7 @@
               <w:drawing>
                 <wp:inline xmlns:a="http://schemas.openxmlformats.org/drawingml/2006/main" xmlns:pic="http://schemas.openxmlformats.org/drawingml/2006/picture">
                   <wp:extent cx="182880" cy="182880"/>
-                  <wp:docPr id="30" name="Picture 30"/>
+                  <wp:docPr id="31" name="Picture 31"/>
                   <wp:cNvGraphicFramePr>
                     <a:graphicFrameLocks noChangeAspect="1"/>
                   </wp:cNvGraphicFramePr>
@@ -2738,7 +2814,7 @@
                           <pic:cNvPicPr/>
                         </pic:nvPicPr>
                         <pic:blipFill>
-                          <a:blip r:embed="rId22"/>
+                          <a:blip r:embed="rId23"/>
                           <a:stretch>
                             <a:fillRect/>
                           </a:stretch>
@@ -2781,8 +2857,6 @@
             </w:r>
           </w:p>
         </w:tc>
-      </w:tr>
-      <w:tr>
         <w:tc>
           <w:tcPr>
             <w:tcW w:type="dxa" w:w="5400"/>
@@ -2803,7 +2877,7 @@
               <w:drawing>
                 <wp:inline xmlns:a="http://schemas.openxmlformats.org/drawingml/2006/main" xmlns:pic="http://schemas.openxmlformats.org/drawingml/2006/picture">
                   <wp:extent cx="182880" cy="182880"/>
-                  <wp:docPr id="31" name="Picture 31"/>
+                  <wp:docPr id="32" name="Picture 32"/>
                   <wp:cNvGraphicFramePr>
                     <a:graphicFrameLocks noChangeAspect="1"/>
                   </wp:cNvGraphicFramePr>
@@ -2815,7 +2889,7 @@
                           <pic:cNvPicPr/>
                         </pic:nvPicPr>
                         <pic:blipFill>
-                          <a:blip r:embed="rId21"/>
+                          <a:blip r:embed="rId22"/>
                           <a:stretch>
                             <a:fillRect/>
                           </a:stretch>
@@ -2856,24 +2930,6 @@
               </w:rPr>
               <w:t>AI workflow fundamentals used in compliance automation and backend project work.</w:t>
             </w:r>
-          </w:p>
-        </w:tc>
-        <w:tc>
-          <w:tcPr>
-            <w:tcW w:type="dxa" w:w="5400"/>
-            <w:vAlign w:val="top"/>
-            <w:shd w:fill="FFFFFF"/>
-            <w:tcBorders>
-              <w:top w:val="single" w:sz="8" w:space="0" w:color="DCE6F2"/>
-              <w:left w:val="single" w:sz="8" w:space="0" w:color="DCE6F2"/>
-              <w:bottom w:val="single" w:sz="8" w:space="0" w:color="DCE6F2"/>
-              <w:right w:val="single" w:sz="8" w:space="0" w:color="DCE6F2"/>
-            </w:tcBorders>
-          </w:tcPr>
-          <w:p>
-            <w:pPr>
-              <w:spacing w:after="40"/>
-            </w:pPr>
           </w:p>
         </w:tc>
       </w:tr>
@@ -2948,7 +3004,7 @@
                 <w:color w:val="3C4043"/>
                 <w:sz w:val="17"/>
               </w:rPr>
-              <w:t>Coursework and practice aligned to computer networks, operating systems, cryptography, distributed systems, cloud infrastructure, and security.</w:t>
+              <w:t>Coursework aligned to computer networks, operating systems, cryptography, distributed systems, cloud infrastructure, and security.</w:t>
             </w:r>
           </w:p>
         </w:tc>

</xml_diff>